<commit_message>
Partie 1 – Anatomie d'un prompt
</commit_message>
<xml_diff>
--- a/ai-business_assistant/ficher_assistant.docx
+++ b/ai-business_assistant/ficher_assistant.docx
@@ -2,6 +2,273 @@
 <file path=word/document.xml><?xml version="1.0" encoding="utf-8"?>
 <w:document xmlns:wpc="http://schemas.microsoft.com/office/word/2010/wordprocessingCanvas" xmlns:cx="http://schemas.microsoft.com/office/drawing/2014/chartex" xmlns:cx1="http://schemas.microsoft.com/office/drawing/2015/9/8/chartex" xmlns:cx2="http://schemas.microsoft.com/office/drawing/2015/10/21/chartex" xmlns:cx3="http://schemas.microsoft.com/office/drawing/2016/5/9/chartex" xmlns:cx4="http://schemas.microsoft.com/office/drawing/2016/5/10/chartex" xmlns:cx5="http://schemas.microsoft.com/office/drawing/2016/5/11/chartex" xmlns:cx6="http://schemas.microsoft.com/office/drawing/2016/5/12/chartex" xmlns:cx7="http://schemas.microsoft.com/office/drawing/2016/5/13/chartex" xmlns:cx8="http://schemas.microsoft.com/office/drawing/2016/5/14/chartex" xmlns:mc="http://schemas.openxmlformats.org/markup-compatibility/2006" xmlns:aink="http://schemas.microsoft.com/office/drawing/2016/ink" xmlns:am3d="http://schemas.microsoft.com/office/drawing/2017/model3d" xmlns:o="urn:schemas-microsoft-com:office:office" xmlns:oel="http://schemas.microsoft.com/office/2019/extlst" xmlns:r="http://schemas.openxmlformats.org/officeDocument/2006/relationships" xmlns:m="http://schemas.openxmlformats.org/officeDocument/2006/math" xmlns:v="urn:schemas-microsoft-com:vml" xmlns:wp14="http://schemas.microsoft.com/office/word/2010/wordprocessingDrawing" xmlns:wp="http://schemas.openxmlformats.org/drawingml/2006/wordprocessingDrawing" xmlns:w10="urn:schemas-microsoft-com:office:word" xmlns:w="http://schemas.openxmlformats.org/wordprocessingml/2006/main" xmlns:w14="http://schemas.microsoft.com/office/word/2010/wordml" xmlns:w15="http://schemas.microsoft.com/office/word/2012/wordml" xmlns:w16cex="http://schemas.microsoft.com/office/word/2018/wordml/cex" xmlns:w16cid="http://schemas.microsoft.com/office/word/2016/wordml/cid" xmlns:w16="http://schemas.microsoft.com/office/word/2018/wordml" xmlns:w16du="http://schemas.microsoft.com/office/word/2023/wordml/word16du" xmlns:w16sdtdh="http://schemas.microsoft.com/office/word/2020/wordml/sdtdatahash" xmlns:w16sdtfl="http://schemas.microsoft.com/office/word/2024/wordml/sdtformatlock" xmlns:w16se="http://schemas.microsoft.com/office/word/2015/wordml/symex" xmlns:wpg="http://schemas.microsoft.com/office/word/2010/wordprocessingGroup" xmlns:wpi="http://schemas.microsoft.com/office/word/2010/wordprocessingInk" xmlns:wne="http://schemas.microsoft.com/office/word/2006/wordml" xmlns:wps="http://schemas.microsoft.com/office/word/2010/wordprocessingShape" mc:Ignorable="w14 w15 w16se w16cid w16 w16cex w16sdtdh w16sdtfl w16du wp14">
   <w:body>
+    <w:p>
+      <w:pPr>
+        <w:rPr>
+          <w:b/>
+          <w:bCs/>
+          <w:sz w:val="52"/>
+          <w:szCs w:val="52"/>
+          <w:lang w:val="fr-SN"/>
+        </w:rPr>
+      </w:pPr>
+      <w:r>
+        <w:rPr>
+          <w:b/>
+          <w:bCs/>
+          <w:sz w:val="52"/>
+          <w:szCs w:val="52"/>
+          <w:lang w:val="fr-SN"/>
+        </w:rPr>
+        <w:t xml:space="preserve">Atelier Prompt Engineering </w:t>
+      </w:r>
+    </w:p>
+    <w:p>
+      <w:pPr>
+        <w:rPr>
+          <w:color w:val="4472C4" w:themeColor="accent1"/>
+          <w:sz w:val="36"/>
+          <w:szCs w:val="36"/>
+          <w:lang w:val="fr-SN"/>
+        </w:rPr>
+      </w:pPr>
+      <w:r>
+        <w:rPr>
+          <w:color w:val="4472C4" w:themeColor="accent1"/>
+          <w:sz w:val="36"/>
+          <w:szCs w:val="36"/>
+          <w:u w:val="single"/>
+          <w:lang w:val="fr-SN"/>
+        </w:rPr>
+        <w:t>Partie 1</w:t>
+      </w:r>
+      <w:r>
+        <w:rPr>
+          <w:color w:val="4472C4" w:themeColor="accent1"/>
+          <w:sz w:val="36"/>
+          <w:szCs w:val="36"/>
+          <w:lang w:val="fr-SN"/>
+        </w:rPr>
+        <w:t xml:space="preserve"> – Anatomie d'un prompt</w:t>
+      </w:r>
+    </w:p>
+    <w:p>
+      <w:pPr>
+        <w:rPr>
+          <w:color w:val="4472C4" w:themeColor="accent1"/>
+          <w:sz w:val="36"/>
+          <w:szCs w:val="36"/>
+          <w:lang w:val="fr-SN"/>
+        </w:rPr>
+      </w:pPr>
+      <w:r>
+        <w:rPr>
+          <w:color w:val="000000" w:themeColor="text1"/>
+          <w:sz w:val="28"/>
+          <w:szCs w:val="28"/>
+          <w:lang w:val="fr-SN"/>
+        </w:rPr>
+        <w:t>Construction d’un prompt, à partir de ses différentes composantes, pour résoudre un problème comme « Je souhaite analyser les retours de clients d'une entreprise. »</w:t>
+      </w:r>
+      <w:r>
+        <w:rPr>
+          <w:color w:val="000000" w:themeColor="text1"/>
+          <w:sz w:val="36"/>
+          <w:szCs w:val="36"/>
+          <w:lang w:val="fr-SN"/>
+        </w:rPr>
+        <w:t xml:space="preserve"> </w:t>
+      </w:r>
+    </w:p>
+    <w:p>
+      <w:pPr>
+        <w:rPr>
+          <w:color w:val="000000" w:themeColor="text1"/>
+          <w:sz w:val="28"/>
+          <w:szCs w:val="28"/>
+          <w:lang w:val="fr-SN"/>
+        </w:rPr>
+      </w:pPr>
+      <w:r>
+        <w:rPr>
+          <w:color w:val="4472C4" w:themeColor="accent1"/>
+          <w:sz w:val="28"/>
+          <w:szCs w:val="28"/>
+          <w:lang w:val="fr-SN"/>
+        </w:rPr>
+        <w:t xml:space="preserve">Prompt : </w:t>
+      </w:r>
+      <w:r>
+        <w:rPr>
+          <w:color w:val="000000" w:themeColor="text1"/>
+          <w:sz w:val="28"/>
+          <w:szCs w:val="28"/>
+          <w:lang w:val="fr-SN"/>
+        </w:rPr>
+        <w:t>```</w:t>
+      </w:r>
+      <w:r>
+        <w:rPr>
+          <w:color w:val="000000" w:themeColor="text1"/>
+          <w:sz w:val="28"/>
+          <w:szCs w:val="28"/>
+          <w:lang w:val="fr-SN"/>
+        </w:rPr>
+        <w:t>Tu es un expert en relation client, spécialisé dans l'analyse de sentiment et la satisfaction client.</w:t>
+      </w:r>
+      <w:r>
+        <w:rPr>
+          <w:color w:val="000000" w:themeColor="text1"/>
+          <w:sz w:val="28"/>
+          <w:szCs w:val="28"/>
+          <w:lang w:val="fr-SN"/>
+        </w:rPr>
+        <w:t xml:space="preserve"> </w:t>
+      </w:r>
+      <w:r>
+        <w:rPr>
+          <w:color w:val="000000" w:themeColor="text1"/>
+          <w:sz w:val="28"/>
+          <w:szCs w:val="28"/>
+          <w:lang w:val="fr-SN"/>
+        </w:rPr>
+        <w:t>Dans le cadre d'une enquête de satisfaction,</w:t>
+      </w:r>
+      <w:r>
+        <w:rPr>
+          <w:color w:val="000000" w:themeColor="text1"/>
+          <w:sz w:val="28"/>
+          <w:szCs w:val="28"/>
+          <w:lang w:val="fr-SN"/>
+        </w:rPr>
+        <w:t xml:space="preserve"> </w:t>
+      </w:r>
+      <w:r>
+        <w:rPr>
+          <w:color w:val="000000" w:themeColor="text1"/>
+          <w:sz w:val="28"/>
+          <w:szCs w:val="28"/>
+          <w:lang w:val="fr-SN"/>
+        </w:rPr>
+        <w:t>génère en français un tableau de 3 colonnes (IDs / sentiment détecté / justification) avec 5 retours clients fictifs (positif, négatif ou neutre)</w:t>
+      </w:r>
+      <w:r>
+        <w:rPr>
+          <w:color w:val="000000" w:themeColor="text1"/>
+          <w:sz w:val="28"/>
+          <w:szCs w:val="28"/>
+          <w:lang w:val="fr-SN"/>
+        </w:rPr>
+        <w:t xml:space="preserve"> </w:t>
+      </w:r>
+      <w:r>
+        <w:rPr>
+          <w:color w:val="000000" w:themeColor="text1"/>
+          <w:sz w:val="28"/>
+          <w:szCs w:val="28"/>
+          <w:lang w:val="fr-SN"/>
+        </w:rPr>
+        <w:t>sur notre nouvelle marque de parfum.</w:t>
+      </w:r>
+      <w:r>
+        <w:rPr>
+          <w:color w:val="000000" w:themeColor="text1"/>
+          <w:sz w:val="28"/>
+          <w:szCs w:val="28"/>
+          <w:lang w:val="fr-SN"/>
+        </w:rPr>
+        <w:t xml:space="preserve"> ```</w:t>
+      </w:r>
+    </w:p>
+    <w:p>
+      <w:pPr>
+        <w:rPr>
+          <w:color w:val="000000" w:themeColor="text1"/>
+          <w:sz w:val="28"/>
+          <w:szCs w:val="28"/>
+          <w:lang w:val="fr-SN"/>
+        </w:rPr>
+      </w:pPr>
+      <w:r>
+        <w:rPr>
+          <w:color w:val="000000" w:themeColor="text1"/>
+          <w:sz w:val="28"/>
+          <w:szCs w:val="28"/>
+          <w:lang w:val="fr-SN"/>
+        </w:rPr>
+        <w:t>Reponse au LLM a ce prompt :</w:t>
+      </w:r>
+    </w:p>
+    <w:p>
+      <w:pPr>
+        <w:rPr>
+          <w:color w:val="000000" w:themeColor="text1"/>
+          <w:sz w:val="28"/>
+          <w:szCs w:val="28"/>
+          <w:lang w:val="fr-SN"/>
+        </w:rPr>
+      </w:pPr>
+      <w:r>
+        <w:rPr>
+          <w:noProof/>
+          <w:color w:val="000000" w:themeColor="text1"/>
+          <w:sz w:val="28"/>
+          <w:szCs w:val="28"/>
+          <w:lang w:val="fr-SN"/>
+        </w:rPr>
+        <w:drawing>
+          <wp:inline distT="0" distB="0" distL="0" distR="0" wp14:anchorId="3B1A22D9" wp14:editId="74B7A4AA">
+            <wp:extent cx="5760720" cy="3347085"/>
+            <wp:effectExtent l="0" t="0" r="0" b="5715"/>
+            <wp:docPr id="1830163161" name="Image 1"/>
+            <wp:cNvGraphicFramePr>
+              <a:graphicFrameLocks xmlns:a="http://schemas.openxmlformats.org/drawingml/2006/main" noChangeAspect="1"/>
+            </wp:cNvGraphicFramePr>
+            <a:graphic xmlns:a="http://schemas.openxmlformats.org/drawingml/2006/main">
+              <a:graphicData uri="http://schemas.openxmlformats.org/drawingml/2006/picture">
+                <pic:pic xmlns:pic="http://schemas.openxmlformats.org/drawingml/2006/picture">
+                  <pic:nvPicPr>
+                    <pic:cNvPr id="1830163161" name="Image 1830163161"/>
+                    <pic:cNvPicPr/>
+                  </pic:nvPicPr>
+                  <pic:blipFill>
+                    <a:blip r:embed="rId4">
+                      <a:extLst>
+                        <a:ext uri="{28A0092B-C50C-407E-A947-70E740481C1C}">
+                          <a14:useLocalDpi xmlns:a14="http://schemas.microsoft.com/office/drawing/2010/main" val="0"/>
+                        </a:ext>
+                      </a:extLst>
+                    </a:blip>
+                    <a:stretch>
+                      <a:fillRect/>
+                    </a:stretch>
+                  </pic:blipFill>
+                  <pic:spPr>
+                    <a:xfrm>
+                      <a:off x="0" y="0"/>
+                      <a:ext cx="5760720" cy="3347085"/>
+                    </a:xfrm>
+                    <a:prstGeom prst="rect">
+                      <a:avLst/>
+                    </a:prstGeom>
+                  </pic:spPr>
+                </pic:pic>
+              </a:graphicData>
+            </a:graphic>
+          </wp:inline>
+        </w:drawing>
+      </w:r>
+    </w:p>
+    <w:p>
+      <w:pPr>
+        <w:rPr>
+          <w:color w:val="4472C4" w:themeColor="accent1"/>
+          <w:sz w:val="28"/>
+          <w:szCs w:val="28"/>
+          <w:lang w:val="fr-SN"/>
+        </w:rPr>
+      </w:pPr>
+    </w:p>
     <w:p/>
     <w:sectPr>
       <w:pgSz w:w="11906" w:h="16838"/>
@@ -413,6 +680,7 @@
   <w:style w:type="paragraph" w:default="1" w:styleId="Normal">
     <w:name w:val="Normal"/>
     <w:qFormat/>
+    <w:rsid w:val="004E2192"/>
   </w:style>
   <w:style w:type="paragraph" w:styleId="Titre1">
     <w:name w:val="heading 1"/>

</xml_diff>

<commit_message>
Partie 2 - Comparer les techniques de prompting
</commit_message>
<xml_diff>
--- a/ai-business_assistant/ficher_assistant.docx
+++ b/ai-business_assistant/ficher_assistant.docx
@@ -232,7 +232,7 @@
                     <pic:cNvPicPr/>
                   </pic:nvPicPr>
                   <pic:blipFill>
-                    <a:blip r:embed="rId4">
+                    <a:blip r:embed="rId5">
                       <a:extLst>
                         <a:ext uri="{28A0092B-C50C-407E-A947-70E740481C1C}">
                           <a14:useLocalDpi xmlns:a14="http://schemas.microsoft.com/office/drawing/2010/main" val="0"/>
@@ -269,7 +269,1543 @@
         </w:rPr>
       </w:pPr>
     </w:p>
-    <w:p/>
+    <w:p>
+      <w:pPr>
+        <w:rPr>
+          <w:color w:val="4472C4" w:themeColor="accent1"/>
+          <w:sz w:val="36"/>
+          <w:szCs w:val="36"/>
+          <w:lang w:val="fr-SN"/>
+        </w:rPr>
+      </w:pPr>
+      <w:r>
+        <w:rPr>
+          <w:color w:val="4472C4" w:themeColor="accent1"/>
+          <w:sz w:val="36"/>
+          <w:szCs w:val="36"/>
+          <w:lang w:val="fr-SN"/>
+        </w:rPr>
+        <w:t>Partie 2 - Comparer les techniques de prompting</w:t>
+      </w:r>
+    </w:p>
+    <w:p>
+      <w:pPr>
+        <w:rPr>
+          <w:b/>
+          <w:bCs/>
+          <w:color w:val="4472C4" w:themeColor="accent1"/>
+          <w:sz w:val="28"/>
+          <w:szCs w:val="28"/>
+          <w:u w:val="single"/>
+          <w:lang w:val="fr-SN"/>
+        </w:rPr>
+      </w:pPr>
+      <w:r>
+        <w:rPr>
+          <w:b/>
+          <w:bCs/>
+          <w:color w:val="4472C4" w:themeColor="accent1"/>
+          <w:sz w:val="28"/>
+          <w:szCs w:val="28"/>
+          <w:u w:val="single"/>
+          <w:lang w:val="fr-SN"/>
+        </w:rPr>
+        <w:t>Technique zero-shot :</w:t>
+      </w:r>
+    </w:p>
+    <w:p>
+      <w:pPr>
+        <w:rPr>
+          <w:color w:val="000000" w:themeColor="text1"/>
+          <w:sz w:val="28"/>
+          <w:szCs w:val="28"/>
+          <w:lang w:val="fr-SN"/>
+        </w:rPr>
+      </w:pPr>
+      <w:r>
+        <w:rPr>
+          <w:color w:val="000000" w:themeColor="text1"/>
+          <w:sz w:val="28"/>
+          <w:szCs w:val="28"/>
+          <w:u w:val="single"/>
+          <w:lang w:val="fr-SN"/>
+        </w:rPr>
+        <w:t>Prompt </w:t>
+      </w:r>
+      <w:r>
+        <w:rPr>
+          <w:color w:val="000000" w:themeColor="text1"/>
+          <w:sz w:val="28"/>
+          <w:szCs w:val="28"/>
+          <w:lang w:val="fr-SN"/>
+        </w:rPr>
+        <w:t>: ```</w:t>
+      </w:r>
+      <w:r>
+        <w:rPr>
+          <w:lang w:val="fr-SN"/>
+        </w:rPr>
+        <w:t xml:space="preserve"> </w:t>
+      </w:r>
+      <w:r>
+        <w:rPr>
+          <w:color w:val="000000" w:themeColor="text1"/>
+          <w:sz w:val="28"/>
+          <w:szCs w:val="28"/>
+          <w:lang w:val="fr-SN"/>
+        </w:rPr>
+        <w:t>« Classer le commentaire suivant :</w:t>
+      </w:r>
+      <w:r>
+        <w:rPr>
+          <w:color w:val="000000" w:themeColor="text1"/>
+          <w:sz w:val="28"/>
+          <w:szCs w:val="28"/>
+          <w:lang w:val="fr-SN"/>
+        </w:rPr>
+        <w:br/>
+        <w:t>"Le service est rapide mais l'application plante régulièrement."</w:t>
+      </w:r>
+      <w:r>
+        <w:rPr>
+          <w:color w:val="000000" w:themeColor="text1"/>
+          <w:sz w:val="28"/>
+          <w:szCs w:val="28"/>
+          <w:lang w:val="fr-SN"/>
+        </w:rPr>
+        <w:br/>
+      </w:r>
+      <w:r>
+        <w:rPr>
+          <w:color w:val="000000" w:themeColor="text1"/>
+          <w:sz w:val="28"/>
+          <w:szCs w:val="28"/>
+          <w:lang w:val="fr-SN"/>
+        </w:rPr>
+        <w:t>Classes possibles : positif, négatif, neutre. »```</w:t>
+      </w:r>
+    </w:p>
+    <w:p>
+      <w:pPr>
+        <w:rPr>
+          <w:b/>
+          <w:bCs/>
+          <w:i/>
+          <w:iCs/>
+          <w:color w:val="000000" w:themeColor="text1"/>
+          <w:sz w:val="28"/>
+          <w:szCs w:val="28"/>
+          <w:lang w:val="fr-SN"/>
+        </w:rPr>
+      </w:pPr>
+      <w:r>
+        <w:rPr>
+          <w:color w:val="4472C4" w:themeColor="accent1"/>
+          <w:sz w:val="28"/>
+          <w:szCs w:val="28"/>
+          <w:lang w:val="fr-SN"/>
+        </w:rPr>
+        <w:lastRenderedPageBreak/>
+        <w:t xml:space="preserve">Réponse du LLM : </w:t>
+      </w:r>
+      <w:r>
+        <w:rPr>
+          <w:b/>
+          <w:bCs/>
+          <w:i/>
+          <w:iCs/>
+          <w:color w:val="000000" w:themeColor="text1"/>
+          <w:sz w:val="28"/>
+          <w:szCs w:val="28"/>
+          <w:lang w:val="fr-SN"/>
+        </w:rPr>
+        <w:t xml:space="preserve">“ </w:t>
+      </w:r>
+      <w:r>
+        <w:rPr>
+          <w:b/>
+          <w:bCs/>
+          <w:i/>
+          <w:iCs/>
+          <w:color w:val="000000" w:themeColor="text1"/>
+          <w:sz w:val="28"/>
+          <w:szCs w:val="28"/>
+          <w:lang w:val="fr-SN"/>
+        </w:rPr>
+        <w:t>Classe : Mitigé / Neutre-négatif (si une seule classe doit être choisie parmi les trois proposées → Négatif)</w:t>
+      </w:r>
+    </w:p>
+    <w:p>
+      <w:pPr>
+        <w:rPr>
+          <w:b/>
+          <w:bCs/>
+          <w:i/>
+          <w:iCs/>
+          <w:color w:val="000000" w:themeColor="text1"/>
+          <w:sz w:val="28"/>
+          <w:szCs w:val="28"/>
+          <w:lang w:val="fr-SN"/>
+        </w:rPr>
+      </w:pPr>
+      <w:r>
+        <w:rPr>
+          <w:b/>
+          <w:bCs/>
+          <w:i/>
+          <w:iCs/>
+          <w:color w:val="000000" w:themeColor="text1"/>
+          <w:sz w:val="28"/>
+          <w:szCs w:val="28"/>
+          <w:lang w:val="fr-SN"/>
+        </w:rPr>
+        <w:t>Justification :</w:t>
+      </w:r>
+    </w:p>
+    <w:p>
+      <w:pPr>
+        <w:rPr>
+          <w:b/>
+          <w:bCs/>
+          <w:i/>
+          <w:iCs/>
+          <w:color w:val="000000" w:themeColor="text1"/>
+          <w:sz w:val="28"/>
+          <w:szCs w:val="28"/>
+          <w:lang w:val="fr-SN"/>
+        </w:rPr>
+      </w:pPr>
+      <w:r>
+        <w:rPr>
+          <w:b/>
+          <w:bCs/>
+          <w:i/>
+          <w:iCs/>
+          <w:color w:val="000000" w:themeColor="text1"/>
+          <w:sz w:val="28"/>
+          <w:szCs w:val="28"/>
+          <w:lang w:val="fr-SN"/>
+        </w:rPr>
+        <w:t>Ce commentaire contient en réalité deux sentiments opposés :</w:t>
+      </w:r>
+    </w:p>
+    <w:p>
+      <w:pPr>
+        <w:rPr>
+          <w:b/>
+          <w:bCs/>
+          <w:i/>
+          <w:iCs/>
+          <w:color w:val="000000" w:themeColor="text1"/>
+          <w:sz w:val="28"/>
+          <w:szCs w:val="28"/>
+          <w:lang w:val="fr-SN"/>
+        </w:rPr>
+      </w:pPr>
+      <w:r>
+        <w:rPr>
+          <w:b/>
+          <w:bCs/>
+          <w:i/>
+          <w:iCs/>
+          <w:color w:val="000000" w:themeColor="text1"/>
+          <w:sz w:val="28"/>
+          <w:szCs w:val="28"/>
+          <w:lang w:val="fr-SN"/>
+        </w:rPr>
+        <w:t>Un aspect positif : « le service est rapide »</w:t>
+      </w:r>
+    </w:p>
+    <w:p>
+      <w:pPr>
+        <w:rPr>
+          <w:b/>
+          <w:bCs/>
+          <w:i/>
+          <w:iCs/>
+          <w:color w:val="000000" w:themeColor="text1"/>
+          <w:sz w:val="28"/>
+          <w:szCs w:val="28"/>
+          <w:lang w:val="fr-SN"/>
+        </w:rPr>
+      </w:pPr>
+      <w:r>
+        <w:rPr>
+          <w:b/>
+          <w:bCs/>
+          <w:i/>
+          <w:iCs/>
+          <w:color w:val="000000" w:themeColor="text1"/>
+          <w:sz w:val="28"/>
+          <w:szCs w:val="28"/>
+          <w:lang w:val="fr-SN"/>
+        </w:rPr>
+        <w:t>Un aspect négatif, plus impactant : « l'application plante régulièrement »</w:t>
+      </w:r>
+    </w:p>
+    <w:p>
+      <w:pPr>
+        <w:rPr>
+          <w:i/>
+          <w:iCs/>
+          <w:color w:val="000000" w:themeColor="text1"/>
+          <w:sz w:val="28"/>
+          <w:szCs w:val="28"/>
+          <w:lang w:val="fr-SN"/>
+        </w:rPr>
+      </w:pPr>
+      <w:r>
+        <w:rPr>
+          <w:b/>
+          <w:bCs/>
+          <w:i/>
+          <w:iCs/>
+          <w:color w:val="000000" w:themeColor="text1"/>
+          <w:sz w:val="28"/>
+          <w:szCs w:val="28"/>
+          <w:lang w:val="fr-SN"/>
+        </w:rPr>
+        <w:t>Le verbe « plante régulièrement » signale un problème technique récurrent, donc gênant pour l'expérience utilisateur — ce qui pèse généralement plus lourd dans la perception globale qu'un simple point positif ponctuel. C'est pourquoi, si l'on doit trancher entre les trois classes proposées, le sentiment dominant penche vers Négatif.</w:t>
+      </w:r>
+      <w:r>
+        <w:rPr>
+          <w:i/>
+          <w:iCs/>
+          <w:color w:val="000000" w:themeColor="text1"/>
+          <w:sz w:val="28"/>
+          <w:szCs w:val="28"/>
+          <w:lang w:val="fr-SN"/>
+        </w:rPr>
+        <w:t xml:space="preserve"> </w:t>
+      </w:r>
+      <w:r>
+        <w:rPr>
+          <w:b/>
+          <w:bCs/>
+          <w:color w:val="000000" w:themeColor="text1"/>
+          <w:sz w:val="28"/>
+          <w:szCs w:val="28"/>
+          <w:lang w:val="fr-SN"/>
+        </w:rPr>
+        <w:t>”</w:t>
+      </w:r>
+    </w:p>
+    <w:p>
+      <w:pPr>
+        <w:rPr>
+          <w:color w:val="4472C4" w:themeColor="accent1"/>
+          <w:sz w:val="28"/>
+          <w:szCs w:val="28"/>
+          <w:lang w:val="fr-SN"/>
+        </w:rPr>
+      </w:pPr>
+      <w:r>
+        <w:rPr>
+          <w:color w:val="4472C4" w:themeColor="accent1"/>
+          <w:sz w:val="28"/>
+          <w:szCs w:val="28"/>
+          <w:lang w:val="fr-SN"/>
+        </w:rPr>
+        <w:t xml:space="preserve">Technique One-shot : </w:t>
+      </w:r>
+    </w:p>
+    <w:p>
+      <w:pPr>
+        <w:rPr>
+          <w:color w:val="000000" w:themeColor="text1"/>
+          <w:sz w:val="28"/>
+          <w:szCs w:val="28"/>
+          <w:lang w:val="fr-SN"/>
+        </w:rPr>
+      </w:pPr>
+      <w:r>
+        <w:rPr>
+          <w:color w:val="4472C4" w:themeColor="accent1"/>
+          <w:sz w:val="28"/>
+          <w:szCs w:val="28"/>
+          <w:lang w:val="fr-SN"/>
+        </w:rPr>
+        <w:t>Prompt : ```</w:t>
+      </w:r>
+      <w:r>
+        <w:rPr>
+          <w:color w:val="000000" w:themeColor="text1"/>
+          <w:sz w:val="28"/>
+          <w:szCs w:val="28"/>
+          <w:lang w:val="fr-SN"/>
+        </w:rPr>
+        <w:t>Classe chaque commentaire dans une seule c</w:t>
+      </w:r>
+      <w:r>
+        <w:rPr>
+          <w:color w:val="000000" w:themeColor="text1"/>
+          <w:sz w:val="28"/>
+          <w:szCs w:val="28"/>
+          <w:lang w:val="fr-SN"/>
+        </w:rPr>
+        <w:t>lasse</w:t>
+      </w:r>
+      <w:r>
+        <w:rPr>
+          <w:color w:val="000000" w:themeColor="text1"/>
+          <w:sz w:val="28"/>
+          <w:szCs w:val="28"/>
+          <w:lang w:val="fr-SN"/>
+        </w:rPr>
+        <w:t xml:space="preserve"> :</w:t>
+      </w:r>
+    </w:p>
+    <w:p>
+      <w:pPr>
+        <w:rPr>
+          <w:color w:val="000000" w:themeColor="text1"/>
+          <w:sz w:val="28"/>
+          <w:szCs w:val="28"/>
+          <w:lang w:val="fr-SN"/>
+        </w:rPr>
+      </w:pPr>
+      <w:r>
+        <w:rPr>
+          <w:color w:val="000000" w:themeColor="text1"/>
+          <w:sz w:val="28"/>
+          <w:szCs w:val="28"/>
+          <w:lang w:val="fr-SN"/>
+        </w:rPr>
+        <w:t>Positif, négatif ou neutre.</w:t>
+      </w:r>
+    </w:p>
+    <w:p>
+      <w:pPr>
+        <w:rPr>
+          <w:color w:val="000000" w:themeColor="text1"/>
+          <w:sz w:val="28"/>
+          <w:szCs w:val="28"/>
+          <w:lang w:val="fr-SN"/>
+        </w:rPr>
+      </w:pPr>
+      <w:r>
+        <w:rPr>
+          <w:color w:val="000000" w:themeColor="text1"/>
+          <w:sz w:val="28"/>
+          <w:szCs w:val="28"/>
+          <w:lang w:val="fr-SN"/>
+        </w:rPr>
+        <w:t>Exemple :</w:t>
+      </w:r>
+    </w:p>
+    <w:p>
+      <w:pPr>
+        <w:rPr>
+          <w:color w:val="000000" w:themeColor="text1"/>
+          <w:sz w:val="28"/>
+          <w:szCs w:val="28"/>
+          <w:lang w:val="fr-SN"/>
+        </w:rPr>
+      </w:pPr>
+      <w:r>
+        <w:rPr>
+          <w:color w:val="000000" w:themeColor="text1"/>
+          <w:sz w:val="28"/>
+          <w:szCs w:val="28"/>
+          <w:lang w:val="fr-SN"/>
+        </w:rPr>
+        <w:t>Commentaire : « L</w:t>
+      </w:r>
+      <w:r>
+        <w:rPr>
+          <w:color w:val="000000" w:themeColor="text1"/>
+          <w:sz w:val="28"/>
+          <w:szCs w:val="28"/>
+          <w:lang w:val="fr-SN"/>
+        </w:rPr>
+        <w:t xml:space="preserve">a voiture </w:t>
+      </w:r>
+      <w:r>
+        <w:rPr>
+          <w:color w:val="000000" w:themeColor="text1"/>
+          <w:sz w:val="28"/>
+          <w:szCs w:val="28"/>
+          <w:lang w:val="fr-SN"/>
+        </w:rPr>
+        <w:t>est be</w:t>
+      </w:r>
+      <w:r>
+        <w:rPr>
+          <w:color w:val="000000" w:themeColor="text1"/>
+          <w:sz w:val="28"/>
+          <w:szCs w:val="28"/>
+          <w:lang w:val="fr-SN"/>
+        </w:rPr>
+        <w:t>lle</w:t>
+      </w:r>
+      <w:r>
+        <w:rPr>
+          <w:color w:val="000000" w:themeColor="text1"/>
+          <w:sz w:val="28"/>
+          <w:szCs w:val="28"/>
+          <w:lang w:val="fr-SN"/>
+        </w:rPr>
+        <w:t xml:space="preserve">, mais </w:t>
+      </w:r>
+      <w:r>
+        <w:rPr>
+          <w:color w:val="000000" w:themeColor="text1"/>
+          <w:sz w:val="28"/>
+          <w:szCs w:val="28"/>
+          <w:lang w:val="fr-SN"/>
+        </w:rPr>
+        <w:t xml:space="preserve">elle </w:t>
+      </w:r>
+      <w:r>
+        <w:rPr>
+          <w:color w:val="000000" w:themeColor="text1"/>
+          <w:sz w:val="28"/>
+          <w:szCs w:val="28"/>
+          <w:lang w:val="fr-SN"/>
+        </w:rPr>
+        <w:t>tombe souvent en panne. »</w:t>
+      </w:r>
+    </w:p>
+    <w:p>
+      <w:pPr>
+        <w:rPr>
+          <w:color w:val="000000" w:themeColor="text1"/>
+          <w:sz w:val="28"/>
+          <w:szCs w:val="28"/>
+          <w:lang w:val="fr-SN"/>
+        </w:rPr>
+      </w:pPr>
+      <w:r>
+        <w:rPr>
+          <w:color w:val="000000" w:themeColor="text1"/>
+          <w:sz w:val="28"/>
+          <w:szCs w:val="28"/>
+          <w:lang w:val="fr-SN"/>
+        </w:rPr>
+        <w:t>C</w:t>
+      </w:r>
+      <w:r>
+        <w:rPr>
+          <w:color w:val="000000" w:themeColor="text1"/>
+          <w:sz w:val="28"/>
+          <w:szCs w:val="28"/>
+          <w:lang w:val="fr-SN"/>
+        </w:rPr>
+        <w:t xml:space="preserve">lasse </w:t>
+      </w:r>
+      <w:r>
+        <w:rPr>
+          <w:color w:val="000000" w:themeColor="text1"/>
+          <w:sz w:val="28"/>
+          <w:szCs w:val="28"/>
+          <w:lang w:val="fr-SN"/>
+        </w:rPr>
+        <w:t>: négatif</w:t>
+      </w:r>
+    </w:p>
+    <w:p>
+      <w:pPr>
+        <w:rPr>
+          <w:color w:val="000000" w:themeColor="text1"/>
+          <w:sz w:val="28"/>
+          <w:szCs w:val="28"/>
+          <w:lang w:val="fr-SN"/>
+        </w:rPr>
+      </w:pPr>
+      <w:r>
+        <w:rPr>
+          <w:color w:val="000000" w:themeColor="text1"/>
+          <w:sz w:val="28"/>
+          <w:szCs w:val="28"/>
+          <w:lang w:val="fr-SN"/>
+        </w:rPr>
+        <w:t>Maintenant</w:t>
+      </w:r>
+      <w:r>
+        <w:rPr>
+          <w:color w:val="000000" w:themeColor="text1"/>
+          <w:sz w:val="28"/>
+          <w:szCs w:val="28"/>
+          <w:lang w:val="fr-SN"/>
+        </w:rPr>
+        <w:t xml:space="preserve"> pour</w:t>
+      </w:r>
+      <w:r>
+        <w:rPr>
+          <w:color w:val="000000" w:themeColor="text1"/>
+          <w:sz w:val="28"/>
+          <w:szCs w:val="28"/>
+          <w:lang w:val="fr-SN"/>
+        </w:rPr>
+        <w:t xml:space="preserve"> ce commentaire </w:t>
+      </w:r>
+      <w:r>
+        <w:rPr>
+          <w:color w:val="000000" w:themeColor="text1"/>
+          <w:sz w:val="28"/>
+          <w:szCs w:val="28"/>
+          <w:lang w:val="fr-SN"/>
+        </w:rPr>
+        <w:t>« Le service est rapide mais l’application plante régulièrement. »</w:t>
+      </w:r>
+    </w:p>
+    <w:p>
+      <w:pPr>
+        <w:rPr>
+          <w:color w:val="000000" w:themeColor="text1"/>
+          <w:sz w:val="28"/>
+          <w:szCs w:val="28"/>
+          <w:lang w:val="fr-SN"/>
+        </w:rPr>
+      </w:pPr>
+      <w:r>
+        <w:rPr>
+          <w:color w:val="000000" w:themeColor="text1"/>
+          <w:sz w:val="28"/>
+          <w:szCs w:val="28"/>
+          <w:lang w:val="fr-SN"/>
+        </w:rPr>
+        <w:t>Réponds</w:t>
+      </w:r>
+      <w:r>
+        <w:rPr>
+          <w:color w:val="000000" w:themeColor="text1"/>
+          <w:sz w:val="28"/>
+          <w:szCs w:val="28"/>
+          <w:lang w:val="fr-SN"/>
+        </w:rPr>
+        <w:t xml:space="preserve"> uniquement par le nom de la classe </w:t>
+      </w:r>
+      <w:r>
+        <w:rPr>
+          <w:color w:val="000000" w:themeColor="text1"/>
+          <w:sz w:val="28"/>
+          <w:szCs w:val="28"/>
+          <w:lang w:val="fr-SN"/>
+        </w:rPr>
+        <w:t>```</w:t>
+      </w:r>
+    </w:p>
+    <w:p>
+      <w:pPr>
+        <w:rPr>
+          <w:b/>
+          <w:bCs/>
+          <w:color w:val="000000" w:themeColor="text1"/>
+          <w:sz w:val="28"/>
+          <w:szCs w:val="28"/>
+          <w:lang w:val="fr-SN"/>
+        </w:rPr>
+      </w:pPr>
+      <w:r>
+        <w:rPr>
+          <w:color w:val="4472C4" w:themeColor="accent1"/>
+          <w:sz w:val="28"/>
+          <w:szCs w:val="28"/>
+          <w:lang w:val="fr-SN"/>
+        </w:rPr>
+        <w:t xml:space="preserve">Réponse du LLM : </w:t>
+      </w:r>
+      <w:r>
+        <w:rPr>
+          <w:b/>
+          <w:bCs/>
+          <w:i/>
+          <w:iCs/>
+          <w:color w:val="000000" w:themeColor="text1"/>
+          <w:sz w:val="28"/>
+          <w:szCs w:val="28"/>
+          <w:lang w:val="fr-SN"/>
+        </w:rPr>
+        <w:t>“</w:t>
+      </w:r>
+      <w:r>
+        <w:rPr>
+          <w:b/>
+          <w:bCs/>
+          <w:i/>
+          <w:iCs/>
+          <w:color w:val="000000" w:themeColor="text1"/>
+          <w:sz w:val="28"/>
+          <w:szCs w:val="28"/>
+          <w:lang w:val="fr-SN"/>
+        </w:rPr>
+        <w:t>Négatif</w:t>
+      </w:r>
+      <w:r>
+        <w:rPr>
+          <w:i/>
+          <w:iCs/>
+          <w:color w:val="000000" w:themeColor="text1"/>
+          <w:sz w:val="28"/>
+          <w:szCs w:val="28"/>
+          <w:lang w:val="fr-SN"/>
+        </w:rPr>
+        <w:t xml:space="preserve"> </w:t>
+      </w:r>
+      <w:r>
+        <w:rPr>
+          <w:b/>
+          <w:bCs/>
+          <w:color w:val="000000" w:themeColor="text1"/>
+          <w:sz w:val="28"/>
+          <w:szCs w:val="28"/>
+          <w:lang w:val="fr-SN"/>
+        </w:rPr>
+        <w:t>”</w:t>
+      </w:r>
+    </w:p>
+    <w:p>
+      <w:pPr>
+        <w:rPr>
+          <w:b/>
+          <w:bCs/>
+          <w:i/>
+          <w:iCs/>
+          <w:color w:val="000000" w:themeColor="text1"/>
+          <w:sz w:val="28"/>
+          <w:szCs w:val="28"/>
+          <w:lang w:val="fr-SN"/>
+        </w:rPr>
+      </w:pPr>
+    </w:p>
+    <w:p>
+      <w:pPr>
+        <w:rPr>
+          <w:color w:val="4472C4" w:themeColor="accent1"/>
+          <w:sz w:val="28"/>
+          <w:szCs w:val="28"/>
+          <w:lang w:val="fr-SN"/>
+        </w:rPr>
+      </w:pPr>
+      <w:r>
+        <w:rPr>
+          <w:color w:val="4472C4" w:themeColor="accent1"/>
+          <w:sz w:val="28"/>
+          <w:szCs w:val="28"/>
+          <w:lang w:val="fr-SN"/>
+        </w:rPr>
+        <w:t xml:space="preserve">Technique </w:t>
+      </w:r>
+      <w:r>
+        <w:rPr>
+          <w:color w:val="4472C4" w:themeColor="accent1"/>
+          <w:sz w:val="28"/>
+          <w:szCs w:val="28"/>
+          <w:lang w:val="fr-SN"/>
+        </w:rPr>
+        <w:t>few</w:t>
+      </w:r>
+      <w:r>
+        <w:rPr>
+          <w:color w:val="4472C4" w:themeColor="accent1"/>
+          <w:sz w:val="28"/>
+          <w:szCs w:val="28"/>
+          <w:lang w:val="fr-SN"/>
+        </w:rPr>
+        <w:t xml:space="preserve">-shot : </w:t>
+      </w:r>
+    </w:p>
+    <w:p>
+      <w:pPr>
+        <w:rPr>
+          <w:color w:val="000000" w:themeColor="text1"/>
+          <w:sz w:val="28"/>
+          <w:szCs w:val="28"/>
+          <w:lang w:val="fr-SN"/>
+        </w:rPr>
+      </w:pPr>
+      <w:r>
+        <w:rPr>
+          <w:color w:val="4472C4" w:themeColor="accent1"/>
+          <w:sz w:val="28"/>
+          <w:szCs w:val="28"/>
+          <w:lang w:val="fr-SN"/>
+        </w:rPr>
+        <w:t>Prompt : ```</w:t>
+      </w:r>
+      <w:r>
+        <w:rPr>
+          <w:lang w:val="fr-SN"/>
+        </w:rPr>
+        <w:t xml:space="preserve"> </w:t>
+      </w:r>
+      <w:r>
+        <w:rPr>
+          <w:color w:val="000000" w:themeColor="text1"/>
+          <w:sz w:val="28"/>
+          <w:szCs w:val="28"/>
+          <w:lang w:val="fr-SN"/>
+        </w:rPr>
+        <w:t>Classe chaque commentaire dans une seule catégorie :</w:t>
+      </w:r>
+    </w:p>
+    <w:p>
+      <w:pPr>
+        <w:rPr>
+          <w:color w:val="000000" w:themeColor="text1"/>
+          <w:sz w:val="28"/>
+          <w:szCs w:val="28"/>
+          <w:lang w:val="fr-SN"/>
+        </w:rPr>
+      </w:pPr>
+      <w:r>
+        <w:rPr>
+          <w:color w:val="000000" w:themeColor="text1"/>
+          <w:sz w:val="28"/>
+          <w:szCs w:val="28"/>
+          <w:lang w:val="fr-SN"/>
+        </w:rPr>
+        <w:t>positif, négatif ou neutre.</w:t>
+      </w:r>
+    </w:p>
+    <w:p>
+      <w:pPr>
+        <w:rPr>
+          <w:color w:val="000000" w:themeColor="text1"/>
+          <w:sz w:val="28"/>
+          <w:szCs w:val="28"/>
+          <w:lang w:val="fr-SN"/>
+        </w:rPr>
+      </w:pPr>
+      <w:r>
+        <w:rPr>
+          <w:color w:val="000000" w:themeColor="text1"/>
+          <w:sz w:val="28"/>
+          <w:szCs w:val="28"/>
+          <w:lang w:val="fr-SN"/>
+        </w:rPr>
+        <w:t>Exemples :</w:t>
+      </w:r>
+    </w:p>
+    <w:p>
+      <w:pPr>
+        <w:rPr>
+          <w:color w:val="000000" w:themeColor="text1"/>
+          <w:sz w:val="28"/>
+          <w:szCs w:val="28"/>
+          <w:lang w:val="fr-SN"/>
+        </w:rPr>
+      </w:pPr>
+      <w:r>
+        <w:rPr>
+          <w:color w:val="000000" w:themeColor="text1"/>
+          <w:sz w:val="28"/>
+          <w:szCs w:val="28"/>
+          <w:lang w:val="fr-SN"/>
+        </w:rPr>
+        <w:t>Commentaire : « Le personnel est accueillant et le service est très rapide. »</w:t>
+      </w:r>
+    </w:p>
+    <w:p>
+      <w:pPr>
+        <w:rPr>
+          <w:color w:val="000000" w:themeColor="text1"/>
+          <w:sz w:val="28"/>
+          <w:szCs w:val="28"/>
+          <w:lang w:val="fr-SN"/>
+        </w:rPr>
+      </w:pPr>
+      <w:r>
+        <w:rPr>
+          <w:color w:val="000000" w:themeColor="text1"/>
+          <w:sz w:val="28"/>
+          <w:szCs w:val="28"/>
+          <w:lang w:val="fr-SN"/>
+        </w:rPr>
+        <w:t>C</w:t>
+      </w:r>
+      <w:r>
+        <w:rPr>
+          <w:color w:val="000000" w:themeColor="text1"/>
+          <w:sz w:val="28"/>
+          <w:szCs w:val="28"/>
+          <w:lang w:val="fr-SN"/>
+        </w:rPr>
+        <w:t>lasse</w:t>
+      </w:r>
+      <w:r>
+        <w:rPr>
+          <w:color w:val="000000" w:themeColor="text1"/>
+          <w:sz w:val="28"/>
+          <w:szCs w:val="28"/>
+          <w:lang w:val="fr-SN"/>
+        </w:rPr>
+        <w:t xml:space="preserve"> : positif</w:t>
+      </w:r>
+    </w:p>
+    <w:p>
+      <w:pPr>
+        <w:rPr>
+          <w:color w:val="000000" w:themeColor="text1"/>
+          <w:sz w:val="28"/>
+          <w:szCs w:val="28"/>
+          <w:lang w:val="fr-SN"/>
+        </w:rPr>
+      </w:pPr>
+      <w:r>
+        <w:rPr>
+          <w:color w:val="000000" w:themeColor="text1"/>
+          <w:sz w:val="28"/>
+          <w:szCs w:val="28"/>
+          <w:lang w:val="fr-SN"/>
+        </w:rPr>
+        <w:lastRenderedPageBreak/>
+        <w:t xml:space="preserve">Commentaire : </w:t>
+      </w:r>
+      <w:r>
+        <w:rPr>
+          <w:color w:val="000000" w:themeColor="text1"/>
+          <w:sz w:val="28"/>
+          <w:szCs w:val="28"/>
+          <w:lang w:val="fr-SN"/>
+        </w:rPr>
+        <w:t>« La livraison est arrivée rapidement, mais le colis était endommagé. »</w:t>
+      </w:r>
+    </w:p>
+    <w:p>
+      <w:pPr>
+        <w:rPr>
+          <w:color w:val="000000" w:themeColor="text1"/>
+          <w:sz w:val="28"/>
+          <w:szCs w:val="28"/>
+          <w:lang w:val="fr-SN"/>
+        </w:rPr>
+      </w:pPr>
+      <w:r>
+        <w:rPr>
+          <w:color w:val="000000" w:themeColor="text1"/>
+          <w:sz w:val="28"/>
+          <w:szCs w:val="28"/>
+          <w:lang w:val="fr-SN"/>
+        </w:rPr>
+        <w:t>C</w:t>
+      </w:r>
+      <w:r>
+        <w:rPr>
+          <w:color w:val="000000" w:themeColor="text1"/>
+          <w:sz w:val="28"/>
+          <w:szCs w:val="28"/>
+          <w:lang w:val="fr-SN"/>
+        </w:rPr>
+        <w:t>lasse</w:t>
+      </w:r>
+      <w:r>
+        <w:rPr>
+          <w:color w:val="000000" w:themeColor="text1"/>
+          <w:sz w:val="28"/>
+          <w:szCs w:val="28"/>
+          <w:lang w:val="fr-SN"/>
+        </w:rPr>
+        <w:t xml:space="preserve"> : négatif</w:t>
+      </w:r>
+    </w:p>
+    <w:p>
+      <w:pPr>
+        <w:rPr>
+          <w:color w:val="000000" w:themeColor="text1"/>
+          <w:sz w:val="28"/>
+          <w:szCs w:val="28"/>
+          <w:lang w:val="fr-SN"/>
+        </w:rPr>
+      </w:pPr>
+      <w:r>
+        <w:rPr>
+          <w:color w:val="000000" w:themeColor="text1"/>
+          <w:sz w:val="28"/>
+          <w:szCs w:val="28"/>
+          <w:lang w:val="fr-SN"/>
+        </w:rPr>
+        <w:t>Commentaire : « Le service est correct, sans avantage ni problème particulier. »</w:t>
+      </w:r>
+    </w:p>
+    <w:p>
+      <w:pPr>
+        <w:rPr>
+          <w:color w:val="000000" w:themeColor="text1"/>
+          <w:sz w:val="28"/>
+          <w:szCs w:val="28"/>
+          <w:lang w:val="fr-SN"/>
+        </w:rPr>
+      </w:pPr>
+      <w:r>
+        <w:rPr>
+          <w:color w:val="000000" w:themeColor="text1"/>
+          <w:sz w:val="28"/>
+          <w:szCs w:val="28"/>
+          <w:lang w:val="fr-SN"/>
+        </w:rPr>
+        <w:t>C</w:t>
+      </w:r>
+      <w:r>
+        <w:rPr>
+          <w:color w:val="000000" w:themeColor="text1"/>
+          <w:sz w:val="28"/>
+          <w:szCs w:val="28"/>
+          <w:lang w:val="fr-SN"/>
+        </w:rPr>
+        <w:t>lasse</w:t>
+      </w:r>
+      <w:r>
+        <w:rPr>
+          <w:color w:val="000000" w:themeColor="text1"/>
+          <w:sz w:val="28"/>
+          <w:szCs w:val="28"/>
+          <w:lang w:val="fr-SN"/>
+        </w:rPr>
+        <w:t xml:space="preserve"> : neutre</w:t>
+      </w:r>
+    </w:p>
+    <w:p>
+      <w:pPr>
+        <w:rPr>
+          <w:color w:val="000000" w:themeColor="text1"/>
+          <w:sz w:val="28"/>
+          <w:szCs w:val="28"/>
+          <w:lang w:val="fr-SN"/>
+        </w:rPr>
+      </w:pPr>
+      <w:r>
+        <w:rPr>
+          <w:color w:val="000000" w:themeColor="text1"/>
+          <w:sz w:val="28"/>
+          <w:szCs w:val="28"/>
+          <w:lang w:val="fr-SN"/>
+        </w:rPr>
+        <w:t>Commentaire à classer :</w:t>
+      </w:r>
+    </w:p>
+    <w:p>
+      <w:pPr>
+        <w:rPr>
+          <w:color w:val="000000" w:themeColor="text1"/>
+          <w:sz w:val="28"/>
+          <w:szCs w:val="28"/>
+          <w:lang w:val="fr-SN"/>
+        </w:rPr>
+      </w:pPr>
+      <w:r>
+        <w:rPr>
+          <w:color w:val="000000" w:themeColor="text1"/>
+          <w:sz w:val="28"/>
+          <w:szCs w:val="28"/>
+          <w:lang w:val="fr-SN"/>
+        </w:rPr>
+        <w:t>« Le service est rapide mais l’application plante régulièrement. »</w:t>
+      </w:r>
+    </w:p>
+    <w:p>
+      <w:pPr>
+        <w:rPr>
+          <w:color w:val="000000" w:themeColor="text1"/>
+          <w:sz w:val="28"/>
+          <w:szCs w:val="28"/>
+          <w:lang w:val="fr-SN"/>
+        </w:rPr>
+      </w:pPr>
+      <w:r>
+        <w:rPr>
+          <w:color w:val="000000" w:themeColor="text1"/>
+          <w:sz w:val="28"/>
+          <w:szCs w:val="28"/>
+          <w:lang w:val="fr-SN"/>
+        </w:rPr>
+        <w:t xml:space="preserve">Réponds uniquement par le nom de la </w:t>
+      </w:r>
+      <w:r>
+        <w:rPr>
+          <w:color w:val="000000" w:themeColor="text1"/>
+          <w:sz w:val="28"/>
+          <w:szCs w:val="28"/>
+          <w:lang w:val="fr-SN"/>
+        </w:rPr>
+        <w:t>classe</w:t>
+      </w:r>
+      <w:r>
+        <w:rPr>
+          <w:color w:val="000000" w:themeColor="text1"/>
+          <w:sz w:val="28"/>
+          <w:szCs w:val="28"/>
+          <w:lang w:val="fr-SN"/>
+        </w:rPr>
+        <w:t>.</w:t>
+      </w:r>
+      <w:r>
+        <w:rPr>
+          <w:color w:val="4472C4" w:themeColor="accent1"/>
+          <w:sz w:val="28"/>
+          <w:szCs w:val="28"/>
+          <w:lang w:val="fr-SN"/>
+        </w:rPr>
+        <w:t xml:space="preserve"> </w:t>
+      </w:r>
+      <w:r>
+        <w:rPr>
+          <w:color w:val="4472C4" w:themeColor="accent1"/>
+          <w:sz w:val="28"/>
+          <w:szCs w:val="28"/>
+          <w:lang w:val="fr-SN"/>
+        </w:rPr>
+        <w:t>```</w:t>
+      </w:r>
+    </w:p>
+    <w:p>
+      <w:pPr>
+        <w:rPr>
+          <w:b/>
+          <w:bCs/>
+          <w:color w:val="000000" w:themeColor="text1"/>
+          <w:sz w:val="28"/>
+          <w:szCs w:val="28"/>
+          <w:lang w:val="fr-SN"/>
+        </w:rPr>
+      </w:pPr>
+      <w:r>
+        <w:rPr>
+          <w:color w:val="4472C4" w:themeColor="accent1"/>
+          <w:sz w:val="28"/>
+          <w:szCs w:val="28"/>
+          <w:lang w:val="fr-SN"/>
+        </w:rPr>
+        <w:t xml:space="preserve">Réponse du LLM : </w:t>
+      </w:r>
+      <w:r>
+        <w:rPr>
+          <w:b/>
+          <w:bCs/>
+          <w:i/>
+          <w:iCs/>
+          <w:color w:val="000000" w:themeColor="text1"/>
+          <w:sz w:val="28"/>
+          <w:szCs w:val="28"/>
+          <w:lang w:val="fr-SN"/>
+        </w:rPr>
+        <w:t>“</w:t>
+      </w:r>
+      <w:r>
+        <w:rPr>
+          <w:b/>
+          <w:bCs/>
+          <w:i/>
+          <w:iCs/>
+          <w:color w:val="000000" w:themeColor="text1"/>
+          <w:sz w:val="28"/>
+          <w:szCs w:val="28"/>
+          <w:lang w:val="fr-SN"/>
+        </w:rPr>
+        <w:t>Négatif</w:t>
+      </w:r>
+      <w:r>
+        <w:rPr>
+          <w:i/>
+          <w:iCs/>
+          <w:color w:val="000000" w:themeColor="text1"/>
+          <w:sz w:val="28"/>
+          <w:szCs w:val="28"/>
+          <w:lang w:val="fr-SN"/>
+        </w:rPr>
+        <w:t xml:space="preserve"> </w:t>
+      </w:r>
+      <w:r>
+        <w:rPr>
+          <w:b/>
+          <w:bCs/>
+          <w:color w:val="000000" w:themeColor="text1"/>
+          <w:sz w:val="28"/>
+          <w:szCs w:val="28"/>
+          <w:lang w:val="fr-SN"/>
+        </w:rPr>
+        <w:t>”</w:t>
+      </w:r>
+    </w:p>
+    <w:p>
+      <w:pPr>
+        <w:rPr>
+          <w:b/>
+          <w:bCs/>
+          <w:color w:val="000000" w:themeColor="text1"/>
+          <w:sz w:val="28"/>
+          <w:szCs w:val="28"/>
+          <w:lang w:val="fr-SN"/>
+        </w:rPr>
+      </w:pPr>
+    </w:p>
+    <w:p>
+      <w:pPr>
+        <w:rPr>
+          <w:color w:val="4472C4" w:themeColor="accent1"/>
+          <w:sz w:val="28"/>
+          <w:szCs w:val="28"/>
+          <w:lang w:val="fr-SN"/>
+        </w:rPr>
+      </w:pPr>
+      <w:r>
+        <w:rPr>
+          <w:color w:val="4472C4" w:themeColor="accent1"/>
+          <w:sz w:val="28"/>
+          <w:szCs w:val="28"/>
+          <w:lang w:val="fr-SN"/>
+        </w:rPr>
+        <w:t xml:space="preserve">Technique few-shot : </w:t>
+      </w:r>
+    </w:p>
+    <w:p>
+      <w:pPr>
+        <w:rPr>
+          <w:color w:val="4472C4" w:themeColor="accent1"/>
+          <w:sz w:val="28"/>
+          <w:szCs w:val="28"/>
+          <w:lang w:val="fr-SN"/>
+        </w:rPr>
+      </w:pPr>
+      <w:r>
+        <w:rPr>
+          <w:color w:val="4472C4" w:themeColor="accent1"/>
+          <w:sz w:val="28"/>
+          <w:szCs w:val="28"/>
+          <w:lang w:val="fr-SN"/>
+        </w:rPr>
+        <w:t>Prompt :</w:t>
+      </w:r>
+    </w:p>
+    <w:p>
+      <w:pPr>
+        <w:rPr>
+          <w:color w:val="000000" w:themeColor="text1"/>
+          <w:sz w:val="28"/>
+          <w:szCs w:val="28"/>
+          <w:lang w:val="fr-SN"/>
+        </w:rPr>
+      </w:pPr>
+      <w:r>
+        <w:rPr>
+          <w:color w:val="4472C4" w:themeColor="accent1"/>
+          <w:sz w:val="28"/>
+          <w:szCs w:val="28"/>
+          <w:lang w:val="fr-SN"/>
+        </w:rPr>
+        <w:t>```</w:t>
+      </w:r>
+      <w:r>
+        <w:rPr>
+          <w:color w:val="000000" w:themeColor="text1"/>
+          <w:sz w:val="28"/>
+          <w:szCs w:val="28"/>
+          <w:lang w:val="fr-SN"/>
+        </w:rPr>
+        <w:t>Rôle</w:t>
+      </w:r>
+      <w:r>
+        <w:rPr>
+          <w:color w:val="000000" w:themeColor="text1"/>
+          <w:sz w:val="28"/>
+          <w:szCs w:val="28"/>
+          <w:lang w:val="fr-SN"/>
+        </w:rPr>
+        <w:t xml:space="preserve"> : </w:t>
+      </w:r>
+      <w:r>
+        <w:rPr>
+          <w:color w:val="000000" w:themeColor="text1"/>
+          <w:sz w:val="28"/>
+          <w:szCs w:val="28"/>
+          <w:lang w:val="fr-SN"/>
+        </w:rPr>
+        <w:t>Tu es un système de classification de commentaires client</w:t>
+      </w:r>
+    </w:p>
+    <w:p>
+      <w:pPr>
+        <w:rPr>
+          <w:color w:val="000000" w:themeColor="text1"/>
+          <w:sz w:val="28"/>
+          <w:szCs w:val="28"/>
+          <w:lang w:val="fr-SN"/>
+        </w:rPr>
+      </w:pPr>
+      <w:r>
+        <w:rPr>
+          <w:color w:val="000000" w:themeColor="text1"/>
+          <w:sz w:val="28"/>
+          <w:szCs w:val="28"/>
+          <w:lang w:val="fr-SN"/>
+        </w:rPr>
+        <w:t xml:space="preserve">Tache : </w:t>
+      </w:r>
+      <w:r>
+        <w:rPr>
+          <w:color w:val="000000" w:themeColor="text1"/>
+          <w:sz w:val="28"/>
+          <w:szCs w:val="28"/>
+          <w:lang w:val="fr-SN"/>
+        </w:rPr>
+        <w:t>classe ce commentaire</w:t>
+      </w:r>
+      <w:r>
+        <w:rPr>
+          <w:color w:val="000000" w:themeColor="text1"/>
+          <w:sz w:val="28"/>
+          <w:szCs w:val="28"/>
+          <w:lang w:val="fr-SN"/>
+        </w:rPr>
+        <w:t xml:space="preserve"> : </w:t>
+      </w:r>
+      <w:r>
+        <w:rPr>
+          <w:color w:val="000000" w:themeColor="text1"/>
+          <w:sz w:val="28"/>
+          <w:szCs w:val="28"/>
+          <w:lang w:val="fr-SN"/>
+        </w:rPr>
+        <w:t>« Le service est rapide mais l’application plante régulièrement. »</w:t>
+      </w:r>
+      <w:r>
+        <w:rPr>
+          <w:color w:val="000000" w:themeColor="text1"/>
+          <w:sz w:val="28"/>
+          <w:szCs w:val="28"/>
+          <w:lang w:val="fr-SN"/>
+        </w:rPr>
+        <w:t xml:space="preserve"> </w:t>
+      </w:r>
+      <w:r>
+        <w:rPr>
+          <w:color w:val="000000" w:themeColor="text1"/>
+          <w:sz w:val="28"/>
+          <w:szCs w:val="28"/>
+          <w:lang w:val="fr-SN"/>
+        </w:rPr>
+        <w:t xml:space="preserve">dans une seule classe </w:t>
+      </w:r>
+    </w:p>
+    <w:p>
+      <w:pPr>
+        <w:rPr>
+          <w:color w:val="000000" w:themeColor="text1"/>
+          <w:sz w:val="28"/>
+          <w:szCs w:val="28"/>
+          <w:lang w:val="fr-SN"/>
+        </w:rPr>
+      </w:pPr>
+      <w:r>
+        <w:rPr>
+          <w:color w:val="000000" w:themeColor="text1"/>
+          <w:sz w:val="28"/>
+          <w:szCs w:val="28"/>
+          <w:lang w:val="fr-SN"/>
+        </w:rPr>
+        <w:t>Classe</w:t>
+      </w:r>
+      <w:r>
+        <w:rPr>
+          <w:color w:val="000000" w:themeColor="text1"/>
+          <w:sz w:val="28"/>
+          <w:szCs w:val="28"/>
+          <w:lang w:val="fr-SN"/>
+        </w:rPr>
+        <w:t>s</w:t>
+      </w:r>
+      <w:r>
+        <w:rPr>
+          <w:color w:val="000000" w:themeColor="text1"/>
+          <w:sz w:val="28"/>
+          <w:szCs w:val="28"/>
+          <w:lang w:val="fr-SN"/>
+        </w:rPr>
+        <w:t xml:space="preserve"> possibles</w:t>
+      </w:r>
+      <w:r>
+        <w:rPr>
+          <w:color w:val="000000" w:themeColor="text1"/>
+          <w:sz w:val="28"/>
+          <w:szCs w:val="28"/>
+          <w:lang w:val="fr-SN"/>
+        </w:rPr>
+        <w:t xml:space="preserve"> </w:t>
+      </w:r>
+      <w:r>
+        <w:rPr>
+          <w:color w:val="000000" w:themeColor="text1"/>
+          <w:sz w:val="28"/>
+          <w:szCs w:val="28"/>
+          <w:lang w:val="fr-SN"/>
+        </w:rPr>
+        <w:t>: positif, négatif, neutre</w:t>
+      </w:r>
+      <w:r>
+        <w:rPr>
+          <w:color w:val="000000" w:themeColor="text1"/>
+          <w:sz w:val="28"/>
+          <w:szCs w:val="28"/>
+          <w:lang w:val="fr-SN"/>
+        </w:rPr>
+        <w:t>.</w:t>
+      </w:r>
+    </w:p>
+    <w:p>
+      <w:pPr>
+        <w:rPr>
+          <w:color w:val="000000" w:themeColor="text1"/>
+          <w:sz w:val="28"/>
+          <w:szCs w:val="28"/>
+          <w:lang w:val="fr-SN"/>
+        </w:rPr>
+      </w:pPr>
+      <w:r>
+        <w:rPr>
+          <w:color w:val="000000" w:themeColor="text1"/>
+          <w:sz w:val="28"/>
+          <w:szCs w:val="28"/>
+          <w:lang w:val="fr-SN"/>
+        </w:rPr>
+        <w:t>Contexte : dans le cadre d’une analyse de classification</w:t>
+      </w:r>
+    </w:p>
+    <w:p>
+      <w:pPr>
+        <w:rPr>
+          <w:color w:val="000000" w:themeColor="text1"/>
+          <w:sz w:val="28"/>
+          <w:szCs w:val="28"/>
+          <w:lang w:val="fr-SN"/>
+        </w:rPr>
+      </w:pPr>
+      <w:r>
+        <w:rPr>
+          <w:color w:val="000000" w:themeColor="text1"/>
+          <w:sz w:val="28"/>
+          <w:szCs w:val="28"/>
+          <w:lang w:val="fr-SN"/>
+        </w:rPr>
+        <w:t xml:space="preserve">Contraintes : </w:t>
+      </w:r>
+    </w:p>
+    <w:p>
+      <w:pPr>
+        <w:rPr>
+          <w:color w:val="4472C4" w:themeColor="accent1"/>
+          <w:sz w:val="28"/>
+          <w:szCs w:val="28"/>
+          <w:lang w:val="fr-SN"/>
+        </w:rPr>
+      </w:pPr>
+      <w:r>
+        <w:rPr>
+          <w:color w:val="000000" w:themeColor="text1"/>
+          <w:sz w:val="28"/>
+          <w:szCs w:val="28"/>
+          <w:lang w:val="fr-SN"/>
+        </w:rPr>
+        <w:t>-réponds sur une seule ligne comme suit : &lt;la classe est : nom de la classe &gt;</w:t>
+      </w:r>
+      <w:r>
+        <w:rPr>
+          <w:color w:val="4472C4" w:themeColor="accent1"/>
+          <w:sz w:val="28"/>
+          <w:szCs w:val="28"/>
+          <w:lang w:val="fr-SN"/>
+        </w:rPr>
+        <w:t>```</w:t>
+      </w:r>
+    </w:p>
+    <w:p>
+      <w:pPr>
+        <w:rPr>
+          <w:color w:val="4472C4" w:themeColor="accent1"/>
+          <w:sz w:val="28"/>
+          <w:szCs w:val="28"/>
+          <w:lang w:val="fr-SN"/>
+        </w:rPr>
+      </w:pPr>
+    </w:p>
+    <w:p>
+      <w:pPr>
+        <w:rPr>
+          <w:b/>
+          <w:bCs/>
+          <w:i/>
+          <w:iCs/>
+          <w:color w:val="000000" w:themeColor="text1"/>
+          <w:sz w:val="28"/>
+          <w:szCs w:val="28"/>
+          <w:lang w:val="fr-SN"/>
+        </w:rPr>
+      </w:pPr>
+      <w:r>
+        <w:rPr>
+          <w:color w:val="4472C4" w:themeColor="accent1"/>
+          <w:sz w:val="28"/>
+          <w:szCs w:val="28"/>
+          <w:lang w:val="fr-SN"/>
+        </w:rPr>
+        <w:t xml:space="preserve">Réponse du LLM : </w:t>
+      </w:r>
+      <w:r>
+        <w:rPr>
+          <w:b/>
+          <w:bCs/>
+          <w:i/>
+          <w:iCs/>
+          <w:color w:val="000000" w:themeColor="text1"/>
+          <w:sz w:val="28"/>
+          <w:szCs w:val="28"/>
+          <w:lang w:val="fr-SN"/>
+        </w:rPr>
+        <w:t>“&lt;la classe est : négatif&gt; ”</w:t>
+      </w:r>
+    </w:p>
+    <w:p>
+      <w:pPr>
+        <w:rPr>
+          <w:color w:val="000000" w:themeColor="text1"/>
+          <w:sz w:val="28"/>
+          <w:szCs w:val="28"/>
+          <w:lang w:val="fr-SN"/>
+        </w:rPr>
+      </w:pPr>
+    </w:p>
+    <w:p>
+      <w:pPr>
+        <w:rPr>
+          <w:b/>
+          <w:bCs/>
+          <w:color w:val="000000" w:themeColor="text1"/>
+          <w:sz w:val="28"/>
+          <w:szCs w:val="28"/>
+          <w:lang w:val="fr-SN"/>
+        </w:rPr>
+      </w:pPr>
+    </w:p>
+    <w:p>
+      <w:pPr>
+        <w:rPr>
+          <w:color w:val="000000" w:themeColor="text1"/>
+          <w:sz w:val="28"/>
+          <w:szCs w:val="28"/>
+          <w:lang w:val="fr-SN"/>
+        </w:rPr>
+      </w:pPr>
+    </w:p>
+    <w:p>
+      <w:pPr>
+        <w:rPr>
+          <w:color w:val="000000" w:themeColor="text1"/>
+          <w:sz w:val="28"/>
+          <w:szCs w:val="28"/>
+          <w:lang w:val="fr-SN"/>
+        </w:rPr>
+      </w:pPr>
+    </w:p>
+    <w:p>
+      <w:pPr>
+        <w:rPr>
+          <w:color w:val="000000" w:themeColor="text1"/>
+          <w:sz w:val="28"/>
+          <w:szCs w:val="28"/>
+          <w:lang w:val="fr-SN"/>
+        </w:rPr>
+      </w:pPr>
+    </w:p>
     <w:sectPr>
       <w:pgSz w:w="11906" w:h="16838"/>
       <w:pgMar w:top="1417" w:right="1417" w:bottom="1417" w:left="1417" w:header="708" w:footer="708" w:gutter="0"/>
@@ -278,6 +1814,163 @@
     </w:sectPr>
   </w:body>
 </w:document>
+</file>
+
+<file path=word/numbering.xml><?xml version="1.0" encoding="utf-8"?>
+<w:numbering xmlns:wpc="http://schemas.microsoft.com/office/word/2010/wordprocessingCanvas" xmlns:cx="http://schemas.microsoft.com/office/drawing/2014/chartex" xmlns:cx1="http://schemas.microsoft.com/office/drawing/2015/9/8/chartex" xmlns:cx2="http://schemas.microsoft.com/office/drawing/2015/10/21/chartex" xmlns:cx3="http://schemas.microsoft.com/office/drawing/2016/5/9/chartex" xmlns:cx4="http://schemas.microsoft.com/office/drawing/2016/5/10/chartex" xmlns:cx5="http://schemas.microsoft.com/office/drawing/2016/5/11/chartex" xmlns:cx6="http://schemas.microsoft.com/office/drawing/2016/5/12/chartex" xmlns:cx7="http://schemas.microsoft.com/office/drawing/2016/5/13/chartex" xmlns:cx8="http://schemas.microsoft.com/office/drawing/2016/5/14/chartex" xmlns:mc="http://schemas.openxmlformats.org/markup-compatibility/2006" xmlns:aink="http://schemas.microsoft.com/office/drawing/2016/ink" xmlns:am3d="http://schemas.microsoft.com/office/drawing/2017/model3d" xmlns:o="urn:schemas-microsoft-com:office:office" xmlns:oel="http://schemas.microsoft.com/office/2019/extlst" xmlns:r="http://schemas.openxmlformats.org/officeDocument/2006/relationships" xmlns:m="http://schemas.openxmlformats.org/officeDocument/2006/math" xmlns:v="urn:schemas-microsoft-com:vml" xmlns:wp14="http://schemas.microsoft.com/office/word/2010/wordprocessingDrawing" xmlns:wp="http://schemas.openxmlformats.org/drawingml/2006/wordprocessingDrawing" xmlns:w10="urn:schemas-microsoft-com:office:word" xmlns:w="http://schemas.openxmlformats.org/wordprocessingml/2006/main" xmlns:w14="http://schemas.microsoft.com/office/word/2010/wordml" xmlns:w15="http://schemas.microsoft.com/office/word/2012/wordml" xmlns:w16cex="http://schemas.microsoft.com/office/word/2018/wordml/cex" xmlns:w16cid="http://schemas.microsoft.com/office/word/2016/wordml/cid" xmlns:w16="http://schemas.microsoft.com/office/word/2018/wordml" xmlns:w16du="http://schemas.microsoft.com/office/word/2023/wordml/word16du" xmlns:w16sdtdh="http://schemas.microsoft.com/office/word/2020/wordml/sdtdatahash" xmlns:w16sdtfl="http://schemas.microsoft.com/office/word/2024/wordml/sdtformatlock" xmlns:w16se="http://schemas.microsoft.com/office/word/2015/wordml/symex" xmlns:wpg="http://schemas.microsoft.com/office/word/2010/wordprocessingGroup" xmlns:wpi="http://schemas.microsoft.com/office/word/2010/wordprocessingInk" xmlns:wne="http://schemas.microsoft.com/office/word/2006/wordml" xmlns:wps="http://schemas.microsoft.com/office/word/2010/wordprocessingShape" mc:Ignorable="w14 w15 w16se w16cid w16 w16cex w16sdtdh w16sdtfl w16du wp14">
+  <w:abstractNum w:abstractNumId="0" w15:restartNumberingAfterBreak="0">
+    <w:nsid w:val="0E0804F3"/>
+    <w:multiLevelType w:val="multilevel"/>
+    <w:tmpl w:val="0CEE6418"/>
+    <w:lvl w:ilvl="0">
+      <w:start w:val="1"/>
+      <w:numFmt w:val="bullet"/>
+      <w:lvlText w:val=""/>
+      <w:lvlJc w:val="left"/>
+      <w:pPr>
+        <w:tabs>
+          <w:tab w:val="num" w:pos="720"/>
+        </w:tabs>
+        <w:ind w:left="720" w:hanging="360"/>
+      </w:pPr>
+      <w:rPr>
+        <w:rFonts w:ascii="Symbol" w:hAnsi="Symbol" w:hint="default"/>
+        <w:sz w:val="20"/>
+      </w:rPr>
+    </w:lvl>
+    <w:lvl w:ilvl="1" w:tentative="1">
+      <w:start w:val="1"/>
+      <w:numFmt w:val="bullet"/>
+      <w:lvlText w:val="o"/>
+      <w:lvlJc w:val="left"/>
+      <w:pPr>
+        <w:tabs>
+          <w:tab w:val="num" w:pos="1440"/>
+        </w:tabs>
+        <w:ind w:left="1440" w:hanging="360"/>
+      </w:pPr>
+      <w:rPr>
+        <w:rFonts w:ascii="Courier New" w:hAnsi="Courier New" w:hint="default"/>
+        <w:sz w:val="20"/>
+      </w:rPr>
+    </w:lvl>
+    <w:lvl w:ilvl="2" w:tentative="1">
+      <w:start w:val="1"/>
+      <w:numFmt w:val="bullet"/>
+      <w:lvlText w:val=""/>
+      <w:lvlJc w:val="left"/>
+      <w:pPr>
+        <w:tabs>
+          <w:tab w:val="num" w:pos="2160"/>
+        </w:tabs>
+        <w:ind w:left="2160" w:hanging="360"/>
+      </w:pPr>
+      <w:rPr>
+        <w:rFonts w:ascii="Wingdings" w:hAnsi="Wingdings" w:hint="default"/>
+        <w:sz w:val="20"/>
+      </w:rPr>
+    </w:lvl>
+    <w:lvl w:ilvl="3" w:tentative="1">
+      <w:start w:val="1"/>
+      <w:numFmt w:val="bullet"/>
+      <w:lvlText w:val=""/>
+      <w:lvlJc w:val="left"/>
+      <w:pPr>
+        <w:tabs>
+          <w:tab w:val="num" w:pos="2880"/>
+        </w:tabs>
+        <w:ind w:left="2880" w:hanging="360"/>
+      </w:pPr>
+      <w:rPr>
+        <w:rFonts w:ascii="Wingdings" w:hAnsi="Wingdings" w:hint="default"/>
+        <w:sz w:val="20"/>
+      </w:rPr>
+    </w:lvl>
+    <w:lvl w:ilvl="4" w:tentative="1">
+      <w:start w:val="1"/>
+      <w:numFmt w:val="bullet"/>
+      <w:lvlText w:val=""/>
+      <w:lvlJc w:val="left"/>
+      <w:pPr>
+        <w:tabs>
+          <w:tab w:val="num" w:pos="3600"/>
+        </w:tabs>
+        <w:ind w:left="3600" w:hanging="360"/>
+      </w:pPr>
+      <w:rPr>
+        <w:rFonts w:ascii="Wingdings" w:hAnsi="Wingdings" w:hint="default"/>
+        <w:sz w:val="20"/>
+      </w:rPr>
+    </w:lvl>
+    <w:lvl w:ilvl="5" w:tentative="1">
+      <w:start w:val="1"/>
+      <w:numFmt w:val="bullet"/>
+      <w:lvlText w:val=""/>
+      <w:lvlJc w:val="left"/>
+      <w:pPr>
+        <w:tabs>
+          <w:tab w:val="num" w:pos="4320"/>
+        </w:tabs>
+        <w:ind w:left="4320" w:hanging="360"/>
+      </w:pPr>
+      <w:rPr>
+        <w:rFonts w:ascii="Wingdings" w:hAnsi="Wingdings" w:hint="default"/>
+        <w:sz w:val="20"/>
+      </w:rPr>
+    </w:lvl>
+    <w:lvl w:ilvl="6" w:tentative="1">
+      <w:start w:val="1"/>
+      <w:numFmt w:val="bullet"/>
+      <w:lvlText w:val=""/>
+      <w:lvlJc w:val="left"/>
+      <w:pPr>
+        <w:tabs>
+          <w:tab w:val="num" w:pos="5040"/>
+        </w:tabs>
+        <w:ind w:left="5040" w:hanging="360"/>
+      </w:pPr>
+      <w:rPr>
+        <w:rFonts w:ascii="Wingdings" w:hAnsi="Wingdings" w:hint="default"/>
+        <w:sz w:val="20"/>
+      </w:rPr>
+    </w:lvl>
+    <w:lvl w:ilvl="7" w:tentative="1">
+      <w:start w:val="1"/>
+      <w:numFmt w:val="bullet"/>
+      <w:lvlText w:val=""/>
+      <w:lvlJc w:val="left"/>
+      <w:pPr>
+        <w:tabs>
+          <w:tab w:val="num" w:pos="5760"/>
+        </w:tabs>
+        <w:ind w:left="5760" w:hanging="360"/>
+      </w:pPr>
+      <w:rPr>
+        <w:rFonts w:ascii="Wingdings" w:hAnsi="Wingdings" w:hint="default"/>
+        <w:sz w:val="20"/>
+      </w:rPr>
+    </w:lvl>
+    <w:lvl w:ilvl="8" w:tentative="1">
+      <w:start w:val="1"/>
+      <w:numFmt w:val="bullet"/>
+      <w:lvlText w:val=""/>
+      <w:lvlJc w:val="left"/>
+      <w:pPr>
+        <w:tabs>
+          <w:tab w:val="num" w:pos="6480"/>
+        </w:tabs>
+        <w:ind w:left="6480" w:hanging="360"/>
+      </w:pPr>
+      <w:rPr>
+        <w:rFonts w:ascii="Wingdings" w:hAnsi="Wingdings" w:hint="default"/>
+        <w:sz w:val="20"/>
+      </w:rPr>
+    </w:lvl>
+  </w:abstractNum>
+  <w:num w:numId="1" w16cid:durableId="984703518">
+    <w:abstractNumId w:val="0"/>
+  </w:num>
+</w:numbering>
 </file>
 
 <file path=word/styles.xml><?xml version="1.0" encoding="utf-8"?>
@@ -1198,6 +2891,19 @@
       <w:spacing w:val="5"/>
     </w:rPr>
   </w:style>
+  <w:style w:type="paragraph" w:styleId="NormalWeb">
+    <w:name w:val="Normal (Web)"/>
+    <w:basedOn w:val="Normal"/>
+    <w:uiPriority w:val="99"/>
+    <w:semiHidden/>
+    <w:unhideWhenUsed/>
+    <w:rsid w:val="002F2BC5"/>
+    <w:rPr>
+      <w:rFonts w:ascii="Times New Roman" w:hAnsi="Times New Roman" w:cs="Times New Roman"/>
+      <w:sz w:val="24"/>
+      <w:szCs w:val="24"/>
+    </w:rPr>
+  </w:style>
 </w:styles>
 </file>
 

</xml_diff>

<commit_message>
Partie 3 – Prompt Engineering et raisonnement
</commit_message>
<xml_diff>
--- a/ai-business_assistant/ficher_assistant.docx
+++ b/ai-business_assistant/ficher_assistant.docx
@@ -3112,9 +3112,191 @@
       </w:r>
       <w:r>
         <w:rPr>
-          <w:lang w:val="fr-SN"/>
-        </w:rPr>
-        <w:t xml:space="preserve"> </w:t>
+          <w:color w:val="000000" w:themeColor="text1"/>
+          <w:sz w:val="28"/>
+          <w:szCs w:val="28"/>
+          <w:lang w:val="fr-SN"/>
+        </w:rPr>
+        <w:t>1. Identifier les problèmes explicitement mentionnés.</w:t>
+      </w:r>
+    </w:p>
+    <w:p>
+      <w:pPr>
+        <w:ind w:left="283"/>
+        <w:rPr>
+          <w:color w:val="000000" w:themeColor="text1"/>
+          <w:sz w:val="28"/>
+          <w:szCs w:val="28"/>
+          <w:lang w:val="fr-SN"/>
+        </w:rPr>
+      </w:pPr>
+      <w:r>
+        <w:rPr>
+          <w:color w:val="000000" w:themeColor="text1"/>
+          <w:sz w:val="28"/>
+          <w:szCs w:val="28"/>
+          <w:lang w:val="fr-SN"/>
+        </w:rPr>
+        <w:lastRenderedPageBreak/>
+        <w:t>2. Regrouper les problèmes similaires.</w:t>
+      </w:r>
+    </w:p>
+    <w:p>
+      <w:pPr>
+        <w:ind w:left="283"/>
+        <w:rPr>
+          <w:color w:val="000000" w:themeColor="text1"/>
+          <w:sz w:val="28"/>
+          <w:szCs w:val="28"/>
+          <w:lang w:val="fr-SN"/>
+        </w:rPr>
+      </w:pPr>
+      <w:r>
+        <w:rPr>
+          <w:color w:val="000000" w:themeColor="text1"/>
+          <w:sz w:val="28"/>
+          <w:szCs w:val="28"/>
+          <w:lang w:val="fr-SN"/>
+        </w:rPr>
+        <w:t>3. Compter le nombre d’avis associés à chaque problème.</w:t>
+      </w:r>
+    </w:p>
+    <w:p>
+      <w:pPr>
+        <w:ind w:left="283"/>
+        <w:rPr>
+          <w:color w:val="000000" w:themeColor="text1"/>
+          <w:sz w:val="28"/>
+          <w:szCs w:val="28"/>
+          <w:lang w:val="fr-SN"/>
+        </w:rPr>
+      </w:pPr>
+      <w:r>
+        <w:rPr>
+          <w:color w:val="000000" w:themeColor="text1"/>
+          <w:sz w:val="28"/>
+          <w:szCs w:val="28"/>
+          <w:lang w:val="fr-SN"/>
+        </w:rPr>
+        <w:t>4. Classer les problèmes par priorité.</w:t>
+      </w:r>
+    </w:p>
+    <w:p>
+      <w:pPr>
+        <w:ind w:left="283"/>
+        <w:rPr>
+          <w:color w:val="000000" w:themeColor="text1"/>
+          <w:sz w:val="28"/>
+          <w:szCs w:val="28"/>
+          <w:lang w:val="fr-SN"/>
+        </w:rPr>
+      </w:pPr>
+      <w:r>
+        <w:rPr>
+          <w:color w:val="000000" w:themeColor="text1"/>
+          <w:sz w:val="28"/>
+          <w:szCs w:val="28"/>
+          <w:lang w:val="fr-SN"/>
+        </w:rPr>
+        <w:t xml:space="preserve">5. Proposer une recommandation concrète pour chaque </w:t>
+      </w:r>
+      <w:proofErr w:type="gramStart"/>
+      <w:r>
+        <w:rPr>
+          <w:color w:val="000000" w:themeColor="text1"/>
+          <w:sz w:val="28"/>
+          <w:szCs w:val="28"/>
+          <w:lang w:val="fr-SN"/>
+        </w:rPr>
+        <w:t>problème.</w:t>
+      </w:r>
+      <w:r>
+        <w:rPr>
+          <w:color w:val="000000" w:themeColor="text1"/>
+          <w:sz w:val="28"/>
+          <w:szCs w:val="28"/>
+          <w:lang w:val="fr-SN"/>
+        </w:rPr>
+        <w:t>`</w:t>
+      </w:r>
+      <w:proofErr w:type="gramEnd"/>
+      <w:r>
+        <w:rPr>
+          <w:color w:val="000000" w:themeColor="text1"/>
+          <w:sz w:val="28"/>
+          <w:szCs w:val="28"/>
+          <w:lang w:val="fr-SN"/>
+        </w:rPr>
+        <w:t>``</w:t>
+      </w:r>
+    </w:p>
+    <w:p>
+      <w:pPr>
+        <w:ind w:left="283"/>
+        <w:rPr>
+          <w:color w:val="000000" w:themeColor="text1"/>
+          <w:sz w:val="28"/>
+          <w:szCs w:val="28"/>
+          <w:lang w:val="fr-SN"/>
+        </w:rPr>
+      </w:pPr>
+      <w:r>
+        <w:rPr>
+          <w:color w:val="000000" w:themeColor="text1"/>
+          <w:sz w:val="28"/>
+          <w:szCs w:val="28"/>
+          <w:lang w:val="fr-SN"/>
+        </w:rPr>
+        <w:tab/>
+      </w:r>
+      <w:r>
+        <w:rPr>
+          <w:color w:val="806000" w:themeColor="accent4" w:themeShade="80"/>
+          <w:sz w:val="28"/>
+          <w:szCs w:val="28"/>
+          <w:lang w:val="fr-SN"/>
+        </w:rPr>
+        <w:t xml:space="preserve">Question 2 : </w:t>
+      </w:r>
+    </w:p>
+    <w:p>
+      <w:pPr>
+        <w:ind w:left="283"/>
+        <w:rPr>
+          <w:color w:val="000000" w:themeColor="text1"/>
+          <w:sz w:val="28"/>
+          <w:szCs w:val="28"/>
+          <w:lang w:val="fr-SN"/>
+        </w:rPr>
+      </w:pPr>
+      <w:r>
+        <w:rPr>
+          <w:color w:val="000000" w:themeColor="text1"/>
+          <w:sz w:val="28"/>
+          <w:szCs w:val="28"/>
+          <w:lang w:val="fr-SN"/>
+        </w:rPr>
+        <w:t>Premier Prompt d’analyse :</w:t>
+      </w:r>
+    </w:p>
+    <w:p>
+      <w:pPr>
+        <w:ind w:left="283"/>
+        <w:rPr>
+          <w:color w:val="000000" w:themeColor="text1"/>
+          <w:sz w:val="28"/>
+          <w:szCs w:val="28"/>
+          <w:lang w:val="fr-SN"/>
+        </w:rPr>
+      </w:pPr>
+      <w:r>
+        <w:rPr>
+          <w:color w:val="4472C4" w:themeColor="accent1"/>
+          <w:sz w:val="28"/>
+          <w:szCs w:val="28"/>
+          <w:lang w:val="fr-SN"/>
+        </w:rPr>
+        <w:t xml:space="preserve">``` </w:t>
       </w:r>
       <w:r>
         <w:rPr>
@@ -3136,6 +3318,15 @@
           <w:lang w:val="fr-SN"/>
         </w:rPr>
       </w:pPr>
+      <w:r>
+        <w:rPr>
+          <w:color w:val="000000" w:themeColor="text1"/>
+          <w:sz w:val="28"/>
+          <w:szCs w:val="28"/>
+          <w:lang w:val="fr-SN"/>
+        </w:rPr>
+        <w:t>Analyse uniquement les quatre avis fournis ci-dessous.</w:t>
+      </w:r>
     </w:p>
     <w:p>
       <w:pPr>
@@ -3154,7 +3345,7 @@
           <w:szCs w:val="28"/>
           <w:lang w:val="fr-SN"/>
         </w:rPr>
-        <w:t>Analyse uniquement les cinq avis fournis ci-dessous.</w:t>
+        <w:t>Objectifs :</w:t>
       </w:r>
     </w:p>
     <w:p>
@@ -3167,6 +3358,15 @@
           <w:lang w:val="fr-SN"/>
         </w:rPr>
       </w:pPr>
+      <w:r>
+        <w:rPr>
+          <w:color w:val="000000" w:themeColor="text1"/>
+          <w:sz w:val="28"/>
+          <w:szCs w:val="28"/>
+          <w:lang w:val="fr-SN"/>
+        </w:rPr>
+        <w:t>1. Identifier les problèmes explicitement mentionnés.</w:t>
+      </w:r>
     </w:p>
     <w:p>
       <w:pPr>
@@ -3185,7 +3385,7 @@
           <w:szCs w:val="28"/>
           <w:lang w:val="fr-SN"/>
         </w:rPr>
-        <w:t>Objectifs :</w:t>
+        <w:t>2. Regrouper les problèmes similaires.</w:t>
       </w:r>
     </w:p>
     <w:p>
@@ -3205,7 +3405,7 @@
           <w:szCs w:val="28"/>
           <w:lang w:val="fr-SN"/>
         </w:rPr>
-        <w:t>1. Identifier les problèmes explicitement mentionnés.</w:t>
+        <w:t>3. Compter le nombre d’avis associés à chaque problème.</w:t>
       </w:r>
     </w:p>
     <w:p>
@@ -3225,7 +3425,7 @@
           <w:szCs w:val="28"/>
           <w:lang w:val="fr-SN"/>
         </w:rPr>
-        <w:t>2. Regrouper les problèmes similaires.</w:t>
+        <w:t>4. Classer les problèmes par priorité.</w:t>
       </w:r>
     </w:p>
     <w:p>
@@ -3245,7 +3445,7 @@
           <w:szCs w:val="28"/>
           <w:lang w:val="fr-SN"/>
         </w:rPr>
-        <w:t>3. Compter le nombre d’avis associés à chaque problème.</w:t>
+        <w:t>5. Proposer une recommandation concrète pour chaque problème.</w:t>
       </w:r>
     </w:p>
     <w:p>
@@ -3258,15 +3458,6 @@
           <w:lang w:val="fr-SN"/>
         </w:rPr>
       </w:pPr>
-      <w:r>
-        <w:rPr>
-          <w:color w:val="000000" w:themeColor="text1"/>
-          <w:sz w:val="28"/>
-          <w:szCs w:val="28"/>
-          <w:lang w:val="fr-SN"/>
-        </w:rPr>
-        <w:t>4. Classer les problèmes par priorité.</w:t>
-      </w:r>
     </w:p>
     <w:p>
       <w:pPr>
@@ -3285,7 +3476,7 @@
           <w:szCs w:val="28"/>
           <w:lang w:val="fr-SN"/>
         </w:rPr>
-        <w:t>5. Proposer une recommandation concrète pour chaque problème.</w:t>
+        <w:t>Règles de priorité :</w:t>
       </w:r>
     </w:p>
     <w:p>
@@ -3298,6 +3489,15 @@
           <w:lang w:val="fr-SN"/>
         </w:rPr>
       </w:pPr>
+      <w:r>
+        <w:rPr>
+          <w:color w:val="000000" w:themeColor="text1"/>
+          <w:sz w:val="28"/>
+          <w:szCs w:val="28"/>
+          <w:lang w:val="fr-SN"/>
+        </w:rPr>
+        <w:t>- élevée : problème répété ou ayant un impact important ;</w:t>
+      </w:r>
     </w:p>
     <w:p>
       <w:pPr>
@@ -3316,7 +3516,7 @@
           <w:szCs w:val="28"/>
           <w:lang w:val="fr-SN"/>
         </w:rPr>
-        <w:t>Règles de priorité :</w:t>
+        <w:t>- moyenne : problème réel mais moins fréquent ou moins grave ;</w:t>
       </w:r>
     </w:p>
     <w:p>
@@ -3336,7 +3536,7 @@
           <w:szCs w:val="28"/>
           <w:lang w:val="fr-SN"/>
         </w:rPr>
-        <w:t>- élevée : problème répété ou ayant un impact important ;</w:t>
+        <w:t>- faible : problème ponctuel et limité.</w:t>
       </w:r>
     </w:p>
     <w:p>
@@ -3349,15 +3549,6 @@
           <w:lang w:val="fr-SN"/>
         </w:rPr>
       </w:pPr>
-      <w:r>
-        <w:rPr>
-          <w:color w:val="000000" w:themeColor="text1"/>
-          <w:sz w:val="28"/>
-          <w:szCs w:val="28"/>
-          <w:lang w:val="fr-SN"/>
-        </w:rPr>
-        <w:t>- moyenne : problème réel mais moins fréquent ou moins grave ;</w:t>
-      </w:r>
     </w:p>
     <w:p>
       <w:pPr>
@@ -3376,7 +3567,7 @@
           <w:szCs w:val="28"/>
           <w:lang w:val="fr-SN"/>
         </w:rPr>
-        <w:t>- faible : problème ponctuel et limité.</w:t>
+        <w:t>Contraintes :</w:t>
       </w:r>
     </w:p>
     <w:p>
@@ -3389,6 +3580,15 @@
           <w:lang w:val="fr-SN"/>
         </w:rPr>
       </w:pPr>
+      <w:r>
+        <w:rPr>
+          <w:color w:val="000000" w:themeColor="text1"/>
+          <w:sz w:val="28"/>
+          <w:szCs w:val="28"/>
+          <w:lang w:val="fr-SN"/>
+        </w:rPr>
+        <w:t>- Réponds avec un tableau.</w:t>
+      </w:r>
     </w:p>
     <w:p>
       <w:pPr>
@@ -3407,7 +3607,7 @@
           <w:szCs w:val="28"/>
           <w:lang w:val="fr-SN"/>
         </w:rPr>
-        <w:t>Contraintes :</w:t>
+        <w:t>- N’invente aucune information.</w:t>
       </w:r>
     </w:p>
     <w:p>
@@ -3427,7 +3627,7 @@
           <w:szCs w:val="28"/>
           <w:lang w:val="fr-SN"/>
         </w:rPr>
-        <w:t>- N’invente aucune information.</w:t>
+        <w:t>- Ne déduis pas la cause d’un problème si elle n’est pas écrite.</w:t>
       </w:r>
     </w:p>
     <w:p>
@@ -3447,7 +3647,7 @@
           <w:szCs w:val="28"/>
           <w:lang w:val="fr-SN"/>
         </w:rPr>
-        <w:t>- Ne déduis pas la cause d’un problème si elle n’est pas écrite.</w:t>
+        <w:t>- Ne retiens que les problèmes présents dans les avis.</w:t>
       </w:r>
     </w:p>
     <w:p>
@@ -3467,7 +3667,7 @@
           <w:szCs w:val="28"/>
           <w:lang w:val="fr-SN"/>
         </w:rPr>
-        <w:t>- Ne retiens que les problèmes présents dans les avis.</w:t>
+        <w:t>- Utilise uniquement les priorités : élevée, moyenne, faible.</w:t>
       </w:r>
     </w:p>
     <w:p>
@@ -3487,7 +3687,8 @@
           <w:szCs w:val="28"/>
           <w:lang w:val="fr-SN"/>
         </w:rPr>
-        <w:t>- Utilise uniquement les priorités : élevée, moyenne, faible.</w:t>
+        <w:lastRenderedPageBreak/>
+        <w:t>- Utilise exactement ces colonnes :</w:t>
       </w:r>
     </w:p>
     <w:p>
@@ -3507,7 +3708,7 @@
           <w:szCs w:val="28"/>
           <w:lang w:val="fr-SN"/>
         </w:rPr>
-        <w:t>- Réponds avec un tableau.</w:t>
+        <w:t xml:space="preserve">  Problème | Avis concernés | Fréquence | Priorité | Recommandation</w:t>
       </w:r>
     </w:p>
     <w:p>
@@ -3527,7 +3728,7 @@
           <w:szCs w:val="28"/>
           <w:lang w:val="fr-SN"/>
         </w:rPr>
-        <w:t>- Utilise exactement ces colonnes :</w:t>
+        <w:t>Avis à analyser :</w:t>
       </w:r>
     </w:p>
     <w:p>
@@ -3540,15 +3741,6 @@
           <w:lang w:val="fr-SN"/>
         </w:rPr>
       </w:pPr>
-      <w:r>
-        <w:rPr>
-          <w:color w:val="000000" w:themeColor="text1"/>
-          <w:sz w:val="28"/>
-          <w:szCs w:val="28"/>
-          <w:lang w:val="fr-SN"/>
-        </w:rPr>
-        <w:t xml:space="preserve">  Problème | Avis concernés | Fréquence | Priorité | Recommandation</w:t>
-      </w:r>
     </w:p>
     <w:p>
       <w:pPr>
@@ -3567,7 +3759,7 @@
           <w:szCs w:val="28"/>
           <w:lang w:val="fr-SN"/>
         </w:rPr>
-        <w:t>- Termine par une phrase indiquant la principale limite de l’analyse.</w:t>
+        <w:t>Avis 1 :</w:t>
       </w:r>
     </w:p>
     <w:p>
@@ -3580,6 +3772,15 @@
           <w:lang w:val="fr-SN"/>
         </w:rPr>
       </w:pPr>
+      <w:r>
+        <w:rPr>
+          <w:color w:val="000000" w:themeColor="text1"/>
+          <w:sz w:val="28"/>
+          <w:szCs w:val="28"/>
+          <w:lang w:val="fr-SN"/>
+        </w:rPr>
+        <w:t>« Le service client répond rapidement et le personnel est poli. »</w:t>
+      </w:r>
     </w:p>
     <w:p>
       <w:pPr>
@@ -3598,7 +3799,7 @@
           <w:szCs w:val="28"/>
           <w:lang w:val="fr-SN"/>
         </w:rPr>
-        <w:t>Avis à analyser :</w:t>
+        <w:t xml:space="preserve">     Avis 2 :</w:t>
       </w:r>
     </w:p>
     <w:p>
@@ -3611,6 +3812,15 @@
           <w:lang w:val="fr-SN"/>
         </w:rPr>
       </w:pPr>
+      <w:r>
+        <w:rPr>
+          <w:color w:val="000000" w:themeColor="text1"/>
+          <w:sz w:val="28"/>
+          <w:szCs w:val="28"/>
+          <w:lang w:val="fr-SN"/>
+        </w:rPr>
+        <w:t xml:space="preserve"> « La livraison est souvent en retard et le suivi de commande n’est pas mis à    jour. »</w:t>
+      </w:r>
     </w:p>
     <w:p>
       <w:pPr>
@@ -3629,7 +3839,7 @@
           <w:szCs w:val="28"/>
           <w:lang w:val="fr-SN"/>
         </w:rPr>
-        <w:t>Avis 1 :</w:t>
+        <w:t>Avis 3 :</w:t>
       </w:r>
     </w:p>
     <w:p>
@@ -3649,7 +3859,7 @@
           <w:szCs w:val="28"/>
           <w:lang w:val="fr-SN"/>
         </w:rPr>
-        <w:t>« Le service client répond rapidement et le personnel est poli. »</w:t>
+        <w:t>« La livraison est encore arrivée en retard. Le colis était cependant bien emballé. »</w:t>
       </w:r>
     </w:p>
     <w:p>
@@ -3662,206 +3872,4106 @@
           <w:lang w:val="fr-SN"/>
         </w:rPr>
       </w:pPr>
+      <w:r>
+        <w:rPr>
+          <w:color w:val="000000" w:themeColor="text1"/>
+          <w:sz w:val="28"/>
+          <w:szCs w:val="28"/>
+          <w:lang w:val="fr-SN"/>
+        </w:rPr>
+        <w:t>Avis 4 :</w:t>
+      </w:r>
     </w:p>
     <w:p>
       <w:pPr>
         <w:ind w:left="283"/>
         <w:rPr>
-          <w:color w:val="000000" w:themeColor="text1"/>
-          <w:sz w:val="28"/>
-          <w:szCs w:val="28"/>
-          <w:lang w:val="fr-SN"/>
-        </w:rPr>
-      </w:pPr>
-      <w:r>
-        <w:rPr>
-          <w:color w:val="000000" w:themeColor="text1"/>
-          <w:sz w:val="28"/>
-          <w:szCs w:val="28"/>
-          <w:lang w:val="fr-SN"/>
-        </w:rPr>
-        <w:t>Avis 2 :</w:t>
+          <w:color w:val="4472C4" w:themeColor="accent1"/>
+          <w:sz w:val="28"/>
+          <w:szCs w:val="28"/>
+          <w:lang w:val="fr-SN"/>
+        </w:rPr>
+      </w:pPr>
+      <w:r>
+        <w:rPr>
+          <w:color w:val="000000" w:themeColor="text1"/>
+          <w:sz w:val="28"/>
+          <w:szCs w:val="28"/>
+          <w:lang w:val="fr-SN"/>
+        </w:rPr>
+        <w:t xml:space="preserve">« L’application est difficile à utiliser et le service client ne répond toujours </w:t>
+      </w:r>
+      <w:proofErr w:type="gramStart"/>
+      <w:r>
+        <w:rPr>
+          <w:color w:val="000000" w:themeColor="text1"/>
+          <w:sz w:val="28"/>
+          <w:szCs w:val="28"/>
+          <w:lang w:val="fr-SN"/>
+        </w:rPr>
+        <w:t>pas»</w:t>
+      </w:r>
+      <w:r>
+        <w:rPr>
+          <w:color w:val="4472C4" w:themeColor="accent1"/>
+          <w:sz w:val="28"/>
+          <w:szCs w:val="28"/>
+          <w:lang w:val="fr-SN"/>
+        </w:rPr>
+        <w:t>`</w:t>
+      </w:r>
+      <w:proofErr w:type="gramEnd"/>
+      <w:r>
+        <w:rPr>
+          <w:color w:val="4472C4" w:themeColor="accent1"/>
+          <w:sz w:val="28"/>
+          <w:szCs w:val="28"/>
+          <w:lang w:val="fr-SN"/>
+        </w:rPr>
+        <w:t>``</w:t>
       </w:r>
     </w:p>
     <w:p>
       <w:pPr>
         <w:ind w:left="283"/>
         <w:rPr>
-          <w:color w:val="000000" w:themeColor="text1"/>
-          <w:sz w:val="28"/>
-          <w:szCs w:val="28"/>
-          <w:lang w:val="fr-SN"/>
-        </w:rPr>
-      </w:pPr>
-      <w:r>
-        <w:rPr>
-          <w:color w:val="000000" w:themeColor="text1"/>
-          <w:sz w:val="28"/>
-          <w:szCs w:val="28"/>
-          <w:lang w:val="fr-SN"/>
-        </w:rPr>
-        <w:t>« La livraison est souvent en retard et le suivi de commande n’est pas mis à jour. »</w:t>
+          <w:b/>
+          <w:bCs/>
+          <w:color w:val="4472C4" w:themeColor="accent1"/>
+          <w:sz w:val="28"/>
+          <w:szCs w:val="28"/>
+          <w:lang w:val="fr-SN"/>
+        </w:rPr>
+      </w:pPr>
+      <w:r>
+        <w:rPr>
+          <w:b/>
+          <w:bCs/>
+          <w:color w:val="4472C4" w:themeColor="accent1"/>
+          <w:sz w:val="28"/>
+          <w:szCs w:val="28"/>
+          <w:lang w:val="fr-SN"/>
+        </w:rPr>
+        <w:t>Réponse</w:t>
+      </w:r>
+      <w:r>
+        <w:rPr>
+          <w:b/>
+          <w:bCs/>
+          <w:color w:val="4472C4" w:themeColor="accent1"/>
+          <w:sz w:val="28"/>
+          <w:szCs w:val="28"/>
+          <w:lang w:val="fr-SN"/>
+        </w:rPr>
+        <w:t xml:space="preserve"> du LLM : </w:t>
       </w:r>
     </w:p>
     <w:p>
       <w:pPr>
         <w:ind w:left="283"/>
         <w:rPr>
-          <w:color w:val="000000" w:themeColor="text1"/>
-          <w:sz w:val="28"/>
-          <w:szCs w:val="28"/>
-          <w:lang w:val="fr-SN"/>
-        </w:rPr>
-      </w:pPr>
-    </w:p>
-    <w:p>
-      <w:pPr>
-        <w:ind w:left="283"/>
-        <w:rPr>
-          <w:color w:val="000000" w:themeColor="text1"/>
-          <w:sz w:val="28"/>
-          <w:szCs w:val="28"/>
-          <w:lang w:val="fr-SN"/>
-        </w:rPr>
-      </w:pPr>
-      <w:r>
-        <w:rPr>
-          <w:color w:val="000000" w:themeColor="text1"/>
-          <w:sz w:val="28"/>
-          <w:szCs w:val="28"/>
-          <w:lang w:val="fr-SN"/>
-        </w:rPr>
-        <w:t>Avis 3 :</w:t>
-      </w:r>
-    </w:p>
-    <w:p>
-      <w:pPr>
-        <w:ind w:left="283"/>
-        <w:rPr>
-          <w:color w:val="000000" w:themeColor="text1"/>
-          <w:sz w:val="28"/>
-          <w:szCs w:val="28"/>
-          <w:lang w:val="fr-SN"/>
-        </w:rPr>
-      </w:pPr>
-      <w:r>
-        <w:rPr>
-          <w:color w:val="000000" w:themeColor="text1"/>
-          <w:sz w:val="28"/>
-          <w:szCs w:val="28"/>
-          <w:lang w:val="fr-SN"/>
-        </w:rPr>
-        <w:t>« Le produit est de bonne qualité, mais l’application plante régulièrement. »</w:t>
-      </w:r>
-    </w:p>
-    <w:p>
-      <w:pPr>
-        <w:ind w:left="283"/>
-        <w:rPr>
-          <w:color w:val="000000" w:themeColor="text1"/>
-          <w:sz w:val="28"/>
-          <w:szCs w:val="28"/>
-          <w:lang w:val="fr-SN"/>
-        </w:rPr>
-      </w:pPr>
-    </w:p>
-    <w:p>
-      <w:pPr>
-        <w:ind w:left="283"/>
-        <w:rPr>
-          <w:color w:val="000000" w:themeColor="text1"/>
-          <w:sz w:val="28"/>
-          <w:szCs w:val="28"/>
-          <w:lang w:val="fr-SN"/>
-        </w:rPr>
-      </w:pPr>
-      <w:r>
-        <w:rPr>
-          <w:color w:val="000000" w:themeColor="text1"/>
-          <w:sz w:val="28"/>
-          <w:szCs w:val="28"/>
-          <w:lang w:val="fr-SN"/>
-        </w:rPr>
-        <w:t>Avis 4 :</w:t>
-      </w:r>
-    </w:p>
-    <w:p>
-      <w:pPr>
-        <w:ind w:left="283"/>
-        <w:rPr>
-          <w:color w:val="000000" w:themeColor="text1"/>
-          <w:sz w:val="28"/>
-          <w:szCs w:val="28"/>
-          <w:lang w:val="fr-SN"/>
-        </w:rPr>
-      </w:pPr>
-      <w:r>
-        <w:rPr>
-          <w:color w:val="000000" w:themeColor="text1"/>
-          <w:sz w:val="28"/>
-          <w:szCs w:val="28"/>
-          <w:lang w:val="fr-SN"/>
-        </w:rPr>
-        <w:t>« La livraison est encore arrivée en retard. Le colis était cependant bien emballé. »</w:t>
-      </w:r>
-    </w:p>
-    <w:p>
-      <w:pPr>
-        <w:ind w:left="283"/>
-        <w:rPr>
-          <w:color w:val="000000" w:themeColor="text1"/>
-          <w:sz w:val="28"/>
-          <w:szCs w:val="28"/>
-          <w:lang w:val="fr-SN"/>
-        </w:rPr>
-      </w:pPr>
-    </w:p>
-    <w:p>
-      <w:pPr>
-        <w:ind w:left="283"/>
-        <w:rPr>
-          <w:color w:val="000000" w:themeColor="text1"/>
-          <w:sz w:val="28"/>
-          <w:szCs w:val="28"/>
-          <w:lang w:val="fr-SN"/>
-        </w:rPr>
-      </w:pPr>
-      <w:r>
-        <w:rPr>
-          <w:color w:val="000000" w:themeColor="text1"/>
-          <w:sz w:val="28"/>
-          <w:szCs w:val="28"/>
-          <w:lang w:val="fr-SN"/>
-        </w:rPr>
-        <w:t>Avis 5 :</w:t>
-      </w:r>
-    </w:p>
-    <w:p>
-      <w:pPr>
-        <w:ind w:left="283"/>
-        <w:rPr>
-          <w:color w:val="000000" w:themeColor="text1"/>
-          <w:sz w:val="28"/>
-          <w:szCs w:val="28"/>
-          <w:lang w:val="fr-SN"/>
-        </w:rPr>
-      </w:pPr>
-      <w:r>
-        <w:rPr>
-          <w:color w:val="000000" w:themeColor="text1"/>
-          <w:sz w:val="28"/>
-          <w:szCs w:val="28"/>
-          <w:lang w:val="fr-SN"/>
-        </w:rPr>
-        <w:t>« L’application est difficile à utiliser et le service client ne répond pas toujours. »</w:t>
-      </w:r>
-    </w:p>
-    <w:p>
-      <w:pPr>
-        <w:rPr>
-          <w:color w:val="000000" w:themeColor="text1"/>
-          <w:sz w:val="28"/>
-          <w:szCs w:val="28"/>
+          <w:b/>
+          <w:bCs/>
+          <w:color w:val="4472C4" w:themeColor="accent1"/>
+          <w:sz w:val="28"/>
+          <w:szCs w:val="28"/>
+          <w:lang w:val="fr-SN"/>
+        </w:rPr>
+      </w:pPr>
+    </w:p>
+    <w:tbl>
+      <w:tblPr>
+        <w:tblW w:w="5000" w:type="pct"/>
+        <w:tblCellMar>
+          <w:top w:w="15" w:type="dxa"/>
+          <w:left w:w="15" w:type="dxa"/>
+          <w:bottom w:w="15" w:type="dxa"/>
+          <w:right w:w="15" w:type="dxa"/>
+        </w:tblCellMar>
+        <w:tblLook w:val="04A0" w:firstRow="1" w:lastRow="0" w:firstColumn="1" w:lastColumn="0" w:noHBand="0" w:noVBand="1"/>
+      </w:tblPr>
+      <w:tblGrid>
+        <w:gridCol w:w="2081"/>
+        <w:gridCol w:w="1421"/>
+        <w:gridCol w:w="1392"/>
+        <w:gridCol w:w="1301"/>
+        <w:gridCol w:w="2861"/>
+      </w:tblGrid>
+      <w:tr>
+        <w:trPr>
+          <w:tblHeader/>
+        </w:trPr>
+        <w:tc>
+          <w:tcPr>
+            <w:tcW w:w="0" w:type="auto"/>
+            <w:tcBorders>
+              <w:top w:val="single" w:sz="6" w:space="0" w:color="DDDDDD"/>
+              <w:left w:val="single" w:sz="6" w:space="0" w:color="DDDDDD"/>
+              <w:bottom w:val="single" w:sz="6" w:space="0" w:color="DDDDDD"/>
+              <w:right w:val="single" w:sz="6" w:space="0" w:color="DDDDDD"/>
+            </w:tcBorders>
+            <w:shd w:val="clear" w:color="auto" w:fill="F2F2F2"/>
+            <w:tcMar>
+              <w:top w:w="120" w:type="dxa"/>
+              <w:left w:w="120" w:type="dxa"/>
+              <w:bottom w:w="120" w:type="dxa"/>
+              <w:right w:w="120" w:type="dxa"/>
+            </w:tcMar>
+            <w:vAlign w:val="center"/>
+            <w:hideMark/>
+          </w:tcPr>
+          <w:p>
+            <w:pPr>
+              <w:ind w:left="283"/>
+              <w:rPr>
+                <w:b/>
+                <w:bCs/>
+                <w:color w:val="4472C4" w:themeColor="accent1"/>
+                <w:sz w:val="20"/>
+                <w:szCs w:val="20"/>
+                <w:lang w:val="fr-SN"/>
+              </w:rPr>
+            </w:pPr>
+            <w:r>
+              <w:rPr>
+                <w:b/>
+                <w:bCs/>
+                <w:color w:val="4472C4" w:themeColor="accent1"/>
+                <w:sz w:val="20"/>
+                <w:szCs w:val="20"/>
+                <w:lang w:val="fr-SN"/>
+              </w:rPr>
+              <w:t>Problème</w:t>
+            </w:r>
+          </w:p>
+        </w:tc>
+        <w:tc>
+          <w:tcPr>
+            <w:tcW w:w="0" w:type="auto"/>
+            <w:tcBorders>
+              <w:top w:val="single" w:sz="6" w:space="0" w:color="DDDDDD"/>
+              <w:left w:val="single" w:sz="6" w:space="0" w:color="DDDDDD"/>
+              <w:bottom w:val="single" w:sz="6" w:space="0" w:color="DDDDDD"/>
+              <w:right w:val="single" w:sz="6" w:space="0" w:color="DDDDDD"/>
+            </w:tcBorders>
+            <w:shd w:val="clear" w:color="auto" w:fill="F2F2F2"/>
+            <w:tcMar>
+              <w:top w:w="120" w:type="dxa"/>
+              <w:left w:w="120" w:type="dxa"/>
+              <w:bottom w:w="120" w:type="dxa"/>
+              <w:right w:w="120" w:type="dxa"/>
+            </w:tcMar>
+            <w:vAlign w:val="center"/>
+            <w:hideMark/>
+          </w:tcPr>
+          <w:p>
+            <w:pPr>
+              <w:ind w:left="283"/>
+              <w:rPr>
+                <w:b/>
+                <w:bCs/>
+                <w:color w:val="4472C4" w:themeColor="accent1"/>
+                <w:sz w:val="20"/>
+                <w:szCs w:val="20"/>
+                <w:lang w:val="fr-SN"/>
+              </w:rPr>
+            </w:pPr>
+            <w:r>
+              <w:rPr>
+                <w:b/>
+                <w:bCs/>
+                <w:color w:val="4472C4" w:themeColor="accent1"/>
+                <w:sz w:val="20"/>
+                <w:szCs w:val="20"/>
+                <w:lang w:val="fr-SN"/>
+              </w:rPr>
+              <w:t>Avis concernés</w:t>
+            </w:r>
+          </w:p>
+        </w:tc>
+        <w:tc>
+          <w:tcPr>
+            <w:tcW w:w="0" w:type="auto"/>
+            <w:tcBorders>
+              <w:top w:val="single" w:sz="6" w:space="0" w:color="DDDDDD"/>
+              <w:left w:val="single" w:sz="6" w:space="0" w:color="DDDDDD"/>
+              <w:bottom w:val="single" w:sz="6" w:space="0" w:color="DDDDDD"/>
+              <w:right w:val="single" w:sz="6" w:space="0" w:color="DDDDDD"/>
+            </w:tcBorders>
+            <w:shd w:val="clear" w:color="auto" w:fill="F2F2F2"/>
+            <w:tcMar>
+              <w:top w:w="120" w:type="dxa"/>
+              <w:left w:w="120" w:type="dxa"/>
+              <w:bottom w:w="120" w:type="dxa"/>
+              <w:right w:w="120" w:type="dxa"/>
+            </w:tcMar>
+            <w:vAlign w:val="center"/>
+            <w:hideMark/>
+          </w:tcPr>
+          <w:p>
+            <w:pPr>
+              <w:ind w:left="283"/>
+              <w:rPr>
+                <w:b/>
+                <w:bCs/>
+                <w:color w:val="4472C4" w:themeColor="accent1"/>
+                <w:sz w:val="20"/>
+                <w:szCs w:val="20"/>
+                <w:lang w:val="fr-SN"/>
+              </w:rPr>
+            </w:pPr>
+            <w:r>
+              <w:rPr>
+                <w:b/>
+                <w:bCs/>
+                <w:color w:val="4472C4" w:themeColor="accent1"/>
+                <w:sz w:val="20"/>
+                <w:szCs w:val="20"/>
+                <w:lang w:val="fr-SN"/>
+              </w:rPr>
+              <w:t>Fréquence</w:t>
+            </w:r>
+          </w:p>
+        </w:tc>
+        <w:tc>
+          <w:tcPr>
+            <w:tcW w:w="0" w:type="auto"/>
+            <w:tcBorders>
+              <w:top w:val="single" w:sz="6" w:space="0" w:color="DDDDDD"/>
+              <w:left w:val="single" w:sz="6" w:space="0" w:color="DDDDDD"/>
+              <w:bottom w:val="single" w:sz="6" w:space="0" w:color="DDDDDD"/>
+              <w:right w:val="single" w:sz="6" w:space="0" w:color="DDDDDD"/>
+            </w:tcBorders>
+            <w:shd w:val="clear" w:color="auto" w:fill="F2F2F2"/>
+            <w:tcMar>
+              <w:top w:w="120" w:type="dxa"/>
+              <w:left w:w="120" w:type="dxa"/>
+              <w:bottom w:w="120" w:type="dxa"/>
+              <w:right w:w="120" w:type="dxa"/>
+            </w:tcMar>
+            <w:vAlign w:val="center"/>
+            <w:hideMark/>
+          </w:tcPr>
+          <w:p>
+            <w:pPr>
+              <w:ind w:left="283"/>
+              <w:rPr>
+                <w:b/>
+                <w:bCs/>
+                <w:color w:val="4472C4" w:themeColor="accent1"/>
+                <w:sz w:val="20"/>
+                <w:szCs w:val="20"/>
+                <w:lang w:val="fr-SN"/>
+              </w:rPr>
+            </w:pPr>
+            <w:r>
+              <w:rPr>
+                <w:b/>
+                <w:bCs/>
+                <w:color w:val="4472C4" w:themeColor="accent1"/>
+                <w:sz w:val="20"/>
+                <w:szCs w:val="20"/>
+                <w:lang w:val="fr-SN"/>
+              </w:rPr>
+              <w:t>Priorité</w:t>
+            </w:r>
+          </w:p>
+        </w:tc>
+        <w:tc>
+          <w:tcPr>
+            <w:tcW w:w="0" w:type="auto"/>
+            <w:tcBorders>
+              <w:top w:val="single" w:sz="6" w:space="0" w:color="DDDDDD"/>
+              <w:left w:val="single" w:sz="6" w:space="0" w:color="DDDDDD"/>
+              <w:bottom w:val="single" w:sz="6" w:space="0" w:color="DDDDDD"/>
+              <w:right w:val="single" w:sz="6" w:space="0" w:color="DDDDDD"/>
+            </w:tcBorders>
+            <w:shd w:val="clear" w:color="auto" w:fill="F2F2F2"/>
+            <w:tcMar>
+              <w:top w:w="120" w:type="dxa"/>
+              <w:left w:w="120" w:type="dxa"/>
+              <w:bottom w:w="120" w:type="dxa"/>
+              <w:right w:w="120" w:type="dxa"/>
+            </w:tcMar>
+            <w:vAlign w:val="center"/>
+            <w:hideMark/>
+          </w:tcPr>
+          <w:p>
+            <w:pPr>
+              <w:ind w:left="283"/>
+              <w:rPr>
+                <w:b/>
+                <w:bCs/>
+                <w:color w:val="4472C4" w:themeColor="accent1"/>
+                <w:sz w:val="20"/>
+                <w:szCs w:val="20"/>
+                <w:lang w:val="fr-SN"/>
+              </w:rPr>
+            </w:pPr>
+            <w:r>
+              <w:rPr>
+                <w:b/>
+                <w:bCs/>
+                <w:color w:val="4472C4" w:themeColor="accent1"/>
+                <w:sz w:val="20"/>
+                <w:szCs w:val="20"/>
+                <w:lang w:val="fr-SN"/>
+              </w:rPr>
+              <w:t>Recommandation</w:t>
+            </w:r>
+          </w:p>
+        </w:tc>
+      </w:tr>
+      <w:tr>
+        <w:tc>
+          <w:tcPr>
+            <w:tcW w:w="0" w:type="auto"/>
+            <w:tcBorders>
+              <w:top w:val="single" w:sz="6" w:space="0" w:color="DDDDDD"/>
+              <w:left w:val="single" w:sz="6" w:space="0" w:color="DDDDDD"/>
+              <w:bottom w:val="single" w:sz="6" w:space="0" w:color="DDDDDD"/>
+              <w:right w:val="single" w:sz="6" w:space="0" w:color="DDDDDD"/>
+            </w:tcBorders>
+            <w:tcMar>
+              <w:top w:w="120" w:type="dxa"/>
+              <w:left w:w="120" w:type="dxa"/>
+              <w:bottom w:w="120" w:type="dxa"/>
+              <w:right w:w="120" w:type="dxa"/>
+            </w:tcMar>
+            <w:vAlign w:val="center"/>
+            <w:hideMark/>
+          </w:tcPr>
+          <w:p>
+            <w:pPr>
+              <w:ind w:left="283"/>
+              <w:rPr>
+                <w:b/>
+                <w:bCs/>
+                <w:color w:val="4472C4" w:themeColor="accent1"/>
+                <w:sz w:val="20"/>
+                <w:szCs w:val="20"/>
+                <w:lang w:val="fr-SN"/>
+              </w:rPr>
+            </w:pPr>
+            <w:r>
+              <w:rPr>
+                <w:b/>
+                <w:bCs/>
+                <w:color w:val="4472C4" w:themeColor="accent1"/>
+                <w:sz w:val="20"/>
+                <w:szCs w:val="20"/>
+                <w:lang w:val="fr-SN"/>
+              </w:rPr>
+              <w:t>Livraison en retard</w:t>
+            </w:r>
+          </w:p>
+        </w:tc>
+        <w:tc>
+          <w:tcPr>
+            <w:tcW w:w="0" w:type="auto"/>
+            <w:tcBorders>
+              <w:top w:val="single" w:sz="6" w:space="0" w:color="DDDDDD"/>
+              <w:left w:val="single" w:sz="6" w:space="0" w:color="DDDDDD"/>
+              <w:bottom w:val="single" w:sz="6" w:space="0" w:color="DDDDDD"/>
+              <w:right w:val="single" w:sz="6" w:space="0" w:color="DDDDDD"/>
+            </w:tcBorders>
+            <w:tcMar>
+              <w:top w:w="120" w:type="dxa"/>
+              <w:left w:w="120" w:type="dxa"/>
+              <w:bottom w:w="120" w:type="dxa"/>
+              <w:right w:w="120" w:type="dxa"/>
+            </w:tcMar>
+            <w:vAlign w:val="center"/>
+            <w:hideMark/>
+          </w:tcPr>
+          <w:p>
+            <w:pPr>
+              <w:ind w:left="283"/>
+              <w:rPr>
+                <w:b/>
+                <w:bCs/>
+                <w:color w:val="4472C4" w:themeColor="accent1"/>
+                <w:sz w:val="20"/>
+                <w:szCs w:val="20"/>
+                <w:lang w:val="fr-SN"/>
+              </w:rPr>
+            </w:pPr>
+            <w:r>
+              <w:rPr>
+                <w:b/>
+                <w:bCs/>
+                <w:color w:val="4472C4" w:themeColor="accent1"/>
+                <w:sz w:val="20"/>
+                <w:szCs w:val="20"/>
+                <w:lang w:val="fr-SN"/>
+              </w:rPr>
+              <w:t>Avis 2, Avis 3</w:t>
+            </w:r>
+          </w:p>
+        </w:tc>
+        <w:tc>
+          <w:tcPr>
+            <w:tcW w:w="0" w:type="auto"/>
+            <w:tcBorders>
+              <w:top w:val="single" w:sz="6" w:space="0" w:color="DDDDDD"/>
+              <w:left w:val="single" w:sz="6" w:space="0" w:color="DDDDDD"/>
+              <w:bottom w:val="single" w:sz="6" w:space="0" w:color="DDDDDD"/>
+              <w:right w:val="single" w:sz="6" w:space="0" w:color="DDDDDD"/>
+            </w:tcBorders>
+            <w:tcMar>
+              <w:top w:w="120" w:type="dxa"/>
+              <w:left w:w="120" w:type="dxa"/>
+              <w:bottom w:w="120" w:type="dxa"/>
+              <w:right w:w="120" w:type="dxa"/>
+            </w:tcMar>
+            <w:vAlign w:val="center"/>
+            <w:hideMark/>
+          </w:tcPr>
+          <w:p>
+            <w:pPr>
+              <w:ind w:left="283"/>
+              <w:rPr>
+                <w:b/>
+                <w:bCs/>
+                <w:color w:val="4472C4" w:themeColor="accent1"/>
+                <w:sz w:val="20"/>
+                <w:szCs w:val="20"/>
+                <w:lang w:val="fr-SN"/>
+              </w:rPr>
+            </w:pPr>
+            <w:r>
+              <w:rPr>
+                <w:b/>
+                <w:bCs/>
+                <w:color w:val="4472C4" w:themeColor="accent1"/>
+                <w:sz w:val="20"/>
+                <w:szCs w:val="20"/>
+                <w:lang w:val="fr-SN"/>
+              </w:rPr>
+              <w:t>2 avis</w:t>
+            </w:r>
+          </w:p>
+        </w:tc>
+        <w:tc>
+          <w:tcPr>
+            <w:tcW w:w="0" w:type="auto"/>
+            <w:tcBorders>
+              <w:top w:val="single" w:sz="6" w:space="0" w:color="DDDDDD"/>
+              <w:left w:val="single" w:sz="6" w:space="0" w:color="DDDDDD"/>
+              <w:bottom w:val="single" w:sz="6" w:space="0" w:color="DDDDDD"/>
+              <w:right w:val="single" w:sz="6" w:space="0" w:color="DDDDDD"/>
+            </w:tcBorders>
+            <w:tcMar>
+              <w:top w:w="120" w:type="dxa"/>
+              <w:left w:w="120" w:type="dxa"/>
+              <w:bottom w:w="120" w:type="dxa"/>
+              <w:right w:w="120" w:type="dxa"/>
+            </w:tcMar>
+            <w:vAlign w:val="center"/>
+            <w:hideMark/>
+          </w:tcPr>
+          <w:p>
+            <w:pPr>
+              <w:ind w:left="283"/>
+              <w:rPr>
+                <w:b/>
+                <w:bCs/>
+                <w:color w:val="4472C4" w:themeColor="accent1"/>
+                <w:sz w:val="20"/>
+                <w:szCs w:val="20"/>
+                <w:lang w:val="fr-SN"/>
+              </w:rPr>
+            </w:pPr>
+            <w:proofErr w:type="gramStart"/>
+            <w:r>
+              <w:rPr>
+                <w:b/>
+                <w:bCs/>
+                <w:color w:val="4472C4" w:themeColor="accent1"/>
+                <w:sz w:val="20"/>
+                <w:szCs w:val="20"/>
+                <w:lang w:val="fr-SN"/>
+              </w:rPr>
+              <w:t>élevée</w:t>
+            </w:r>
+            <w:proofErr w:type="gramEnd"/>
+          </w:p>
+        </w:tc>
+        <w:tc>
+          <w:tcPr>
+            <w:tcW w:w="0" w:type="auto"/>
+            <w:tcBorders>
+              <w:top w:val="single" w:sz="6" w:space="0" w:color="DDDDDD"/>
+              <w:left w:val="single" w:sz="6" w:space="0" w:color="DDDDDD"/>
+              <w:bottom w:val="single" w:sz="6" w:space="0" w:color="DDDDDD"/>
+              <w:right w:val="single" w:sz="6" w:space="0" w:color="DDDDDD"/>
+            </w:tcBorders>
+            <w:tcMar>
+              <w:top w:w="120" w:type="dxa"/>
+              <w:left w:w="120" w:type="dxa"/>
+              <w:bottom w:w="120" w:type="dxa"/>
+              <w:right w:w="120" w:type="dxa"/>
+            </w:tcMar>
+            <w:vAlign w:val="center"/>
+            <w:hideMark/>
+          </w:tcPr>
+          <w:p>
+            <w:pPr>
+              <w:ind w:left="283"/>
+              <w:rPr>
+                <w:b/>
+                <w:bCs/>
+                <w:color w:val="4472C4" w:themeColor="accent1"/>
+                <w:sz w:val="20"/>
+                <w:szCs w:val="20"/>
+                <w:lang w:val="fr-SN"/>
+              </w:rPr>
+            </w:pPr>
+            <w:r>
+              <w:rPr>
+                <w:b/>
+                <w:bCs/>
+                <w:color w:val="4472C4" w:themeColor="accent1"/>
+                <w:sz w:val="20"/>
+                <w:szCs w:val="20"/>
+                <w:lang w:val="fr-SN"/>
+              </w:rPr>
+              <w:t>Renforcer la planification logistique et communiquer proactivement en cas de retard.</w:t>
+            </w:r>
+          </w:p>
+        </w:tc>
+      </w:tr>
+      <w:tr>
+        <w:tc>
+          <w:tcPr>
+            <w:tcW w:w="0" w:type="auto"/>
+            <w:tcBorders>
+              <w:top w:val="single" w:sz="6" w:space="0" w:color="DDDDDD"/>
+              <w:left w:val="single" w:sz="6" w:space="0" w:color="DDDDDD"/>
+              <w:bottom w:val="single" w:sz="6" w:space="0" w:color="DDDDDD"/>
+              <w:right w:val="single" w:sz="6" w:space="0" w:color="DDDDDD"/>
+            </w:tcBorders>
+            <w:tcMar>
+              <w:top w:w="120" w:type="dxa"/>
+              <w:left w:w="120" w:type="dxa"/>
+              <w:bottom w:w="120" w:type="dxa"/>
+              <w:right w:w="120" w:type="dxa"/>
+            </w:tcMar>
+            <w:vAlign w:val="center"/>
+            <w:hideMark/>
+          </w:tcPr>
+          <w:p>
+            <w:pPr>
+              <w:ind w:left="283"/>
+              <w:rPr>
+                <w:b/>
+                <w:bCs/>
+                <w:color w:val="4472C4" w:themeColor="accent1"/>
+                <w:sz w:val="20"/>
+                <w:szCs w:val="20"/>
+                <w:lang w:val="fr-SN"/>
+              </w:rPr>
+            </w:pPr>
+            <w:r>
+              <w:rPr>
+                <w:b/>
+                <w:bCs/>
+                <w:color w:val="4472C4" w:themeColor="accent1"/>
+                <w:sz w:val="20"/>
+                <w:szCs w:val="20"/>
+                <w:lang w:val="fr-SN"/>
+              </w:rPr>
+              <w:t>Suivi de commande non mis à jour</w:t>
+            </w:r>
+          </w:p>
+        </w:tc>
+        <w:tc>
+          <w:tcPr>
+            <w:tcW w:w="0" w:type="auto"/>
+            <w:tcBorders>
+              <w:top w:val="single" w:sz="6" w:space="0" w:color="DDDDDD"/>
+              <w:left w:val="single" w:sz="6" w:space="0" w:color="DDDDDD"/>
+              <w:bottom w:val="single" w:sz="6" w:space="0" w:color="DDDDDD"/>
+              <w:right w:val="single" w:sz="6" w:space="0" w:color="DDDDDD"/>
+            </w:tcBorders>
+            <w:tcMar>
+              <w:top w:w="120" w:type="dxa"/>
+              <w:left w:w="120" w:type="dxa"/>
+              <w:bottom w:w="120" w:type="dxa"/>
+              <w:right w:w="120" w:type="dxa"/>
+            </w:tcMar>
+            <w:vAlign w:val="center"/>
+            <w:hideMark/>
+          </w:tcPr>
+          <w:p>
+            <w:pPr>
+              <w:ind w:left="283"/>
+              <w:rPr>
+                <w:b/>
+                <w:bCs/>
+                <w:color w:val="4472C4" w:themeColor="accent1"/>
+                <w:sz w:val="20"/>
+                <w:szCs w:val="20"/>
+                <w:lang w:val="fr-SN"/>
+              </w:rPr>
+            </w:pPr>
+            <w:r>
+              <w:rPr>
+                <w:b/>
+                <w:bCs/>
+                <w:color w:val="4472C4" w:themeColor="accent1"/>
+                <w:sz w:val="20"/>
+                <w:szCs w:val="20"/>
+                <w:lang w:val="fr-SN"/>
+              </w:rPr>
+              <w:t>Avis 2</w:t>
+            </w:r>
+          </w:p>
+        </w:tc>
+        <w:tc>
+          <w:tcPr>
+            <w:tcW w:w="0" w:type="auto"/>
+            <w:tcBorders>
+              <w:top w:val="single" w:sz="6" w:space="0" w:color="DDDDDD"/>
+              <w:left w:val="single" w:sz="6" w:space="0" w:color="DDDDDD"/>
+              <w:bottom w:val="single" w:sz="6" w:space="0" w:color="DDDDDD"/>
+              <w:right w:val="single" w:sz="6" w:space="0" w:color="DDDDDD"/>
+            </w:tcBorders>
+            <w:tcMar>
+              <w:top w:w="120" w:type="dxa"/>
+              <w:left w:w="120" w:type="dxa"/>
+              <w:bottom w:w="120" w:type="dxa"/>
+              <w:right w:w="120" w:type="dxa"/>
+            </w:tcMar>
+            <w:vAlign w:val="center"/>
+            <w:hideMark/>
+          </w:tcPr>
+          <w:p>
+            <w:pPr>
+              <w:ind w:left="283"/>
+              <w:rPr>
+                <w:b/>
+                <w:bCs/>
+                <w:color w:val="4472C4" w:themeColor="accent1"/>
+                <w:sz w:val="20"/>
+                <w:szCs w:val="20"/>
+                <w:lang w:val="fr-SN"/>
+              </w:rPr>
+            </w:pPr>
+            <w:r>
+              <w:rPr>
+                <w:b/>
+                <w:bCs/>
+                <w:color w:val="4472C4" w:themeColor="accent1"/>
+                <w:sz w:val="20"/>
+                <w:szCs w:val="20"/>
+                <w:lang w:val="fr-SN"/>
+              </w:rPr>
+              <w:t>1 avis</w:t>
+            </w:r>
+          </w:p>
+        </w:tc>
+        <w:tc>
+          <w:tcPr>
+            <w:tcW w:w="0" w:type="auto"/>
+            <w:tcBorders>
+              <w:top w:val="single" w:sz="6" w:space="0" w:color="DDDDDD"/>
+              <w:left w:val="single" w:sz="6" w:space="0" w:color="DDDDDD"/>
+              <w:bottom w:val="single" w:sz="6" w:space="0" w:color="DDDDDD"/>
+              <w:right w:val="single" w:sz="6" w:space="0" w:color="DDDDDD"/>
+            </w:tcBorders>
+            <w:tcMar>
+              <w:top w:w="120" w:type="dxa"/>
+              <w:left w:w="120" w:type="dxa"/>
+              <w:bottom w:w="120" w:type="dxa"/>
+              <w:right w:w="120" w:type="dxa"/>
+            </w:tcMar>
+            <w:vAlign w:val="center"/>
+            <w:hideMark/>
+          </w:tcPr>
+          <w:p>
+            <w:pPr>
+              <w:ind w:left="283"/>
+              <w:rPr>
+                <w:b/>
+                <w:bCs/>
+                <w:color w:val="4472C4" w:themeColor="accent1"/>
+                <w:sz w:val="20"/>
+                <w:szCs w:val="20"/>
+                <w:lang w:val="fr-SN"/>
+              </w:rPr>
+            </w:pPr>
+            <w:proofErr w:type="gramStart"/>
+            <w:r>
+              <w:rPr>
+                <w:b/>
+                <w:bCs/>
+                <w:color w:val="4472C4" w:themeColor="accent1"/>
+                <w:sz w:val="20"/>
+                <w:szCs w:val="20"/>
+                <w:lang w:val="fr-SN"/>
+              </w:rPr>
+              <w:t>moyenne</w:t>
+            </w:r>
+            <w:proofErr w:type="gramEnd"/>
+          </w:p>
+        </w:tc>
+        <w:tc>
+          <w:tcPr>
+            <w:tcW w:w="0" w:type="auto"/>
+            <w:tcBorders>
+              <w:top w:val="single" w:sz="6" w:space="0" w:color="DDDDDD"/>
+              <w:left w:val="single" w:sz="6" w:space="0" w:color="DDDDDD"/>
+              <w:bottom w:val="single" w:sz="6" w:space="0" w:color="DDDDDD"/>
+              <w:right w:val="single" w:sz="6" w:space="0" w:color="DDDDDD"/>
+            </w:tcBorders>
+            <w:tcMar>
+              <w:top w:w="120" w:type="dxa"/>
+              <w:left w:w="120" w:type="dxa"/>
+              <w:bottom w:w="120" w:type="dxa"/>
+              <w:right w:w="120" w:type="dxa"/>
+            </w:tcMar>
+            <w:vAlign w:val="center"/>
+            <w:hideMark/>
+          </w:tcPr>
+          <w:p>
+            <w:pPr>
+              <w:ind w:left="283"/>
+              <w:rPr>
+                <w:b/>
+                <w:bCs/>
+                <w:color w:val="4472C4" w:themeColor="accent1"/>
+                <w:sz w:val="20"/>
+                <w:szCs w:val="20"/>
+                <w:lang w:val="fr-SN"/>
+              </w:rPr>
+            </w:pPr>
+            <w:r>
+              <w:rPr>
+                <w:b/>
+                <w:bCs/>
+                <w:color w:val="4472C4" w:themeColor="accent1"/>
+                <w:sz w:val="20"/>
+                <w:szCs w:val="20"/>
+                <w:lang w:val="fr-SN"/>
+              </w:rPr>
+              <w:t>Mettre en place une mise à jour automatique et fiable du statut de livraison.</w:t>
+            </w:r>
+          </w:p>
+        </w:tc>
+      </w:tr>
+      <w:tr>
+        <w:tc>
+          <w:tcPr>
+            <w:tcW w:w="0" w:type="auto"/>
+            <w:tcBorders>
+              <w:top w:val="single" w:sz="6" w:space="0" w:color="DDDDDD"/>
+              <w:left w:val="single" w:sz="6" w:space="0" w:color="DDDDDD"/>
+              <w:bottom w:val="single" w:sz="6" w:space="0" w:color="DDDDDD"/>
+              <w:right w:val="single" w:sz="6" w:space="0" w:color="DDDDDD"/>
+            </w:tcBorders>
+            <w:tcMar>
+              <w:top w:w="120" w:type="dxa"/>
+              <w:left w:w="120" w:type="dxa"/>
+              <w:bottom w:w="120" w:type="dxa"/>
+              <w:right w:w="120" w:type="dxa"/>
+            </w:tcMar>
+            <w:vAlign w:val="center"/>
+            <w:hideMark/>
+          </w:tcPr>
+          <w:p>
+            <w:pPr>
+              <w:ind w:left="283"/>
+              <w:rPr>
+                <w:b/>
+                <w:bCs/>
+                <w:color w:val="4472C4" w:themeColor="accent1"/>
+                <w:sz w:val="20"/>
+                <w:szCs w:val="20"/>
+                <w:lang w:val="fr-SN"/>
+              </w:rPr>
+            </w:pPr>
+            <w:r>
+              <w:rPr>
+                <w:b/>
+                <w:bCs/>
+                <w:color w:val="4472C4" w:themeColor="accent1"/>
+                <w:sz w:val="20"/>
+                <w:szCs w:val="20"/>
+                <w:lang w:val="fr-SN"/>
+              </w:rPr>
+              <w:t>Application difficile à utiliser</w:t>
+            </w:r>
+          </w:p>
+        </w:tc>
+        <w:tc>
+          <w:tcPr>
+            <w:tcW w:w="0" w:type="auto"/>
+            <w:tcBorders>
+              <w:top w:val="single" w:sz="6" w:space="0" w:color="DDDDDD"/>
+              <w:left w:val="single" w:sz="6" w:space="0" w:color="DDDDDD"/>
+              <w:bottom w:val="single" w:sz="6" w:space="0" w:color="DDDDDD"/>
+              <w:right w:val="single" w:sz="6" w:space="0" w:color="DDDDDD"/>
+            </w:tcBorders>
+            <w:tcMar>
+              <w:top w:w="120" w:type="dxa"/>
+              <w:left w:w="120" w:type="dxa"/>
+              <w:bottom w:w="120" w:type="dxa"/>
+              <w:right w:w="120" w:type="dxa"/>
+            </w:tcMar>
+            <w:vAlign w:val="center"/>
+            <w:hideMark/>
+          </w:tcPr>
+          <w:p>
+            <w:pPr>
+              <w:ind w:left="283"/>
+              <w:rPr>
+                <w:b/>
+                <w:bCs/>
+                <w:color w:val="4472C4" w:themeColor="accent1"/>
+                <w:sz w:val="20"/>
+                <w:szCs w:val="20"/>
+                <w:lang w:val="fr-SN"/>
+              </w:rPr>
+            </w:pPr>
+            <w:r>
+              <w:rPr>
+                <w:b/>
+                <w:bCs/>
+                <w:color w:val="4472C4" w:themeColor="accent1"/>
+                <w:sz w:val="20"/>
+                <w:szCs w:val="20"/>
+                <w:lang w:val="fr-SN"/>
+              </w:rPr>
+              <w:t>Avis 4</w:t>
+            </w:r>
+          </w:p>
+        </w:tc>
+        <w:tc>
+          <w:tcPr>
+            <w:tcW w:w="0" w:type="auto"/>
+            <w:tcBorders>
+              <w:top w:val="single" w:sz="6" w:space="0" w:color="DDDDDD"/>
+              <w:left w:val="single" w:sz="6" w:space="0" w:color="DDDDDD"/>
+              <w:bottom w:val="single" w:sz="6" w:space="0" w:color="DDDDDD"/>
+              <w:right w:val="single" w:sz="6" w:space="0" w:color="DDDDDD"/>
+            </w:tcBorders>
+            <w:tcMar>
+              <w:top w:w="120" w:type="dxa"/>
+              <w:left w:w="120" w:type="dxa"/>
+              <w:bottom w:w="120" w:type="dxa"/>
+              <w:right w:w="120" w:type="dxa"/>
+            </w:tcMar>
+            <w:vAlign w:val="center"/>
+            <w:hideMark/>
+          </w:tcPr>
+          <w:p>
+            <w:pPr>
+              <w:ind w:left="283"/>
+              <w:rPr>
+                <w:b/>
+                <w:bCs/>
+                <w:color w:val="4472C4" w:themeColor="accent1"/>
+                <w:sz w:val="20"/>
+                <w:szCs w:val="20"/>
+                <w:lang w:val="fr-SN"/>
+              </w:rPr>
+            </w:pPr>
+            <w:r>
+              <w:rPr>
+                <w:b/>
+                <w:bCs/>
+                <w:color w:val="4472C4" w:themeColor="accent1"/>
+                <w:sz w:val="20"/>
+                <w:szCs w:val="20"/>
+                <w:lang w:val="fr-SN"/>
+              </w:rPr>
+              <w:t>1 avis</w:t>
+            </w:r>
+          </w:p>
+        </w:tc>
+        <w:tc>
+          <w:tcPr>
+            <w:tcW w:w="0" w:type="auto"/>
+            <w:tcBorders>
+              <w:top w:val="single" w:sz="6" w:space="0" w:color="DDDDDD"/>
+              <w:left w:val="single" w:sz="6" w:space="0" w:color="DDDDDD"/>
+              <w:bottom w:val="single" w:sz="6" w:space="0" w:color="DDDDDD"/>
+              <w:right w:val="single" w:sz="6" w:space="0" w:color="DDDDDD"/>
+            </w:tcBorders>
+            <w:tcMar>
+              <w:top w:w="120" w:type="dxa"/>
+              <w:left w:w="120" w:type="dxa"/>
+              <w:bottom w:w="120" w:type="dxa"/>
+              <w:right w:w="120" w:type="dxa"/>
+            </w:tcMar>
+            <w:vAlign w:val="center"/>
+            <w:hideMark/>
+          </w:tcPr>
+          <w:p>
+            <w:pPr>
+              <w:ind w:left="283"/>
+              <w:rPr>
+                <w:b/>
+                <w:bCs/>
+                <w:color w:val="4472C4" w:themeColor="accent1"/>
+                <w:sz w:val="20"/>
+                <w:szCs w:val="20"/>
+                <w:lang w:val="fr-SN"/>
+              </w:rPr>
+            </w:pPr>
+            <w:proofErr w:type="gramStart"/>
+            <w:r>
+              <w:rPr>
+                <w:b/>
+                <w:bCs/>
+                <w:color w:val="4472C4" w:themeColor="accent1"/>
+                <w:sz w:val="20"/>
+                <w:szCs w:val="20"/>
+                <w:lang w:val="fr-SN"/>
+              </w:rPr>
+              <w:t>moyenne</w:t>
+            </w:r>
+            <w:proofErr w:type="gramEnd"/>
+          </w:p>
+        </w:tc>
+        <w:tc>
+          <w:tcPr>
+            <w:tcW w:w="0" w:type="auto"/>
+            <w:tcBorders>
+              <w:top w:val="single" w:sz="6" w:space="0" w:color="DDDDDD"/>
+              <w:left w:val="single" w:sz="6" w:space="0" w:color="DDDDDD"/>
+              <w:bottom w:val="single" w:sz="6" w:space="0" w:color="DDDDDD"/>
+              <w:right w:val="single" w:sz="6" w:space="0" w:color="DDDDDD"/>
+            </w:tcBorders>
+            <w:tcMar>
+              <w:top w:w="120" w:type="dxa"/>
+              <w:left w:w="120" w:type="dxa"/>
+              <w:bottom w:w="120" w:type="dxa"/>
+              <w:right w:w="120" w:type="dxa"/>
+            </w:tcMar>
+            <w:vAlign w:val="center"/>
+            <w:hideMark/>
+          </w:tcPr>
+          <w:p>
+            <w:pPr>
+              <w:ind w:left="283"/>
+              <w:rPr>
+                <w:b/>
+                <w:bCs/>
+                <w:color w:val="4472C4" w:themeColor="accent1"/>
+                <w:sz w:val="20"/>
+                <w:szCs w:val="20"/>
+                <w:lang w:val="fr-SN"/>
+              </w:rPr>
+            </w:pPr>
+            <w:r>
+              <w:rPr>
+                <w:b/>
+                <w:bCs/>
+                <w:color w:val="4472C4" w:themeColor="accent1"/>
+                <w:sz w:val="20"/>
+                <w:szCs w:val="20"/>
+                <w:lang w:val="fr-SN"/>
+              </w:rPr>
+              <w:t>Réviser l’ergonomie de l’application et tester avec des utilisateurs pour simplifier l’usage.</w:t>
+            </w:r>
+          </w:p>
+        </w:tc>
+      </w:tr>
+      <w:tr>
+        <w:tc>
+          <w:tcPr>
+            <w:tcW w:w="0" w:type="auto"/>
+            <w:tcBorders>
+              <w:top w:val="single" w:sz="6" w:space="0" w:color="DDDDDD"/>
+              <w:left w:val="single" w:sz="6" w:space="0" w:color="DDDDDD"/>
+              <w:bottom w:val="single" w:sz="6" w:space="0" w:color="DDDDDD"/>
+              <w:right w:val="single" w:sz="6" w:space="0" w:color="DDDDDD"/>
+            </w:tcBorders>
+            <w:tcMar>
+              <w:top w:w="120" w:type="dxa"/>
+              <w:left w:w="120" w:type="dxa"/>
+              <w:bottom w:w="120" w:type="dxa"/>
+              <w:right w:w="120" w:type="dxa"/>
+            </w:tcMar>
+            <w:vAlign w:val="center"/>
+            <w:hideMark/>
+          </w:tcPr>
+          <w:p>
+            <w:pPr>
+              <w:ind w:left="283"/>
+              <w:rPr>
+                <w:b/>
+                <w:bCs/>
+                <w:color w:val="4472C4" w:themeColor="accent1"/>
+                <w:sz w:val="20"/>
+                <w:szCs w:val="20"/>
+                <w:lang w:val="fr-SN"/>
+              </w:rPr>
+            </w:pPr>
+            <w:r>
+              <w:rPr>
+                <w:b/>
+                <w:bCs/>
+                <w:color w:val="4472C4" w:themeColor="accent1"/>
+                <w:sz w:val="20"/>
+                <w:szCs w:val="20"/>
+                <w:lang w:val="fr-SN"/>
+              </w:rPr>
+              <w:lastRenderedPageBreak/>
+              <w:t>Service client ne répond pas</w:t>
+            </w:r>
+          </w:p>
+        </w:tc>
+        <w:tc>
+          <w:tcPr>
+            <w:tcW w:w="0" w:type="auto"/>
+            <w:tcBorders>
+              <w:top w:val="single" w:sz="6" w:space="0" w:color="DDDDDD"/>
+              <w:left w:val="single" w:sz="6" w:space="0" w:color="DDDDDD"/>
+              <w:bottom w:val="single" w:sz="6" w:space="0" w:color="DDDDDD"/>
+              <w:right w:val="single" w:sz="6" w:space="0" w:color="DDDDDD"/>
+            </w:tcBorders>
+            <w:tcMar>
+              <w:top w:w="120" w:type="dxa"/>
+              <w:left w:w="120" w:type="dxa"/>
+              <w:bottom w:w="120" w:type="dxa"/>
+              <w:right w:w="120" w:type="dxa"/>
+            </w:tcMar>
+            <w:vAlign w:val="center"/>
+            <w:hideMark/>
+          </w:tcPr>
+          <w:p>
+            <w:pPr>
+              <w:ind w:left="283"/>
+              <w:rPr>
+                <w:b/>
+                <w:bCs/>
+                <w:color w:val="4472C4" w:themeColor="accent1"/>
+                <w:sz w:val="20"/>
+                <w:szCs w:val="20"/>
+                <w:lang w:val="fr-SN"/>
+              </w:rPr>
+            </w:pPr>
+            <w:r>
+              <w:rPr>
+                <w:b/>
+                <w:bCs/>
+                <w:color w:val="4472C4" w:themeColor="accent1"/>
+                <w:sz w:val="20"/>
+                <w:szCs w:val="20"/>
+                <w:lang w:val="fr-SN"/>
+              </w:rPr>
+              <w:t>Avis 4</w:t>
+            </w:r>
+          </w:p>
+        </w:tc>
+        <w:tc>
+          <w:tcPr>
+            <w:tcW w:w="0" w:type="auto"/>
+            <w:tcBorders>
+              <w:top w:val="single" w:sz="6" w:space="0" w:color="DDDDDD"/>
+              <w:left w:val="single" w:sz="6" w:space="0" w:color="DDDDDD"/>
+              <w:bottom w:val="single" w:sz="6" w:space="0" w:color="DDDDDD"/>
+              <w:right w:val="single" w:sz="6" w:space="0" w:color="DDDDDD"/>
+            </w:tcBorders>
+            <w:tcMar>
+              <w:top w:w="120" w:type="dxa"/>
+              <w:left w:w="120" w:type="dxa"/>
+              <w:bottom w:w="120" w:type="dxa"/>
+              <w:right w:w="120" w:type="dxa"/>
+            </w:tcMar>
+            <w:vAlign w:val="center"/>
+            <w:hideMark/>
+          </w:tcPr>
+          <w:p>
+            <w:pPr>
+              <w:ind w:left="283"/>
+              <w:rPr>
+                <w:b/>
+                <w:bCs/>
+                <w:color w:val="4472C4" w:themeColor="accent1"/>
+                <w:sz w:val="20"/>
+                <w:szCs w:val="20"/>
+                <w:lang w:val="fr-SN"/>
+              </w:rPr>
+            </w:pPr>
+            <w:r>
+              <w:rPr>
+                <w:b/>
+                <w:bCs/>
+                <w:color w:val="4472C4" w:themeColor="accent1"/>
+                <w:sz w:val="20"/>
+                <w:szCs w:val="20"/>
+                <w:lang w:val="fr-SN"/>
+              </w:rPr>
+              <w:t>1 avis</w:t>
+            </w:r>
+          </w:p>
+        </w:tc>
+        <w:tc>
+          <w:tcPr>
+            <w:tcW w:w="0" w:type="auto"/>
+            <w:tcBorders>
+              <w:top w:val="single" w:sz="6" w:space="0" w:color="DDDDDD"/>
+              <w:left w:val="single" w:sz="6" w:space="0" w:color="DDDDDD"/>
+              <w:bottom w:val="single" w:sz="6" w:space="0" w:color="DDDDDD"/>
+              <w:right w:val="single" w:sz="6" w:space="0" w:color="DDDDDD"/>
+            </w:tcBorders>
+            <w:tcMar>
+              <w:top w:w="120" w:type="dxa"/>
+              <w:left w:w="120" w:type="dxa"/>
+              <w:bottom w:w="120" w:type="dxa"/>
+              <w:right w:w="120" w:type="dxa"/>
+            </w:tcMar>
+            <w:vAlign w:val="center"/>
+            <w:hideMark/>
+          </w:tcPr>
+          <w:p>
+            <w:pPr>
+              <w:ind w:left="283"/>
+              <w:rPr>
+                <w:b/>
+                <w:bCs/>
+                <w:color w:val="4472C4" w:themeColor="accent1"/>
+                <w:sz w:val="20"/>
+                <w:szCs w:val="20"/>
+                <w:lang w:val="fr-SN"/>
+              </w:rPr>
+            </w:pPr>
+            <w:proofErr w:type="gramStart"/>
+            <w:r>
+              <w:rPr>
+                <w:b/>
+                <w:bCs/>
+                <w:color w:val="4472C4" w:themeColor="accent1"/>
+                <w:sz w:val="20"/>
+                <w:szCs w:val="20"/>
+                <w:lang w:val="fr-SN"/>
+              </w:rPr>
+              <w:t>moyenne</w:t>
+            </w:r>
+            <w:proofErr w:type="gramEnd"/>
+          </w:p>
+        </w:tc>
+        <w:tc>
+          <w:tcPr>
+            <w:tcW w:w="0" w:type="auto"/>
+            <w:tcBorders>
+              <w:top w:val="single" w:sz="6" w:space="0" w:color="DDDDDD"/>
+              <w:left w:val="single" w:sz="6" w:space="0" w:color="DDDDDD"/>
+              <w:bottom w:val="single" w:sz="6" w:space="0" w:color="DDDDDD"/>
+              <w:right w:val="single" w:sz="6" w:space="0" w:color="DDDDDD"/>
+            </w:tcBorders>
+            <w:tcMar>
+              <w:top w:w="120" w:type="dxa"/>
+              <w:left w:w="120" w:type="dxa"/>
+              <w:bottom w:w="120" w:type="dxa"/>
+              <w:right w:w="120" w:type="dxa"/>
+            </w:tcMar>
+            <w:vAlign w:val="center"/>
+            <w:hideMark/>
+          </w:tcPr>
+          <w:p>
+            <w:pPr>
+              <w:ind w:left="283"/>
+              <w:rPr>
+                <w:b/>
+                <w:bCs/>
+                <w:color w:val="4472C4" w:themeColor="accent1"/>
+                <w:sz w:val="20"/>
+                <w:szCs w:val="20"/>
+                <w:lang w:val="fr-SN"/>
+              </w:rPr>
+            </w:pPr>
+            <w:r>
+              <w:rPr>
+                <w:b/>
+                <w:bCs/>
+                <w:color w:val="4472C4" w:themeColor="accent1"/>
+                <w:sz w:val="20"/>
+                <w:szCs w:val="20"/>
+                <w:lang w:val="fr-SN"/>
+              </w:rPr>
+              <w:t>Augmenter les canaux de contact et garantir un délai de réponse maximal.</w:t>
+            </w:r>
+          </w:p>
+        </w:tc>
+      </w:tr>
+      <w:tr>
+        <w:tc>
+          <w:tcPr>
+            <w:tcW w:w="0" w:type="auto"/>
+            <w:tcBorders>
+              <w:top w:val="single" w:sz="6" w:space="0" w:color="DDDDDD"/>
+              <w:left w:val="single" w:sz="6" w:space="0" w:color="DDDDDD"/>
+              <w:bottom w:val="single" w:sz="6" w:space="0" w:color="DDDDDD"/>
+              <w:right w:val="single" w:sz="6" w:space="0" w:color="DDDDDD"/>
+            </w:tcBorders>
+            <w:tcMar>
+              <w:top w:w="120" w:type="dxa"/>
+              <w:left w:w="120" w:type="dxa"/>
+              <w:bottom w:w="120" w:type="dxa"/>
+              <w:right w:w="120" w:type="dxa"/>
+            </w:tcMar>
+            <w:vAlign w:val="center"/>
+            <w:hideMark/>
+          </w:tcPr>
+          <w:p>
+            <w:pPr>
+              <w:ind w:left="283"/>
+              <w:rPr>
+                <w:b/>
+                <w:bCs/>
+                <w:color w:val="4472C4" w:themeColor="accent1"/>
+                <w:sz w:val="20"/>
+                <w:szCs w:val="20"/>
+                <w:lang w:val="fr-SN"/>
+              </w:rPr>
+            </w:pPr>
+            <w:r>
+              <w:rPr>
+                <w:b/>
+                <w:bCs/>
+                <w:color w:val="4472C4" w:themeColor="accent1"/>
+                <w:sz w:val="20"/>
+                <w:szCs w:val="20"/>
+                <w:lang w:val="fr-SN"/>
+              </w:rPr>
+              <w:t>Emballage du colis (positif, mais cité dans un avis avec retard)</w:t>
+            </w:r>
+          </w:p>
+        </w:tc>
+        <w:tc>
+          <w:tcPr>
+            <w:tcW w:w="0" w:type="auto"/>
+            <w:tcBorders>
+              <w:top w:val="single" w:sz="6" w:space="0" w:color="DDDDDD"/>
+              <w:left w:val="single" w:sz="6" w:space="0" w:color="DDDDDD"/>
+              <w:bottom w:val="single" w:sz="6" w:space="0" w:color="DDDDDD"/>
+              <w:right w:val="single" w:sz="6" w:space="0" w:color="DDDDDD"/>
+            </w:tcBorders>
+            <w:tcMar>
+              <w:top w:w="120" w:type="dxa"/>
+              <w:left w:w="120" w:type="dxa"/>
+              <w:bottom w:w="120" w:type="dxa"/>
+              <w:right w:w="120" w:type="dxa"/>
+            </w:tcMar>
+            <w:vAlign w:val="center"/>
+            <w:hideMark/>
+          </w:tcPr>
+          <w:p>
+            <w:pPr>
+              <w:ind w:left="283"/>
+              <w:rPr>
+                <w:b/>
+                <w:bCs/>
+                <w:color w:val="4472C4" w:themeColor="accent1"/>
+                <w:sz w:val="20"/>
+                <w:szCs w:val="20"/>
+                <w:lang w:val="fr-SN"/>
+              </w:rPr>
+            </w:pPr>
+            <w:r>
+              <w:rPr>
+                <w:b/>
+                <w:bCs/>
+                <w:color w:val="4472C4" w:themeColor="accent1"/>
+                <w:sz w:val="20"/>
+                <w:szCs w:val="20"/>
+                <w:lang w:val="fr-SN"/>
+              </w:rPr>
+              <w:t>Avis 3</w:t>
+            </w:r>
+          </w:p>
+        </w:tc>
+        <w:tc>
+          <w:tcPr>
+            <w:tcW w:w="0" w:type="auto"/>
+            <w:tcBorders>
+              <w:top w:val="single" w:sz="6" w:space="0" w:color="DDDDDD"/>
+              <w:left w:val="single" w:sz="6" w:space="0" w:color="DDDDDD"/>
+              <w:bottom w:val="single" w:sz="6" w:space="0" w:color="DDDDDD"/>
+              <w:right w:val="single" w:sz="6" w:space="0" w:color="DDDDDD"/>
+            </w:tcBorders>
+            <w:tcMar>
+              <w:top w:w="120" w:type="dxa"/>
+              <w:left w:w="120" w:type="dxa"/>
+              <w:bottom w:w="120" w:type="dxa"/>
+              <w:right w:w="120" w:type="dxa"/>
+            </w:tcMar>
+            <w:vAlign w:val="center"/>
+            <w:hideMark/>
+          </w:tcPr>
+          <w:p>
+            <w:pPr>
+              <w:ind w:left="283"/>
+              <w:rPr>
+                <w:b/>
+                <w:bCs/>
+                <w:color w:val="4472C4" w:themeColor="accent1"/>
+                <w:sz w:val="20"/>
+                <w:szCs w:val="20"/>
+                <w:lang w:val="fr-SN"/>
+              </w:rPr>
+            </w:pPr>
+            <w:r>
+              <w:rPr>
+                <w:b/>
+                <w:bCs/>
+                <w:color w:val="4472C4" w:themeColor="accent1"/>
+                <w:sz w:val="20"/>
+                <w:szCs w:val="20"/>
+                <w:lang w:val="fr-SN"/>
+              </w:rPr>
+              <w:t>1 avis</w:t>
+            </w:r>
+          </w:p>
+        </w:tc>
+        <w:tc>
+          <w:tcPr>
+            <w:tcW w:w="0" w:type="auto"/>
+            <w:tcBorders>
+              <w:top w:val="single" w:sz="6" w:space="0" w:color="DDDDDD"/>
+              <w:left w:val="single" w:sz="6" w:space="0" w:color="DDDDDD"/>
+              <w:bottom w:val="single" w:sz="6" w:space="0" w:color="DDDDDD"/>
+              <w:right w:val="single" w:sz="6" w:space="0" w:color="DDDDDD"/>
+            </w:tcBorders>
+            <w:tcMar>
+              <w:top w:w="120" w:type="dxa"/>
+              <w:left w:w="120" w:type="dxa"/>
+              <w:bottom w:w="120" w:type="dxa"/>
+              <w:right w:w="120" w:type="dxa"/>
+            </w:tcMar>
+            <w:vAlign w:val="center"/>
+            <w:hideMark/>
+          </w:tcPr>
+          <w:p>
+            <w:pPr>
+              <w:ind w:left="283"/>
+              <w:rPr>
+                <w:b/>
+                <w:bCs/>
+                <w:color w:val="4472C4" w:themeColor="accent1"/>
+                <w:sz w:val="20"/>
+                <w:szCs w:val="20"/>
+                <w:lang w:val="fr-SN"/>
+              </w:rPr>
+            </w:pPr>
+            <w:proofErr w:type="gramStart"/>
+            <w:r>
+              <w:rPr>
+                <w:b/>
+                <w:bCs/>
+                <w:color w:val="4472C4" w:themeColor="accent1"/>
+                <w:sz w:val="20"/>
+                <w:szCs w:val="20"/>
+                <w:lang w:val="fr-SN"/>
+              </w:rPr>
+              <w:t>faible</w:t>
+            </w:r>
+            <w:proofErr w:type="gramEnd"/>
+          </w:p>
+        </w:tc>
+        <w:tc>
+          <w:tcPr>
+            <w:tcW w:w="0" w:type="auto"/>
+            <w:tcBorders>
+              <w:top w:val="single" w:sz="6" w:space="0" w:color="DDDDDD"/>
+              <w:left w:val="single" w:sz="6" w:space="0" w:color="DDDDDD"/>
+              <w:bottom w:val="single" w:sz="6" w:space="0" w:color="DDDDDD"/>
+              <w:right w:val="single" w:sz="6" w:space="0" w:color="DDDDDD"/>
+            </w:tcBorders>
+            <w:tcMar>
+              <w:top w:w="120" w:type="dxa"/>
+              <w:left w:w="120" w:type="dxa"/>
+              <w:bottom w:w="120" w:type="dxa"/>
+              <w:right w:w="120" w:type="dxa"/>
+            </w:tcMar>
+            <w:vAlign w:val="center"/>
+            <w:hideMark/>
+          </w:tcPr>
+          <w:p>
+            <w:pPr>
+              <w:ind w:left="283"/>
+              <w:rPr>
+                <w:b/>
+                <w:bCs/>
+                <w:color w:val="4472C4" w:themeColor="accent1"/>
+                <w:sz w:val="20"/>
+                <w:szCs w:val="20"/>
+                <w:lang w:val="fr-SN"/>
+              </w:rPr>
+            </w:pPr>
+            <w:r>
+              <w:rPr>
+                <w:b/>
+                <w:bCs/>
+                <w:color w:val="4472C4" w:themeColor="accent1"/>
+                <w:sz w:val="20"/>
+                <w:szCs w:val="20"/>
+                <w:lang w:val="fr-SN"/>
+              </w:rPr>
+              <w:t>Maintenir le niveau actuel d’emballage ; aucun problème à corriger ici.</w:t>
+            </w:r>
+          </w:p>
+        </w:tc>
+      </w:tr>
+    </w:tbl>
+    <w:p>
+      <w:pPr>
+        <w:rPr>
+          <w:b/>
+          <w:bCs/>
+          <w:color w:val="4472C4" w:themeColor="accent1"/>
+          <w:sz w:val="28"/>
+          <w:szCs w:val="28"/>
+          <w:lang w:val="fr-SN"/>
+        </w:rPr>
+      </w:pPr>
+    </w:p>
+    <w:p>
+      <w:pPr>
+        <w:rPr>
+          <w:b/>
+          <w:bCs/>
+          <w:color w:val="806000" w:themeColor="accent4" w:themeShade="80"/>
+          <w:sz w:val="28"/>
+          <w:szCs w:val="28"/>
+          <w:lang w:val="fr-SN"/>
+        </w:rPr>
+      </w:pPr>
+      <w:r>
+        <w:rPr>
+          <w:b/>
+          <w:bCs/>
+          <w:color w:val="806000" w:themeColor="accent4" w:themeShade="80"/>
+          <w:sz w:val="28"/>
+          <w:szCs w:val="28"/>
+          <w:lang w:val="fr-SN"/>
+        </w:rPr>
+        <w:t>Second prompt de vérification</w:t>
+      </w:r>
+      <w:r>
+        <w:rPr>
+          <w:b/>
+          <w:bCs/>
+          <w:color w:val="806000" w:themeColor="accent4" w:themeShade="80"/>
+          <w:sz w:val="28"/>
+          <w:szCs w:val="28"/>
+          <w:lang w:val="fr-SN"/>
+        </w:rPr>
+        <w:t> :</w:t>
+      </w:r>
+    </w:p>
+    <w:p>
+      <w:pPr>
+        <w:rPr>
+          <w:color w:val="000000" w:themeColor="text1"/>
+          <w:sz w:val="28"/>
+          <w:szCs w:val="28"/>
+          <w:lang w:val="fr-SN"/>
+        </w:rPr>
+      </w:pPr>
+      <w:r>
+        <w:rPr>
+          <w:b/>
+          <w:bCs/>
+          <w:color w:val="806000" w:themeColor="accent4" w:themeShade="80"/>
+          <w:sz w:val="28"/>
+          <w:szCs w:val="28"/>
+          <w:lang w:val="fr-SN"/>
+        </w:rPr>
+        <w:t>```</w:t>
+      </w:r>
+      <w:r>
+        <w:rPr>
+          <w:color w:val="000000" w:themeColor="text1"/>
+          <w:sz w:val="28"/>
+          <w:szCs w:val="28"/>
+          <w:lang w:val="fr-SN"/>
+        </w:rPr>
+        <w:t xml:space="preserve">Tu dois maintenant vérifier ta réponse précédente en la comparant uniquement avec les </w:t>
+      </w:r>
+      <w:r>
+        <w:rPr>
+          <w:color w:val="000000" w:themeColor="text1"/>
+          <w:sz w:val="28"/>
+          <w:szCs w:val="28"/>
+          <w:lang w:val="fr-SN"/>
+        </w:rPr>
+        <w:t>4</w:t>
+      </w:r>
+      <w:r>
+        <w:rPr>
+          <w:color w:val="000000" w:themeColor="text1"/>
+          <w:sz w:val="28"/>
+          <w:szCs w:val="28"/>
+          <w:lang w:val="fr-SN"/>
+        </w:rPr>
+        <w:t xml:space="preserve"> avis clients fournis.</w:t>
+      </w:r>
+    </w:p>
+    <w:p>
+      <w:pPr>
+        <w:rPr>
+          <w:color w:val="000000" w:themeColor="text1"/>
+          <w:sz w:val="28"/>
+          <w:szCs w:val="28"/>
+          <w:lang w:val="fr-SN"/>
+        </w:rPr>
+      </w:pPr>
+      <w:r>
+        <w:rPr>
+          <w:color w:val="000000" w:themeColor="text1"/>
+          <w:sz w:val="28"/>
+          <w:szCs w:val="28"/>
+          <w:lang w:val="fr-SN"/>
+        </w:rPr>
+        <w:t>Effectue les contrôles suivants :</w:t>
+      </w:r>
+    </w:p>
+    <w:p>
+      <w:pPr>
+        <w:rPr>
+          <w:color w:val="000000" w:themeColor="text1"/>
+          <w:sz w:val="28"/>
+          <w:szCs w:val="28"/>
+          <w:lang w:val="fr-SN"/>
+        </w:rPr>
+      </w:pPr>
+      <w:r>
+        <w:rPr>
+          <w:color w:val="000000" w:themeColor="text1"/>
+          <w:sz w:val="28"/>
+          <w:szCs w:val="28"/>
+          <w:lang w:val="fr-SN"/>
+        </w:rPr>
+        <w:t>1. Informations non justifiées</w:t>
+      </w:r>
+    </w:p>
+    <w:p>
+      <w:pPr>
+        <w:rPr>
+          <w:color w:val="000000" w:themeColor="text1"/>
+          <w:sz w:val="28"/>
+          <w:szCs w:val="28"/>
+          <w:lang w:val="fr-SN"/>
+        </w:rPr>
+      </w:pPr>
+      <w:r>
+        <w:rPr>
+          <w:color w:val="000000" w:themeColor="text1"/>
+          <w:sz w:val="28"/>
+          <w:szCs w:val="28"/>
+          <w:lang w:val="fr-SN"/>
+        </w:rPr>
+        <w:t xml:space="preserve">   Vérifie que chaque problème, fréquence, priorité et recommandation est soutenu par les avis.</w:t>
+      </w:r>
+    </w:p>
+    <w:p>
+      <w:pPr>
+        <w:rPr>
+          <w:color w:val="000000" w:themeColor="text1"/>
+          <w:sz w:val="28"/>
+          <w:szCs w:val="28"/>
+          <w:lang w:val="fr-SN"/>
+        </w:rPr>
+      </w:pPr>
+      <w:r>
+        <w:rPr>
+          <w:color w:val="000000" w:themeColor="text1"/>
+          <w:sz w:val="28"/>
+          <w:szCs w:val="28"/>
+          <w:lang w:val="fr-SN"/>
+        </w:rPr>
+        <w:t xml:space="preserve">   Signale toute affirmation qui dépasse les informations disponibles.</w:t>
+      </w:r>
+    </w:p>
+    <w:p>
+      <w:pPr>
+        <w:rPr>
+          <w:color w:val="000000" w:themeColor="text1"/>
+          <w:sz w:val="28"/>
+          <w:szCs w:val="28"/>
+          <w:lang w:val="fr-SN"/>
+        </w:rPr>
+      </w:pPr>
+      <w:r>
+        <w:rPr>
+          <w:color w:val="000000" w:themeColor="text1"/>
+          <w:sz w:val="28"/>
+          <w:szCs w:val="28"/>
+          <w:lang w:val="fr-SN"/>
+        </w:rPr>
+        <w:t>2. Contradictions</w:t>
+      </w:r>
+    </w:p>
+    <w:p>
+      <w:pPr>
+        <w:rPr>
+          <w:color w:val="000000" w:themeColor="text1"/>
+          <w:sz w:val="28"/>
+          <w:szCs w:val="28"/>
+          <w:lang w:val="fr-SN"/>
+        </w:rPr>
+      </w:pPr>
+      <w:r>
+        <w:rPr>
+          <w:color w:val="000000" w:themeColor="text1"/>
+          <w:sz w:val="28"/>
+          <w:szCs w:val="28"/>
+          <w:lang w:val="fr-SN"/>
+        </w:rPr>
+        <w:t xml:space="preserve">   Vérifie que la réponse ne contredit aucun avis.</w:t>
+      </w:r>
+    </w:p>
+    <w:p>
+      <w:pPr>
+        <w:rPr>
+          <w:color w:val="000000" w:themeColor="text1"/>
+          <w:sz w:val="28"/>
+          <w:szCs w:val="28"/>
+          <w:lang w:val="fr-SN"/>
+        </w:rPr>
+      </w:pPr>
+      <w:r>
+        <w:rPr>
+          <w:color w:val="000000" w:themeColor="text1"/>
+          <w:sz w:val="28"/>
+          <w:szCs w:val="28"/>
+          <w:lang w:val="fr-SN"/>
+        </w:rPr>
+        <w:t xml:space="preserve">   Vérifie également qu’elle ne contient pas deux affirmations incompatibles.</w:t>
+      </w:r>
+    </w:p>
+    <w:p>
+      <w:pPr>
+        <w:rPr>
+          <w:color w:val="000000" w:themeColor="text1"/>
+          <w:sz w:val="28"/>
+          <w:szCs w:val="28"/>
+          <w:lang w:val="fr-SN"/>
+        </w:rPr>
+      </w:pPr>
+      <w:r>
+        <w:rPr>
+          <w:color w:val="000000" w:themeColor="text1"/>
+          <w:sz w:val="28"/>
+          <w:szCs w:val="28"/>
+          <w:lang w:val="fr-SN"/>
+        </w:rPr>
+        <w:t>3. Informations absentes</w:t>
+      </w:r>
+    </w:p>
+    <w:p>
+      <w:pPr>
+        <w:rPr>
+          <w:color w:val="000000" w:themeColor="text1"/>
+          <w:sz w:val="28"/>
+          <w:szCs w:val="28"/>
+          <w:lang w:val="fr-SN"/>
+        </w:rPr>
+      </w:pPr>
+      <w:r>
+        <w:rPr>
+          <w:color w:val="000000" w:themeColor="text1"/>
+          <w:sz w:val="28"/>
+          <w:szCs w:val="28"/>
+          <w:lang w:val="fr-SN"/>
+        </w:rPr>
+        <w:t xml:space="preserve">   Vérifie que tous les éléments demandés sont présents :</w:t>
+      </w:r>
+    </w:p>
+    <w:p>
+      <w:pPr>
+        <w:rPr>
+          <w:color w:val="000000" w:themeColor="text1"/>
+          <w:sz w:val="28"/>
+          <w:szCs w:val="28"/>
+          <w:lang w:val="fr-SN"/>
+        </w:rPr>
+      </w:pPr>
+      <w:r>
+        <w:rPr>
+          <w:color w:val="000000" w:themeColor="text1"/>
+          <w:sz w:val="28"/>
+          <w:szCs w:val="28"/>
+          <w:lang w:val="fr-SN"/>
+        </w:rPr>
+        <w:t xml:space="preserve">   </w:t>
+      </w:r>
+      <w:proofErr w:type="gramStart"/>
+      <w:r>
+        <w:rPr>
+          <w:color w:val="000000" w:themeColor="text1"/>
+          <w:sz w:val="28"/>
+          <w:szCs w:val="28"/>
+          <w:lang w:val="fr-SN"/>
+        </w:rPr>
+        <w:t>problème</w:t>
+      </w:r>
+      <w:proofErr w:type="gramEnd"/>
+      <w:r>
+        <w:rPr>
+          <w:color w:val="000000" w:themeColor="text1"/>
+          <w:sz w:val="28"/>
+          <w:szCs w:val="28"/>
+          <w:lang w:val="fr-SN"/>
+        </w:rPr>
+        <w:t>, avis concernés, fréquence, priorité et recommandation.</w:t>
+      </w:r>
+    </w:p>
+    <w:p>
+      <w:pPr>
+        <w:rPr>
+          <w:color w:val="000000" w:themeColor="text1"/>
+          <w:sz w:val="28"/>
+          <w:szCs w:val="28"/>
+          <w:lang w:val="fr-SN"/>
+        </w:rPr>
+      </w:pPr>
+      <w:r>
+        <w:rPr>
+          <w:color w:val="000000" w:themeColor="text1"/>
+          <w:sz w:val="28"/>
+          <w:szCs w:val="28"/>
+          <w:lang w:val="fr-SN"/>
+        </w:rPr>
+        <w:t>4. Hallucinations</w:t>
+      </w:r>
+    </w:p>
+    <w:p>
+      <w:pPr>
+        <w:rPr>
+          <w:color w:val="000000" w:themeColor="text1"/>
+          <w:sz w:val="28"/>
+          <w:szCs w:val="28"/>
+          <w:lang w:val="fr-SN"/>
+        </w:rPr>
+      </w:pPr>
+      <w:r>
+        <w:rPr>
+          <w:color w:val="000000" w:themeColor="text1"/>
+          <w:sz w:val="28"/>
+          <w:szCs w:val="28"/>
+          <w:lang w:val="fr-SN"/>
+        </w:rPr>
+        <w:t xml:space="preserve">   Signale toute cause, statistique, explication ou information qui n’apparaît pas dans les avis et qui ne peut pas être déduite directement.</w:t>
+      </w:r>
+    </w:p>
+    <w:p>
+      <w:pPr>
+        <w:rPr>
+          <w:color w:val="000000" w:themeColor="text1"/>
+          <w:sz w:val="28"/>
+          <w:szCs w:val="28"/>
+          <w:lang w:val="fr-SN"/>
+        </w:rPr>
+      </w:pPr>
+      <w:r>
+        <w:rPr>
+          <w:color w:val="000000" w:themeColor="text1"/>
+          <w:sz w:val="28"/>
+          <w:szCs w:val="28"/>
+          <w:lang w:val="fr-SN"/>
+        </w:rPr>
+        <w:t>5. Respect des contraintes</w:t>
+      </w:r>
+    </w:p>
+    <w:p>
+      <w:pPr>
+        <w:rPr>
+          <w:color w:val="000000" w:themeColor="text1"/>
+          <w:sz w:val="28"/>
+          <w:szCs w:val="28"/>
+          <w:lang w:val="fr-SN"/>
+        </w:rPr>
+      </w:pPr>
+      <w:r>
+        <w:rPr>
+          <w:color w:val="000000" w:themeColor="text1"/>
+          <w:sz w:val="28"/>
+          <w:szCs w:val="28"/>
+          <w:lang w:val="fr-SN"/>
+        </w:rPr>
+        <w:t xml:space="preserve">   Vérifie que :</w:t>
+      </w:r>
+    </w:p>
+    <w:p>
+      <w:pPr>
+        <w:rPr>
+          <w:color w:val="000000" w:themeColor="text1"/>
+          <w:sz w:val="28"/>
+          <w:szCs w:val="28"/>
+          <w:lang w:val="fr-SN"/>
+        </w:rPr>
+      </w:pPr>
+      <w:r>
+        <w:rPr>
+          <w:color w:val="000000" w:themeColor="text1"/>
+          <w:sz w:val="28"/>
+          <w:szCs w:val="28"/>
+          <w:lang w:val="fr-SN"/>
+        </w:rPr>
+        <w:lastRenderedPageBreak/>
+        <w:t xml:space="preserve">   </w:t>
+      </w:r>
+      <w:r>
+        <w:rPr>
+          <w:color w:val="000000" w:themeColor="text1"/>
+          <w:sz w:val="28"/>
+          <w:szCs w:val="28"/>
+          <w:lang w:val="fr-SN"/>
+        </w:rPr>
+        <w:t>- la réponse est sous forme de tableau ;</w:t>
+      </w:r>
+    </w:p>
+    <w:p>
+      <w:pPr>
+        <w:rPr>
+          <w:color w:val="000000" w:themeColor="text1"/>
+          <w:sz w:val="28"/>
+          <w:szCs w:val="28"/>
+          <w:lang w:val="fr-SN"/>
+        </w:rPr>
+      </w:pPr>
+      <w:r>
+        <w:rPr>
+          <w:color w:val="000000" w:themeColor="text1"/>
+          <w:sz w:val="28"/>
+          <w:szCs w:val="28"/>
+          <w:lang w:val="fr-SN"/>
+        </w:rPr>
+        <w:t xml:space="preserve">   - les colonnes demandées sont présentes ;</w:t>
+      </w:r>
+    </w:p>
+    <w:p>
+      <w:pPr>
+        <w:rPr>
+          <w:color w:val="000000" w:themeColor="text1"/>
+          <w:sz w:val="28"/>
+          <w:szCs w:val="28"/>
+          <w:lang w:val="fr-SN"/>
+        </w:rPr>
+      </w:pPr>
+      <w:r>
+        <w:rPr>
+          <w:color w:val="000000" w:themeColor="text1"/>
+          <w:sz w:val="28"/>
+          <w:szCs w:val="28"/>
+          <w:lang w:val="fr-SN"/>
+        </w:rPr>
+        <w:t xml:space="preserve">   - les priorités utilisées sont uniquement élevée, moyenne ou faible ;</w:t>
+      </w:r>
+    </w:p>
+    <w:p>
+      <w:pPr>
+        <w:rPr>
+          <w:color w:val="000000" w:themeColor="text1"/>
+          <w:sz w:val="28"/>
+          <w:szCs w:val="28"/>
+          <w:lang w:val="fr-SN"/>
+        </w:rPr>
+      </w:pPr>
+      <w:r>
+        <w:rPr>
+          <w:color w:val="000000" w:themeColor="text1"/>
+          <w:sz w:val="28"/>
+          <w:szCs w:val="28"/>
+          <w:lang w:val="fr-SN"/>
+        </w:rPr>
+        <w:t xml:space="preserve">   - chaque problème est associé à un avis ;</w:t>
+      </w:r>
+    </w:p>
+    <w:p>
+      <w:pPr>
+        <w:rPr>
+          <w:color w:val="000000" w:themeColor="text1"/>
+          <w:sz w:val="28"/>
+          <w:szCs w:val="28"/>
+          <w:lang w:val="fr-SN"/>
+        </w:rPr>
+      </w:pPr>
+      <w:r>
+        <w:rPr>
+          <w:color w:val="000000" w:themeColor="text1"/>
+          <w:sz w:val="28"/>
+          <w:szCs w:val="28"/>
+          <w:lang w:val="fr-SN"/>
+        </w:rPr>
+        <w:t xml:space="preserve">   - chaque recommandation est liée à un problème identifié ;</w:t>
+      </w:r>
+    </w:p>
+    <w:p>
+      <w:pPr>
+        <w:rPr>
+          <w:color w:val="000000" w:themeColor="text1"/>
+          <w:sz w:val="28"/>
+          <w:szCs w:val="28"/>
+          <w:lang w:val="fr-SN"/>
+        </w:rPr>
+      </w:pPr>
+      <w:r>
+        <w:rPr>
+          <w:color w:val="000000" w:themeColor="text1"/>
+          <w:sz w:val="28"/>
+          <w:szCs w:val="28"/>
+          <w:lang w:val="fr-SN"/>
+        </w:rPr>
+        <w:t xml:space="preserve">   - aucune information n’a été inventée ;</w:t>
+      </w:r>
+    </w:p>
+    <w:p>
+      <w:pPr>
+        <w:rPr>
+          <w:color w:val="000000" w:themeColor="text1"/>
+          <w:sz w:val="28"/>
+          <w:szCs w:val="28"/>
+          <w:lang w:val="fr-SN"/>
+        </w:rPr>
+      </w:pPr>
+      <w:r>
+        <w:rPr>
+          <w:color w:val="000000" w:themeColor="text1"/>
+          <w:sz w:val="28"/>
+          <w:szCs w:val="28"/>
+          <w:lang w:val="fr-SN"/>
+        </w:rPr>
+        <w:t>Présente ton contrôle dans un tableau avec les colonnes suivantes :</w:t>
+      </w:r>
+    </w:p>
+    <w:p>
+      <w:pPr>
+        <w:rPr>
+          <w:color w:val="000000" w:themeColor="text1"/>
+          <w:sz w:val="28"/>
+          <w:szCs w:val="28"/>
+          <w:lang w:val="fr-SN"/>
+        </w:rPr>
+      </w:pPr>
+      <w:r>
+        <w:rPr>
+          <w:color w:val="000000" w:themeColor="text1"/>
+          <w:sz w:val="28"/>
+          <w:szCs w:val="28"/>
+          <w:lang w:val="fr-SN"/>
+        </w:rPr>
+        <w:t>Élément vérifié | Résultat | Justification | Correction nécessaire</w:t>
+      </w:r>
+    </w:p>
+    <w:p>
+      <w:pPr>
+        <w:rPr>
+          <w:color w:val="000000" w:themeColor="text1"/>
+          <w:sz w:val="28"/>
+          <w:szCs w:val="28"/>
+          <w:lang w:val="fr-SN"/>
+        </w:rPr>
+      </w:pPr>
+      <w:r>
+        <w:rPr>
+          <w:color w:val="000000" w:themeColor="text1"/>
+          <w:sz w:val="28"/>
+          <w:szCs w:val="28"/>
+          <w:lang w:val="fr-SN"/>
+        </w:rPr>
+        <w:t>Pour le résultat, utilise uniquement :</w:t>
+      </w:r>
+    </w:p>
+    <w:p>
+      <w:pPr>
+        <w:rPr>
+          <w:color w:val="000000" w:themeColor="text1"/>
+          <w:sz w:val="28"/>
+          <w:szCs w:val="28"/>
+          <w:lang w:val="fr-SN"/>
+        </w:rPr>
+      </w:pPr>
+      <w:r>
+        <w:rPr>
+          <w:color w:val="000000" w:themeColor="text1"/>
+          <w:sz w:val="28"/>
+          <w:szCs w:val="28"/>
+          <w:lang w:val="fr-SN"/>
+        </w:rPr>
+        <w:t>- conforme ;</w:t>
+      </w:r>
+    </w:p>
+    <w:p>
+      <w:pPr>
+        <w:rPr>
+          <w:color w:val="000000" w:themeColor="text1"/>
+          <w:sz w:val="28"/>
+          <w:szCs w:val="28"/>
+          <w:lang w:val="fr-SN"/>
+        </w:rPr>
+      </w:pPr>
+      <w:r>
+        <w:rPr>
+          <w:color w:val="000000" w:themeColor="text1"/>
+          <w:sz w:val="28"/>
+          <w:szCs w:val="28"/>
+          <w:lang w:val="fr-SN"/>
+        </w:rPr>
+        <w:t>- non conforme ;</w:t>
+      </w:r>
+    </w:p>
+    <w:p>
+      <w:pPr>
+        <w:rPr>
+          <w:color w:val="806000" w:themeColor="accent4" w:themeShade="80"/>
+          <w:sz w:val="28"/>
+          <w:szCs w:val="28"/>
+          <w:lang w:val="fr-SN"/>
+        </w:rPr>
+      </w:pPr>
+      <w:r>
+        <w:rPr>
+          <w:color w:val="000000" w:themeColor="text1"/>
+          <w:sz w:val="28"/>
+          <w:szCs w:val="28"/>
+          <w:lang w:val="fr-SN"/>
+        </w:rPr>
+        <w:t xml:space="preserve">- information non </w:t>
+      </w:r>
+      <w:proofErr w:type="gramStart"/>
+      <w:r>
+        <w:rPr>
+          <w:color w:val="000000" w:themeColor="text1"/>
+          <w:sz w:val="28"/>
+          <w:szCs w:val="28"/>
+          <w:lang w:val="fr-SN"/>
+        </w:rPr>
+        <w:t>disponible</w:t>
+      </w:r>
+      <w:r>
+        <w:rPr>
+          <w:color w:val="806000" w:themeColor="accent4" w:themeShade="80"/>
+          <w:sz w:val="28"/>
+          <w:szCs w:val="28"/>
+          <w:lang w:val="fr-SN"/>
+        </w:rPr>
+        <w:t>.</w:t>
+      </w:r>
+      <w:r>
+        <w:rPr>
+          <w:color w:val="806000" w:themeColor="accent4" w:themeShade="80"/>
+          <w:sz w:val="28"/>
+          <w:szCs w:val="28"/>
+          <w:lang w:val="fr-SN"/>
+        </w:rPr>
+        <w:t>`</w:t>
+      </w:r>
+      <w:proofErr w:type="gramEnd"/>
+      <w:r>
+        <w:rPr>
+          <w:color w:val="806000" w:themeColor="accent4" w:themeShade="80"/>
+          <w:sz w:val="28"/>
+          <w:szCs w:val="28"/>
+          <w:lang w:val="fr-SN"/>
+        </w:rPr>
+        <w:t>``</w:t>
+      </w:r>
+    </w:p>
+    <w:p>
+      <w:pPr>
+        <w:rPr>
+          <w:color w:val="4472C4" w:themeColor="accent1"/>
+          <w:sz w:val="28"/>
+          <w:szCs w:val="28"/>
+          <w:lang w:val="fr-SN"/>
+        </w:rPr>
+      </w:pPr>
+      <w:proofErr w:type="spellStart"/>
+      <w:r>
+        <w:rPr>
+          <w:color w:val="4472C4" w:themeColor="accent1"/>
+          <w:sz w:val="28"/>
+          <w:szCs w:val="28"/>
+          <w:lang w:val="fr-SN"/>
+        </w:rPr>
+        <w:t>Reponse</w:t>
+      </w:r>
+      <w:proofErr w:type="spellEnd"/>
+      <w:r>
+        <w:rPr>
+          <w:color w:val="4472C4" w:themeColor="accent1"/>
+          <w:sz w:val="28"/>
+          <w:szCs w:val="28"/>
+          <w:lang w:val="fr-SN"/>
+        </w:rPr>
+        <w:t xml:space="preserve"> du LLM :</w:t>
+      </w:r>
+    </w:p>
+    <w:tbl>
+      <w:tblPr>
+        <w:tblW w:w="5000" w:type="pct"/>
+        <w:tblCellMar>
+          <w:top w:w="15" w:type="dxa"/>
+          <w:left w:w="15" w:type="dxa"/>
+          <w:bottom w:w="15" w:type="dxa"/>
+          <w:right w:w="15" w:type="dxa"/>
+        </w:tblCellMar>
+        <w:tblLook w:val="04A0" w:firstRow="1" w:lastRow="0" w:firstColumn="1" w:lastColumn="0" w:noHBand="0" w:noVBand="1"/>
+      </w:tblPr>
+      <w:tblGrid>
+        <w:gridCol w:w="1932"/>
+        <w:gridCol w:w="979"/>
+        <w:gridCol w:w="3090"/>
+        <w:gridCol w:w="3055"/>
+      </w:tblGrid>
+      <w:tr>
+        <w:trPr>
+          <w:tblHeader/>
+        </w:trPr>
+        <w:tc>
+          <w:tcPr>
+            <w:tcW w:w="0" w:type="auto"/>
+            <w:tcBorders>
+              <w:top w:val="single" w:sz="6" w:space="0" w:color="DDDDDD"/>
+              <w:left w:val="single" w:sz="6" w:space="0" w:color="DDDDDD"/>
+              <w:bottom w:val="single" w:sz="6" w:space="0" w:color="DDDDDD"/>
+              <w:right w:val="single" w:sz="6" w:space="0" w:color="DDDDDD"/>
+            </w:tcBorders>
+            <w:shd w:val="clear" w:color="auto" w:fill="F2F2F2"/>
+            <w:tcMar>
+              <w:top w:w="120" w:type="dxa"/>
+              <w:left w:w="120" w:type="dxa"/>
+              <w:bottom w:w="120" w:type="dxa"/>
+              <w:right w:w="120" w:type="dxa"/>
+            </w:tcMar>
+            <w:vAlign w:val="center"/>
+            <w:hideMark/>
+          </w:tcPr>
+          <w:p>
+            <w:pPr>
+              <w:rPr>
+                <w:b/>
+                <w:bCs/>
+                <w:color w:val="4472C4" w:themeColor="accent1"/>
+                <w:sz w:val="18"/>
+                <w:szCs w:val="18"/>
+                <w:lang w:val="fr-SN"/>
+              </w:rPr>
+            </w:pPr>
+            <w:r>
+              <w:rPr>
+                <w:b/>
+                <w:bCs/>
+                <w:color w:val="4472C4" w:themeColor="accent1"/>
+                <w:sz w:val="18"/>
+                <w:szCs w:val="18"/>
+                <w:lang w:val="fr-SN"/>
+              </w:rPr>
+              <w:t>Élément vérifié</w:t>
+            </w:r>
+          </w:p>
+        </w:tc>
+        <w:tc>
+          <w:tcPr>
+            <w:tcW w:w="0" w:type="auto"/>
+            <w:tcBorders>
+              <w:top w:val="single" w:sz="6" w:space="0" w:color="DDDDDD"/>
+              <w:left w:val="single" w:sz="6" w:space="0" w:color="DDDDDD"/>
+              <w:bottom w:val="single" w:sz="6" w:space="0" w:color="DDDDDD"/>
+              <w:right w:val="single" w:sz="6" w:space="0" w:color="DDDDDD"/>
+            </w:tcBorders>
+            <w:shd w:val="clear" w:color="auto" w:fill="F2F2F2"/>
+            <w:tcMar>
+              <w:top w:w="120" w:type="dxa"/>
+              <w:left w:w="120" w:type="dxa"/>
+              <w:bottom w:w="120" w:type="dxa"/>
+              <w:right w:w="120" w:type="dxa"/>
+            </w:tcMar>
+            <w:vAlign w:val="center"/>
+            <w:hideMark/>
+          </w:tcPr>
+          <w:p>
+            <w:pPr>
+              <w:rPr>
+                <w:b/>
+                <w:bCs/>
+                <w:color w:val="4472C4" w:themeColor="accent1"/>
+                <w:sz w:val="18"/>
+                <w:szCs w:val="18"/>
+                <w:lang w:val="fr-SN"/>
+              </w:rPr>
+            </w:pPr>
+            <w:r>
+              <w:rPr>
+                <w:b/>
+                <w:bCs/>
+                <w:color w:val="4472C4" w:themeColor="accent1"/>
+                <w:sz w:val="18"/>
+                <w:szCs w:val="18"/>
+                <w:lang w:val="fr-SN"/>
+              </w:rPr>
+              <w:t>Résultat</w:t>
+            </w:r>
+          </w:p>
+        </w:tc>
+        <w:tc>
+          <w:tcPr>
+            <w:tcW w:w="0" w:type="auto"/>
+            <w:tcBorders>
+              <w:top w:val="single" w:sz="6" w:space="0" w:color="DDDDDD"/>
+              <w:left w:val="single" w:sz="6" w:space="0" w:color="DDDDDD"/>
+              <w:bottom w:val="single" w:sz="6" w:space="0" w:color="DDDDDD"/>
+              <w:right w:val="single" w:sz="6" w:space="0" w:color="DDDDDD"/>
+            </w:tcBorders>
+            <w:shd w:val="clear" w:color="auto" w:fill="F2F2F2"/>
+            <w:tcMar>
+              <w:top w:w="120" w:type="dxa"/>
+              <w:left w:w="120" w:type="dxa"/>
+              <w:bottom w:w="120" w:type="dxa"/>
+              <w:right w:w="120" w:type="dxa"/>
+            </w:tcMar>
+            <w:vAlign w:val="center"/>
+            <w:hideMark/>
+          </w:tcPr>
+          <w:p>
+            <w:pPr>
+              <w:rPr>
+                <w:b/>
+                <w:bCs/>
+                <w:color w:val="4472C4" w:themeColor="accent1"/>
+                <w:sz w:val="18"/>
+                <w:szCs w:val="18"/>
+                <w:lang w:val="fr-SN"/>
+              </w:rPr>
+            </w:pPr>
+            <w:r>
+              <w:rPr>
+                <w:b/>
+                <w:bCs/>
+                <w:color w:val="4472C4" w:themeColor="accent1"/>
+                <w:sz w:val="18"/>
+                <w:szCs w:val="18"/>
+                <w:lang w:val="fr-SN"/>
+              </w:rPr>
+              <w:t>Justification</w:t>
+            </w:r>
+          </w:p>
+        </w:tc>
+        <w:tc>
+          <w:tcPr>
+            <w:tcW w:w="0" w:type="auto"/>
+            <w:tcBorders>
+              <w:top w:val="single" w:sz="6" w:space="0" w:color="DDDDDD"/>
+              <w:left w:val="single" w:sz="6" w:space="0" w:color="DDDDDD"/>
+              <w:bottom w:val="single" w:sz="6" w:space="0" w:color="DDDDDD"/>
+              <w:right w:val="single" w:sz="6" w:space="0" w:color="DDDDDD"/>
+            </w:tcBorders>
+            <w:shd w:val="clear" w:color="auto" w:fill="F2F2F2"/>
+            <w:tcMar>
+              <w:top w:w="120" w:type="dxa"/>
+              <w:left w:w="120" w:type="dxa"/>
+              <w:bottom w:w="120" w:type="dxa"/>
+              <w:right w:w="120" w:type="dxa"/>
+            </w:tcMar>
+            <w:vAlign w:val="center"/>
+            <w:hideMark/>
+          </w:tcPr>
+          <w:p>
+            <w:pPr>
+              <w:rPr>
+                <w:b/>
+                <w:bCs/>
+                <w:color w:val="4472C4" w:themeColor="accent1"/>
+                <w:sz w:val="18"/>
+                <w:szCs w:val="18"/>
+                <w:lang w:val="fr-SN"/>
+              </w:rPr>
+            </w:pPr>
+            <w:r>
+              <w:rPr>
+                <w:b/>
+                <w:bCs/>
+                <w:color w:val="4472C4" w:themeColor="accent1"/>
+                <w:sz w:val="18"/>
+                <w:szCs w:val="18"/>
+                <w:lang w:val="fr-SN"/>
+              </w:rPr>
+              <w:t>Correction nécessaire</w:t>
+            </w:r>
+          </w:p>
+        </w:tc>
+      </w:tr>
+      <w:tr>
+        <w:tc>
+          <w:tcPr>
+            <w:tcW w:w="0" w:type="auto"/>
+            <w:tcBorders>
+              <w:top w:val="single" w:sz="6" w:space="0" w:color="DDDDDD"/>
+              <w:left w:val="single" w:sz="6" w:space="0" w:color="DDDDDD"/>
+              <w:bottom w:val="single" w:sz="6" w:space="0" w:color="DDDDDD"/>
+              <w:right w:val="single" w:sz="6" w:space="0" w:color="DDDDDD"/>
+            </w:tcBorders>
+            <w:tcMar>
+              <w:top w:w="120" w:type="dxa"/>
+              <w:left w:w="120" w:type="dxa"/>
+              <w:bottom w:w="120" w:type="dxa"/>
+              <w:right w:w="120" w:type="dxa"/>
+            </w:tcMar>
+            <w:vAlign w:val="center"/>
+            <w:hideMark/>
+          </w:tcPr>
+          <w:p>
+            <w:pPr>
+              <w:rPr>
+                <w:color w:val="4472C4" w:themeColor="accent1"/>
+                <w:sz w:val="18"/>
+                <w:szCs w:val="18"/>
+                <w:lang w:val="fr-SN"/>
+              </w:rPr>
+            </w:pPr>
+            <w:r>
+              <w:rPr>
+                <w:color w:val="4472C4" w:themeColor="accent1"/>
+                <w:sz w:val="18"/>
+                <w:szCs w:val="18"/>
+                <w:lang w:val="fr-SN"/>
+              </w:rPr>
+              <w:t>Problèmes listés sont tous présents dans les avis</w:t>
+            </w:r>
+          </w:p>
+        </w:tc>
+        <w:tc>
+          <w:tcPr>
+            <w:tcW w:w="0" w:type="auto"/>
+            <w:tcBorders>
+              <w:top w:val="single" w:sz="6" w:space="0" w:color="DDDDDD"/>
+              <w:left w:val="single" w:sz="6" w:space="0" w:color="DDDDDD"/>
+              <w:bottom w:val="single" w:sz="6" w:space="0" w:color="DDDDDD"/>
+              <w:right w:val="single" w:sz="6" w:space="0" w:color="DDDDDD"/>
+            </w:tcBorders>
+            <w:tcMar>
+              <w:top w:w="120" w:type="dxa"/>
+              <w:left w:w="120" w:type="dxa"/>
+              <w:bottom w:w="120" w:type="dxa"/>
+              <w:right w:w="120" w:type="dxa"/>
+            </w:tcMar>
+            <w:vAlign w:val="center"/>
+            <w:hideMark/>
+          </w:tcPr>
+          <w:p>
+            <w:pPr>
+              <w:rPr>
+                <w:color w:val="4472C4" w:themeColor="accent1"/>
+                <w:sz w:val="18"/>
+                <w:szCs w:val="18"/>
+                <w:lang w:val="fr-SN"/>
+              </w:rPr>
+            </w:pPr>
+            <w:proofErr w:type="gramStart"/>
+            <w:r>
+              <w:rPr>
+                <w:color w:val="4472C4" w:themeColor="accent1"/>
+                <w:sz w:val="18"/>
+                <w:szCs w:val="18"/>
+                <w:lang w:val="fr-SN"/>
+              </w:rPr>
+              <w:t>conforme</w:t>
+            </w:r>
+            <w:proofErr w:type="gramEnd"/>
+          </w:p>
+        </w:tc>
+        <w:tc>
+          <w:tcPr>
+            <w:tcW w:w="0" w:type="auto"/>
+            <w:tcBorders>
+              <w:top w:val="single" w:sz="6" w:space="0" w:color="DDDDDD"/>
+              <w:left w:val="single" w:sz="6" w:space="0" w:color="DDDDDD"/>
+              <w:bottom w:val="single" w:sz="6" w:space="0" w:color="DDDDDD"/>
+              <w:right w:val="single" w:sz="6" w:space="0" w:color="DDDDDD"/>
+            </w:tcBorders>
+            <w:tcMar>
+              <w:top w:w="120" w:type="dxa"/>
+              <w:left w:w="120" w:type="dxa"/>
+              <w:bottom w:w="120" w:type="dxa"/>
+              <w:right w:w="120" w:type="dxa"/>
+            </w:tcMar>
+            <w:vAlign w:val="center"/>
+            <w:hideMark/>
+          </w:tcPr>
+          <w:p>
+            <w:pPr>
+              <w:rPr>
+                <w:color w:val="4472C4" w:themeColor="accent1"/>
+                <w:sz w:val="18"/>
+                <w:szCs w:val="18"/>
+                <w:lang w:val="fr-SN"/>
+              </w:rPr>
+            </w:pPr>
+            <w:r>
+              <w:rPr>
+                <w:color w:val="4472C4" w:themeColor="accent1"/>
+                <w:sz w:val="18"/>
+                <w:szCs w:val="18"/>
+                <w:lang w:val="fr-SN"/>
+              </w:rPr>
+              <w:t>Chaque problème (retard livraison, suivi non mis à jour, application difficile, service client ne répond pas) est explicitement mentionné dans au moins un avis.</w:t>
+            </w:r>
+          </w:p>
+        </w:tc>
+        <w:tc>
+          <w:tcPr>
+            <w:tcW w:w="0" w:type="auto"/>
+            <w:tcBorders>
+              <w:top w:val="single" w:sz="6" w:space="0" w:color="DDDDDD"/>
+              <w:left w:val="single" w:sz="6" w:space="0" w:color="DDDDDD"/>
+              <w:bottom w:val="single" w:sz="6" w:space="0" w:color="DDDDDD"/>
+              <w:right w:val="single" w:sz="6" w:space="0" w:color="DDDDDD"/>
+            </w:tcBorders>
+            <w:tcMar>
+              <w:top w:w="120" w:type="dxa"/>
+              <w:left w:w="120" w:type="dxa"/>
+              <w:bottom w:w="120" w:type="dxa"/>
+              <w:right w:w="120" w:type="dxa"/>
+            </w:tcMar>
+            <w:vAlign w:val="center"/>
+            <w:hideMark/>
+          </w:tcPr>
+          <w:p>
+            <w:pPr>
+              <w:rPr>
+                <w:color w:val="4472C4" w:themeColor="accent1"/>
+                <w:sz w:val="18"/>
+                <w:szCs w:val="18"/>
+                <w:lang w:val="fr-SN"/>
+              </w:rPr>
+            </w:pPr>
+            <w:r>
+              <w:rPr>
+                <w:color w:val="4472C4" w:themeColor="accent1"/>
+                <w:sz w:val="18"/>
+                <w:szCs w:val="18"/>
+                <w:lang w:val="fr-SN"/>
+              </w:rPr>
+              <w:t>Aucune</w:t>
+            </w:r>
+          </w:p>
+        </w:tc>
+      </w:tr>
+      <w:tr>
+        <w:tc>
+          <w:tcPr>
+            <w:tcW w:w="0" w:type="auto"/>
+            <w:tcBorders>
+              <w:top w:val="single" w:sz="6" w:space="0" w:color="DDDDDD"/>
+              <w:left w:val="single" w:sz="6" w:space="0" w:color="DDDDDD"/>
+              <w:bottom w:val="single" w:sz="6" w:space="0" w:color="DDDDDD"/>
+              <w:right w:val="single" w:sz="6" w:space="0" w:color="DDDDDD"/>
+            </w:tcBorders>
+            <w:tcMar>
+              <w:top w:w="120" w:type="dxa"/>
+              <w:left w:w="120" w:type="dxa"/>
+              <w:bottom w:w="120" w:type="dxa"/>
+              <w:right w:w="120" w:type="dxa"/>
+            </w:tcMar>
+            <w:vAlign w:val="center"/>
+            <w:hideMark/>
+          </w:tcPr>
+          <w:p>
+            <w:pPr>
+              <w:rPr>
+                <w:color w:val="4472C4" w:themeColor="accent1"/>
+                <w:sz w:val="18"/>
+                <w:szCs w:val="18"/>
+                <w:lang w:val="fr-SN"/>
+              </w:rPr>
+            </w:pPr>
+            <w:r>
+              <w:rPr>
+                <w:color w:val="4472C4" w:themeColor="accent1"/>
+                <w:sz w:val="18"/>
+                <w:szCs w:val="18"/>
+                <w:lang w:val="fr-SN"/>
+              </w:rPr>
+              <w:t>Fréquence (nombre d’avis par problème)</w:t>
+            </w:r>
+          </w:p>
+        </w:tc>
+        <w:tc>
+          <w:tcPr>
+            <w:tcW w:w="0" w:type="auto"/>
+            <w:tcBorders>
+              <w:top w:val="single" w:sz="6" w:space="0" w:color="DDDDDD"/>
+              <w:left w:val="single" w:sz="6" w:space="0" w:color="DDDDDD"/>
+              <w:bottom w:val="single" w:sz="6" w:space="0" w:color="DDDDDD"/>
+              <w:right w:val="single" w:sz="6" w:space="0" w:color="DDDDDD"/>
+            </w:tcBorders>
+            <w:tcMar>
+              <w:top w:w="120" w:type="dxa"/>
+              <w:left w:w="120" w:type="dxa"/>
+              <w:bottom w:w="120" w:type="dxa"/>
+              <w:right w:w="120" w:type="dxa"/>
+            </w:tcMar>
+            <w:vAlign w:val="center"/>
+            <w:hideMark/>
+          </w:tcPr>
+          <w:p>
+            <w:pPr>
+              <w:rPr>
+                <w:color w:val="4472C4" w:themeColor="accent1"/>
+                <w:sz w:val="18"/>
+                <w:szCs w:val="18"/>
+                <w:lang w:val="fr-SN"/>
+              </w:rPr>
+            </w:pPr>
+            <w:proofErr w:type="gramStart"/>
+            <w:r>
+              <w:rPr>
+                <w:color w:val="4472C4" w:themeColor="accent1"/>
+                <w:sz w:val="18"/>
+                <w:szCs w:val="18"/>
+                <w:lang w:val="fr-SN"/>
+              </w:rPr>
+              <w:t>conforme</w:t>
+            </w:r>
+            <w:proofErr w:type="gramEnd"/>
+          </w:p>
+        </w:tc>
+        <w:tc>
+          <w:tcPr>
+            <w:tcW w:w="0" w:type="auto"/>
+            <w:tcBorders>
+              <w:top w:val="single" w:sz="6" w:space="0" w:color="DDDDDD"/>
+              <w:left w:val="single" w:sz="6" w:space="0" w:color="DDDDDD"/>
+              <w:bottom w:val="single" w:sz="6" w:space="0" w:color="DDDDDD"/>
+              <w:right w:val="single" w:sz="6" w:space="0" w:color="DDDDDD"/>
+            </w:tcBorders>
+            <w:tcMar>
+              <w:top w:w="120" w:type="dxa"/>
+              <w:left w:w="120" w:type="dxa"/>
+              <w:bottom w:w="120" w:type="dxa"/>
+              <w:right w:w="120" w:type="dxa"/>
+            </w:tcMar>
+            <w:vAlign w:val="center"/>
+            <w:hideMark/>
+          </w:tcPr>
+          <w:p>
+            <w:pPr>
+              <w:rPr>
+                <w:color w:val="4472C4" w:themeColor="accent1"/>
+                <w:sz w:val="18"/>
+                <w:szCs w:val="18"/>
+                <w:lang w:val="fr-SN"/>
+              </w:rPr>
+            </w:pPr>
+            <w:r>
+              <w:rPr>
+                <w:color w:val="4472C4" w:themeColor="accent1"/>
+                <w:sz w:val="18"/>
+                <w:szCs w:val="18"/>
+                <w:lang w:val="fr-SN"/>
+              </w:rPr>
+              <w:t>Retard livraison = Avis 2 et 3 (2 avis) ; autres problèmes = 1 avis chacun.</w:t>
+            </w:r>
+          </w:p>
+        </w:tc>
+        <w:tc>
+          <w:tcPr>
+            <w:tcW w:w="0" w:type="auto"/>
+            <w:tcBorders>
+              <w:top w:val="single" w:sz="6" w:space="0" w:color="DDDDDD"/>
+              <w:left w:val="single" w:sz="6" w:space="0" w:color="DDDDDD"/>
+              <w:bottom w:val="single" w:sz="6" w:space="0" w:color="DDDDDD"/>
+              <w:right w:val="single" w:sz="6" w:space="0" w:color="DDDDDD"/>
+            </w:tcBorders>
+            <w:tcMar>
+              <w:top w:w="120" w:type="dxa"/>
+              <w:left w:w="120" w:type="dxa"/>
+              <w:bottom w:w="120" w:type="dxa"/>
+              <w:right w:w="120" w:type="dxa"/>
+            </w:tcMar>
+            <w:vAlign w:val="center"/>
+            <w:hideMark/>
+          </w:tcPr>
+          <w:p>
+            <w:pPr>
+              <w:rPr>
+                <w:color w:val="4472C4" w:themeColor="accent1"/>
+                <w:sz w:val="18"/>
+                <w:szCs w:val="18"/>
+                <w:lang w:val="fr-SN"/>
+              </w:rPr>
+            </w:pPr>
+            <w:r>
+              <w:rPr>
+                <w:color w:val="4472C4" w:themeColor="accent1"/>
+                <w:sz w:val="18"/>
+                <w:szCs w:val="18"/>
+                <w:lang w:val="fr-SN"/>
+              </w:rPr>
+              <w:t>Aucune</w:t>
+            </w:r>
+          </w:p>
+        </w:tc>
+      </w:tr>
+      <w:tr>
+        <w:tc>
+          <w:tcPr>
+            <w:tcW w:w="0" w:type="auto"/>
+            <w:tcBorders>
+              <w:top w:val="single" w:sz="6" w:space="0" w:color="DDDDDD"/>
+              <w:left w:val="single" w:sz="6" w:space="0" w:color="DDDDDD"/>
+              <w:bottom w:val="single" w:sz="6" w:space="0" w:color="DDDDDD"/>
+              <w:right w:val="single" w:sz="6" w:space="0" w:color="DDDDDD"/>
+            </w:tcBorders>
+            <w:tcMar>
+              <w:top w:w="120" w:type="dxa"/>
+              <w:left w:w="120" w:type="dxa"/>
+              <w:bottom w:w="120" w:type="dxa"/>
+              <w:right w:w="120" w:type="dxa"/>
+            </w:tcMar>
+            <w:vAlign w:val="center"/>
+            <w:hideMark/>
+          </w:tcPr>
+          <w:p>
+            <w:pPr>
+              <w:rPr>
+                <w:color w:val="4472C4" w:themeColor="accent1"/>
+                <w:sz w:val="18"/>
+                <w:szCs w:val="18"/>
+                <w:lang w:val="fr-SN"/>
+              </w:rPr>
+            </w:pPr>
+            <w:r>
+              <w:rPr>
+                <w:color w:val="4472C4" w:themeColor="accent1"/>
+                <w:sz w:val="18"/>
+                <w:szCs w:val="18"/>
+                <w:lang w:val="fr-SN"/>
+              </w:rPr>
+              <w:t>Priorités (élevée, moyenne, faible) utilisées uniquement</w:t>
+            </w:r>
+          </w:p>
+        </w:tc>
+        <w:tc>
+          <w:tcPr>
+            <w:tcW w:w="0" w:type="auto"/>
+            <w:tcBorders>
+              <w:top w:val="single" w:sz="6" w:space="0" w:color="DDDDDD"/>
+              <w:left w:val="single" w:sz="6" w:space="0" w:color="DDDDDD"/>
+              <w:bottom w:val="single" w:sz="6" w:space="0" w:color="DDDDDD"/>
+              <w:right w:val="single" w:sz="6" w:space="0" w:color="DDDDDD"/>
+            </w:tcBorders>
+            <w:tcMar>
+              <w:top w:w="120" w:type="dxa"/>
+              <w:left w:w="120" w:type="dxa"/>
+              <w:bottom w:w="120" w:type="dxa"/>
+              <w:right w:w="120" w:type="dxa"/>
+            </w:tcMar>
+            <w:vAlign w:val="center"/>
+            <w:hideMark/>
+          </w:tcPr>
+          <w:p>
+            <w:pPr>
+              <w:rPr>
+                <w:color w:val="4472C4" w:themeColor="accent1"/>
+                <w:sz w:val="18"/>
+                <w:szCs w:val="18"/>
+                <w:lang w:val="fr-SN"/>
+              </w:rPr>
+            </w:pPr>
+            <w:proofErr w:type="gramStart"/>
+            <w:r>
+              <w:rPr>
+                <w:color w:val="4472C4" w:themeColor="accent1"/>
+                <w:sz w:val="18"/>
+                <w:szCs w:val="18"/>
+                <w:lang w:val="fr-SN"/>
+              </w:rPr>
+              <w:t>conforme</w:t>
+            </w:r>
+            <w:proofErr w:type="gramEnd"/>
+          </w:p>
+        </w:tc>
+        <w:tc>
+          <w:tcPr>
+            <w:tcW w:w="0" w:type="auto"/>
+            <w:tcBorders>
+              <w:top w:val="single" w:sz="6" w:space="0" w:color="DDDDDD"/>
+              <w:left w:val="single" w:sz="6" w:space="0" w:color="DDDDDD"/>
+              <w:bottom w:val="single" w:sz="6" w:space="0" w:color="DDDDDD"/>
+              <w:right w:val="single" w:sz="6" w:space="0" w:color="DDDDDD"/>
+            </w:tcBorders>
+            <w:tcMar>
+              <w:top w:w="120" w:type="dxa"/>
+              <w:left w:w="120" w:type="dxa"/>
+              <w:bottom w:w="120" w:type="dxa"/>
+              <w:right w:w="120" w:type="dxa"/>
+            </w:tcMar>
+            <w:vAlign w:val="center"/>
+            <w:hideMark/>
+          </w:tcPr>
+          <w:p>
+            <w:pPr>
+              <w:rPr>
+                <w:color w:val="4472C4" w:themeColor="accent1"/>
+                <w:sz w:val="18"/>
+                <w:szCs w:val="18"/>
+                <w:lang w:val="fr-SN"/>
+              </w:rPr>
+            </w:pPr>
+            <w:r>
+              <w:rPr>
+                <w:color w:val="4472C4" w:themeColor="accent1"/>
+                <w:sz w:val="18"/>
+                <w:szCs w:val="18"/>
+                <w:lang w:val="fr-SN"/>
+              </w:rPr>
+              <w:t>Seules les valeurs « élevée », « moyenne », « faible » sont employées.</w:t>
+            </w:r>
+          </w:p>
+        </w:tc>
+        <w:tc>
+          <w:tcPr>
+            <w:tcW w:w="0" w:type="auto"/>
+            <w:tcBorders>
+              <w:top w:val="single" w:sz="6" w:space="0" w:color="DDDDDD"/>
+              <w:left w:val="single" w:sz="6" w:space="0" w:color="DDDDDD"/>
+              <w:bottom w:val="single" w:sz="6" w:space="0" w:color="DDDDDD"/>
+              <w:right w:val="single" w:sz="6" w:space="0" w:color="DDDDDD"/>
+            </w:tcBorders>
+            <w:tcMar>
+              <w:top w:w="120" w:type="dxa"/>
+              <w:left w:w="120" w:type="dxa"/>
+              <w:bottom w:w="120" w:type="dxa"/>
+              <w:right w:w="120" w:type="dxa"/>
+            </w:tcMar>
+            <w:vAlign w:val="center"/>
+            <w:hideMark/>
+          </w:tcPr>
+          <w:p>
+            <w:pPr>
+              <w:rPr>
+                <w:color w:val="4472C4" w:themeColor="accent1"/>
+                <w:sz w:val="18"/>
+                <w:szCs w:val="18"/>
+                <w:lang w:val="fr-SN"/>
+              </w:rPr>
+            </w:pPr>
+            <w:r>
+              <w:rPr>
+                <w:color w:val="4472C4" w:themeColor="accent1"/>
+                <w:sz w:val="18"/>
+                <w:szCs w:val="18"/>
+                <w:lang w:val="fr-SN"/>
+              </w:rPr>
+              <w:t>Aucune</w:t>
+            </w:r>
+          </w:p>
+        </w:tc>
+      </w:tr>
+      <w:tr>
+        <w:tc>
+          <w:tcPr>
+            <w:tcW w:w="0" w:type="auto"/>
+            <w:tcBorders>
+              <w:top w:val="single" w:sz="6" w:space="0" w:color="DDDDDD"/>
+              <w:left w:val="single" w:sz="6" w:space="0" w:color="DDDDDD"/>
+              <w:bottom w:val="single" w:sz="6" w:space="0" w:color="DDDDDD"/>
+              <w:right w:val="single" w:sz="6" w:space="0" w:color="DDDDDD"/>
+            </w:tcBorders>
+            <w:tcMar>
+              <w:top w:w="120" w:type="dxa"/>
+              <w:left w:w="120" w:type="dxa"/>
+              <w:bottom w:w="120" w:type="dxa"/>
+              <w:right w:w="120" w:type="dxa"/>
+            </w:tcMar>
+            <w:vAlign w:val="center"/>
+            <w:hideMark/>
+          </w:tcPr>
+          <w:p>
+            <w:pPr>
+              <w:rPr>
+                <w:color w:val="4472C4" w:themeColor="accent1"/>
+                <w:sz w:val="18"/>
+                <w:szCs w:val="18"/>
+                <w:lang w:val="fr-SN"/>
+              </w:rPr>
+            </w:pPr>
+            <w:r>
+              <w:rPr>
+                <w:color w:val="4472C4" w:themeColor="accent1"/>
+                <w:sz w:val="18"/>
+                <w:szCs w:val="18"/>
+                <w:lang w:val="fr-SN"/>
+              </w:rPr>
+              <w:t>Chaque problème est associé à au moins un avis</w:t>
+            </w:r>
+          </w:p>
+        </w:tc>
+        <w:tc>
+          <w:tcPr>
+            <w:tcW w:w="0" w:type="auto"/>
+            <w:tcBorders>
+              <w:top w:val="single" w:sz="6" w:space="0" w:color="DDDDDD"/>
+              <w:left w:val="single" w:sz="6" w:space="0" w:color="DDDDDD"/>
+              <w:bottom w:val="single" w:sz="6" w:space="0" w:color="DDDDDD"/>
+              <w:right w:val="single" w:sz="6" w:space="0" w:color="DDDDDD"/>
+            </w:tcBorders>
+            <w:tcMar>
+              <w:top w:w="120" w:type="dxa"/>
+              <w:left w:w="120" w:type="dxa"/>
+              <w:bottom w:w="120" w:type="dxa"/>
+              <w:right w:w="120" w:type="dxa"/>
+            </w:tcMar>
+            <w:vAlign w:val="center"/>
+            <w:hideMark/>
+          </w:tcPr>
+          <w:p>
+            <w:pPr>
+              <w:rPr>
+                <w:color w:val="4472C4" w:themeColor="accent1"/>
+                <w:sz w:val="18"/>
+                <w:szCs w:val="18"/>
+                <w:lang w:val="fr-SN"/>
+              </w:rPr>
+            </w:pPr>
+            <w:proofErr w:type="gramStart"/>
+            <w:r>
+              <w:rPr>
+                <w:color w:val="4472C4" w:themeColor="accent1"/>
+                <w:sz w:val="18"/>
+                <w:szCs w:val="18"/>
+                <w:lang w:val="fr-SN"/>
+              </w:rPr>
+              <w:t>conforme</w:t>
+            </w:r>
+            <w:proofErr w:type="gramEnd"/>
+          </w:p>
+        </w:tc>
+        <w:tc>
+          <w:tcPr>
+            <w:tcW w:w="0" w:type="auto"/>
+            <w:tcBorders>
+              <w:top w:val="single" w:sz="6" w:space="0" w:color="DDDDDD"/>
+              <w:left w:val="single" w:sz="6" w:space="0" w:color="DDDDDD"/>
+              <w:bottom w:val="single" w:sz="6" w:space="0" w:color="DDDDDD"/>
+              <w:right w:val="single" w:sz="6" w:space="0" w:color="DDDDDD"/>
+            </w:tcBorders>
+            <w:tcMar>
+              <w:top w:w="120" w:type="dxa"/>
+              <w:left w:w="120" w:type="dxa"/>
+              <w:bottom w:w="120" w:type="dxa"/>
+              <w:right w:w="120" w:type="dxa"/>
+            </w:tcMar>
+            <w:vAlign w:val="center"/>
+            <w:hideMark/>
+          </w:tcPr>
+          <w:p>
+            <w:pPr>
+              <w:rPr>
+                <w:color w:val="4472C4" w:themeColor="accent1"/>
+                <w:sz w:val="18"/>
+                <w:szCs w:val="18"/>
+                <w:lang w:val="fr-SN"/>
+              </w:rPr>
+            </w:pPr>
+            <w:r>
+              <w:rPr>
+                <w:color w:val="4472C4" w:themeColor="accent1"/>
+                <w:sz w:val="18"/>
+                <w:szCs w:val="18"/>
+                <w:lang w:val="fr-SN"/>
+              </w:rPr>
+              <w:t>La colonne « Avis concernés » liste correctement les avis pour chaque problème.</w:t>
+            </w:r>
+          </w:p>
+        </w:tc>
+        <w:tc>
+          <w:tcPr>
+            <w:tcW w:w="0" w:type="auto"/>
+            <w:tcBorders>
+              <w:top w:val="single" w:sz="6" w:space="0" w:color="DDDDDD"/>
+              <w:left w:val="single" w:sz="6" w:space="0" w:color="DDDDDD"/>
+              <w:bottom w:val="single" w:sz="6" w:space="0" w:color="DDDDDD"/>
+              <w:right w:val="single" w:sz="6" w:space="0" w:color="DDDDDD"/>
+            </w:tcBorders>
+            <w:tcMar>
+              <w:top w:w="120" w:type="dxa"/>
+              <w:left w:w="120" w:type="dxa"/>
+              <w:bottom w:w="120" w:type="dxa"/>
+              <w:right w:w="120" w:type="dxa"/>
+            </w:tcMar>
+            <w:vAlign w:val="center"/>
+            <w:hideMark/>
+          </w:tcPr>
+          <w:p>
+            <w:pPr>
+              <w:rPr>
+                <w:color w:val="4472C4" w:themeColor="accent1"/>
+                <w:sz w:val="18"/>
+                <w:szCs w:val="18"/>
+                <w:lang w:val="fr-SN"/>
+              </w:rPr>
+            </w:pPr>
+            <w:r>
+              <w:rPr>
+                <w:color w:val="4472C4" w:themeColor="accent1"/>
+                <w:sz w:val="18"/>
+                <w:szCs w:val="18"/>
+                <w:lang w:val="fr-SN"/>
+              </w:rPr>
+              <w:t>Aucune</w:t>
+            </w:r>
+          </w:p>
+        </w:tc>
+      </w:tr>
+      <w:tr>
+        <w:tc>
+          <w:tcPr>
+            <w:tcW w:w="0" w:type="auto"/>
+            <w:tcBorders>
+              <w:top w:val="single" w:sz="6" w:space="0" w:color="DDDDDD"/>
+              <w:left w:val="single" w:sz="6" w:space="0" w:color="DDDDDD"/>
+              <w:bottom w:val="single" w:sz="6" w:space="0" w:color="DDDDDD"/>
+              <w:right w:val="single" w:sz="6" w:space="0" w:color="DDDDDD"/>
+            </w:tcBorders>
+            <w:tcMar>
+              <w:top w:w="120" w:type="dxa"/>
+              <w:left w:w="120" w:type="dxa"/>
+              <w:bottom w:w="120" w:type="dxa"/>
+              <w:right w:w="120" w:type="dxa"/>
+            </w:tcMar>
+            <w:vAlign w:val="center"/>
+            <w:hideMark/>
+          </w:tcPr>
+          <w:p>
+            <w:pPr>
+              <w:rPr>
+                <w:color w:val="4472C4" w:themeColor="accent1"/>
+                <w:sz w:val="18"/>
+                <w:szCs w:val="18"/>
+                <w:lang w:val="fr-SN"/>
+              </w:rPr>
+            </w:pPr>
+            <w:r>
+              <w:rPr>
+                <w:color w:val="4472C4" w:themeColor="accent1"/>
+                <w:sz w:val="18"/>
+                <w:szCs w:val="18"/>
+                <w:lang w:val="fr-SN"/>
+              </w:rPr>
+              <w:t>Recommandations liées aux problèmes identifiés</w:t>
+            </w:r>
+          </w:p>
+        </w:tc>
+        <w:tc>
+          <w:tcPr>
+            <w:tcW w:w="0" w:type="auto"/>
+            <w:tcBorders>
+              <w:top w:val="single" w:sz="6" w:space="0" w:color="DDDDDD"/>
+              <w:left w:val="single" w:sz="6" w:space="0" w:color="DDDDDD"/>
+              <w:bottom w:val="single" w:sz="6" w:space="0" w:color="DDDDDD"/>
+              <w:right w:val="single" w:sz="6" w:space="0" w:color="DDDDDD"/>
+            </w:tcBorders>
+            <w:tcMar>
+              <w:top w:w="120" w:type="dxa"/>
+              <w:left w:w="120" w:type="dxa"/>
+              <w:bottom w:w="120" w:type="dxa"/>
+              <w:right w:w="120" w:type="dxa"/>
+            </w:tcMar>
+            <w:vAlign w:val="center"/>
+            <w:hideMark/>
+          </w:tcPr>
+          <w:p>
+            <w:pPr>
+              <w:rPr>
+                <w:color w:val="4472C4" w:themeColor="accent1"/>
+                <w:sz w:val="18"/>
+                <w:szCs w:val="18"/>
+                <w:lang w:val="fr-SN"/>
+              </w:rPr>
+            </w:pPr>
+            <w:proofErr w:type="gramStart"/>
+            <w:r>
+              <w:rPr>
+                <w:color w:val="4472C4" w:themeColor="accent1"/>
+                <w:sz w:val="18"/>
+                <w:szCs w:val="18"/>
+                <w:lang w:val="fr-SN"/>
+              </w:rPr>
+              <w:t>non</w:t>
+            </w:r>
+            <w:proofErr w:type="gramEnd"/>
+            <w:r>
+              <w:rPr>
+                <w:color w:val="4472C4" w:themeColor="accent1"/>
+                <w:sz w:val="18"/>
+                <w:szCs w:val="18"/>
+                <w:lang w:val="fr-SN"/>
+              </w:rPr>
+              <w:t xml:space="preserve"> conforme</w:t>
+            </w:r>
+          </w:p>
+        </w:tc>
+        <w:tc>
+          <w:tcPr>
+            <w:tcW w:w="0" w:type="auto"/>
+            <w:tcBorders>
+              <w:top w:val="single" w:sz="6" w:space="0" w:color="DDDDDD"/>
+              <w:left w:val="single" w:sz="6" w:space="0" w:color="DDDDDD"/>
+              <w:bottom w:val="single" w:sz="6" w:space="0" w:color="DDDDDD"/>
+              <w:right w:val="single" w:sz="6" w:space="0" w:color="DDDDDD"/>
+            </w:tcBorders>
+            <w:tcMar>
+              <w:top w:w="120" w:type="dxa"/>
+              <w:left w:w="120" w:type="dxa"/>
+              <w:bottom w:w="120" w:type="dxa"/>
+              <w:right w:w="120" w:type="dxa"/>
+            </w:tcMar>
+            <w:vAlign w:val="center"/>
+            <w:hideMark/>
+          </w:tcPr>
+          <w:p>
+            <w:pPr>
+              <w:rPr>
+                <w:color w:val="4472C4" w:themeColor="accent1"/>
+                <w:sz w:val="18"/>
+                <w:szCs w:val="18"/>
+                <w:lang w:val="fr-SN"/>
+              </w:rPr>
+            </w:pPr>
+            <w:r>
+              <w:rPr>
+                <w:color w:val="4472C4" w:themeColor="accent1"/>
+                <w:sz w:val="18"/>
+                <w:szCs w:val="18"/>
+                <w:lang w:val="fr-SN"/>
+              </w:rPr>
+              <w:t xml:space="preserve">Certaines recommandations supposent des causes ou solutions non écrites dans les avis (ex. « renforcer la planification logistique », « mise à jour automatique », « réviser l’ergonomie </w:t>
+            </w:r>
+            <w:r>
+              <w:rPr>
+                <w:color w:val="4472C4" w:themeColor="accent1"/>
+                <w:sz w:val="18"/>
+                <w:szCs w:val="18"/>
+                <w:lang w:val="fr-SN"/>
+              </w:rPr>
+              <w:lastRenderedPageBreak/>
+              <w:t>», « augmenter les canaux de contact »).</w:t>
+            </w:r>
+          </w:p>
+        </w:tc>
+        <w:tc>
+          <w:tcPr>
+            <w:tcW w:w="0" w:type="auto"/>
+            <w:tcBorders>
+              <w:top w:val="single" w:sz="6" w:space="0" w:color="DDDDDD"/>
+              <w:left w:val="single" w:sz="6" w:space="0" w:color="DDDDDD"/>
+              <w:bottom w:val="single" w:sz="6" w:space="0" w:color="DDDDDD"/>
+              <w:right w:val="single" w:sz="6" w:space="0" w:color="DDDDDD"/>
+            </w:tcBorders>
+            <w:tcMar>
+              <w:top w:w="120" w:type="dxa"/>
+              <w:left w:w="120" w:type="dxa"/>
+              <w:bottom w:w="120" w:type="dxa"/>
+              <w:right w:w="120" w:type="dxa"/>
+            </w:tcMar>
+            <w:vAlign w:val="center"/>
+            <w:hideMark/>
+          </w:tcPr>
+          <w:p>
+            <w:pPr>
+              <w:rPr>
+                <w:color w:val="4472C4" w:themeColor="accent1"/>
+                <w:sz w:val="18"/>
+                <w:szCs w:val="18"/>
+                <w:lang w:val="fr-SN"/>
+              </w:rPr>
+            </w:pPr>
+            <w:r>
+              <w:rPr>
+                <w:color w:val="4472C4" w:themeColor="accent1"/>
+                <w:sz w:val="18"/>
+                <w:szCs w:val="18"/>
+                <w:lang w:val="fr-SN"/>
+              </w:rPr>
+              <w:lastRenderedPageBreak/>
+              <w:t xml:space="preserve">Reformuler les recommandations pour rester dans le cadre des faits (ex. « améliorer la ponctualité des livraisons », « assurer la mise à jour du suivi », « simplifier l’application », « </w:t>
+            </w:r>
+            <w:r>
+              <w:rPr>
+                <w:color w:val="4472C4" w:themeColor="accent1"/>
+                <w:sz w:val="18"/>
+                <w:szCs w:val="18"/>
+                <w:lang w:val="fr-SN"/>
+              </w:rPr>
+              <w:lastRenderedPageBreak/>
+              <w:t>garantir une réponse du service client »).</w:t>
+            </w:r>
+          </w:p>
+        </w:tc>
+      </w:tr>
+      <w:tr>
+        <w:tc>
+          <w:tcPr>
+            <w:tcW w:w="0" w:type="auto"/>
+            <w:tcBorders>
+              <w:top w:val="single" w:sz="6" w:space="0" w:color="DDDDDD"/>
+              <w:left w:val="single" w:sz="6" w:space="0" w:color="DDDDDD"/>
+              <w:bottom w:val="single" w:sz="6" w:space="0" w:color="DDDDDD"/>
+              <w:right w:val="single" w:sz="6" w:space="0" w:color="DDDDDD"/>
+            </w:tcBorders>
+            <w:tcMar>
+              <w:top w:w="120" w:type="dxa"/>
+              <w:left w:w="120" w:type="dxa"/>
+              <w:bottom w:w="120" w:type="dxa"/>
+              <w:right w:w="120" w:type="dxa"/>
+            </w:tcMar>
+            <w:vAlign w:val="center"/>
+            <w:hideMark/>
+          </w:tcPr>
+          <w:p>
+            <w:pPr>
+              <w:rPr>
+                <w:color w:val="4472C4" w:themeColor="accent1"/>
+                <w:sz w:val="18"/>
+                <w:szCs w:val="18"/>
+                <w:lang w:val="fr-SN"/>
+              </w:rPr>
+            </w:pPr>
+            <w:r>
+              <w:rPr>
+                <w:color w:val="4472C4" w:themeColor="accent1"/>
+                <w:sz w:val="18"/>
+                <w:szCs w:val="18"/>
+                <w:lang w:val="fr-SN"/>
+              </w:rPr>
+              <w:lastRenderedPageBreak/>
+              <w:t>Présence de toutes les colonnes demandées</w:t>
+            </w:r>
+          </w:p>
+        </w:tc>
+        <w:tc>
+          <w:tcPr>
+            <w:tcW w:w="0" w:type="auto"/>
+            <w:tcBorders>
+              <w:top w:val="single" w:sz="6" w:space="0" w:color="DDDDDD"/>
+              <w:left w:val="single" w:sz="6" w:space="0" w:color="DDDDDD"/>
+              <w:bottom w:val="single" w:sz="6" w:space="0" w:color="DDDDDD"/>
+              <w:right w:val="single" w:sz="6" w:space="0" w:color="DDDDDD"/>
+            </w:tcBorders>
+            <w:tcMar>
+              <w:top w:w="120" w:type="dxa"/>
+              <w:left w:w="120" w:type="dxa"/>
+              <w:bottom w:w="120" w:type="dxa"/>
+              <w:right w:w="120" w:type="dxa"/>
+            </w:tcMar>
+            <w:vAlign w:val="center"/>
+            <w:hideMark/>
+          </w:tcPr>
+          <w:p>
+            <w:pPr>
+              <w:rPr>
+                <w:color w:val="4472C4" w:themeColor="accent1"/>
+                <w:sz w:val="18"/>
+                <w:szCs w:val="18"/>
+                <w:lang w:val="fr-SN"/>
+              </w:rPr>
+            </w:pPr>
+            <w:proofErr w:type="gramStart"/>
+            <w:r>
+              <w:rPr>
+                <w:color w:val="4472C4" w:themeColor="accent1"/>
+                <w:sz w:val="18"/>
+                <w:szCs w:val="18"/>
+                <w:lang w:val="fr-SN"/>
+              </w:rPr>
+              <w:t>conforme</w:t>
+            </w:r>
+            <w:proofErr w:type="gramEnd"/>
+          </w:p>
+        </w:tc>
+        <w:tc>
+          <w:tcPr>
+            <w:tcW w:w="0" w:type="auto"/>
+            <w:tcBorders>
+              <w:top w:val="single" w:sz="6" w:space="0" w:color="DDDDDD"/>
+              <w:left w:val="single" w:sz="6" w:space="0" w:color="DDDDDD"/>
+              <w:bottom w:val="single" w:sz="6" w:space="0" w:color="DDDDDD"/>
+              <w:right w:val="single" w:sz="6" w:space="0" w:color="DDDDDD"/>
+            </w:tcBorders>
+            <w:tcMar>
+              <w:top w:w="120" w:type="dxa"/>
+              <w:left w:w="120" w:type="dxa"/>
+              <w:bottom w:w="120" w:type="dxa"/>
+              <w:right w:w="120" w:type="dxa"/>
+            </w:tcMar>
+            <w:vAlign w:val="center"/>
+            <w:hideMark/>
+          </w:tcPr>
+          <w:p>
+            <w:pPr>
+              <w:rPr>
+                <w:color w:val="4472C4" w:themeColor="accent1"/>
+                <w:sz w:val="18"/>
+                <w:szCs w:val="18"/>
+                <w:lang w:val="fr-SN"/>
+              </w:rPr>
+            </w:pPr>
+            <w:r>
+              <w:rPr>
+                <w:color w:val="4472C4" w:themeColor="accent1"/>
+                <w:sz w:val="18"/>
+                <w:szCs w:val="18"/>
+                <w:lang w:val="fr-SN"/>
+              </w:rPr>
+              <w:t>Colonnes : Problème</w:t>
+            </w:r>
+          </w:p>
+        </w:tc>
+        <w:tc>
+          <w:tcPr>
+            <w:tcW w:w="0" w:type="auto"/>
+            <w:tcBorders>
+              <w:top w:val="single" w:sz="6" w:space="0" w:color="DDDDDD"/>
+              <w:left w:val="single" w:sz="6" w:space="0" w:color="DDDDDD"/>
+              <w:bottom w:val="single" w:sz="6" w:space="0" w:color="DDDDDD"/>
+              <w:right w:val="single" w:sz="6" w:space="0" w:color="DDDDDD"/>
+            </w:tcBorders>
+            <w:tcMar>
+              <w:top w:w="120" w:type="dxa"/>
+              <w:left w:w="120" w:type="dxa"/>
+              <w:bottom w:w="120" w:type="dxa"/>
+              <w:right w:w="120" w:type="dxa"/>
+            </w:tcMar>
+            <w:vAlign w:val="center"/>
+            <w:hideMark/>
+          </w:tcPr>
+          <w:p>
+            <w:pPr>
+              <w:rPr>
+                <w:color w:val="4472C4" w:themeColor="accent1"/>
+                <w:sz w:val="18"/>
+                <w:szCs w:val="18"/>
+                <w:lang w:val="fr-SN"/>
+              </w:rPr>
+            </w:pPr>
+            <w:r>
+              <w:rPr>
+                <w:color w:val="4472C4" w:themeColor="accent1"/>
+                <w:sz w:val="18"/>
+                <w:szCs w:val="18"/>
+                <w:lang w:val="fr-SN"/>
+              </w:rPr>
+              <w:t>Avis concernés</w:t>
+            </w:r>
+          </w:p>
+        </w:tc>
+      </w:tr>
+      <w:tr>
+        <w:tc>
+          <w:tcPr>
+            <w:tcW w:w="0" w:type="auto"/>
+            <w:tcBorders>
+              <w:top w:val="single" w:sz="6" w:space="0" w:color="DDDDDD"/>
+              <w:left w:val="single" w:sz="6" w:space="0" w:color="DDDDDD"/>
+              <w:bottom w:val="single" w:sz="6" w:space="0" w:color="DDDDDD"/>
+              <w:right w:val="single" w:sz="6" w:space="0" w:color="DDDDDD"/>
+            </w:tcBorders>
+            <w:tcMar>
+              <w:top w:w="120" w:type="dxa"/>
+              <w:left w:w="120" w:type="dxa"/>
+              <w:bottom w:w="120" w:type="dxa"/>
+              <w:right w:w="120" w:type="dxa"/>
+            </w:tcMar>
+            <w:vAlign w:val="center"/>
+            <w:hideMark/>
+          </w:tcPr>
+          <w:p>
+            <w:pPr>
+              <w:rPr>
+                <w:color w:val="4472C4" w:themeColor="accent1"/>
+                <w:sz w:val="18"/>
+                <w:szCs w:val="18"/>
+                <w:lang w:val="fr-SN"/>
+              </w:rPr>
+            </w:pPr>
+            <w:r>
+              <w:rPr>
+                <w:color w:val="4472C4" w:themeColor="accent1"/>
+                <w:sz w:val="18"/>
+                <w:szCs w:val="18"/>
+                <w:lang w:val="fr-SN"/>
+              </w:rPr>
+              <w:t>Réponse sous forme de tableau</w:t>
+            </w:r>
+          </w:p>
+        </w:tc>
+        <w:tc>
+          <w:tcPr>
+            <w:tcW w:w="0" w:type="auto"/>
+            <w:tcBorders>
+              <w:top w:val="single" w:sz="6" w:space="0" w:color="DDDDDD"/>
+              <w:left w:val="single" w:sz="6" w:space="0" w:color="DDDDDD"/>
+              <w:bottom w:val="single" w:sz="6" w:space="0" w:color="DDDDDD"/>
+              <w:right w:val="single" w:sz="6" w:space="0" w:color="DDDDDD"/>
+            </w:tcBorders>
+            <w:tcMar>
+              <w:top w:w="120" w:type="dxa"/>
+              <w:left w:w="120" w:type="dxa"/>
+              <w:bottom w:w="120" w:type="dxa"/>
+              <w:right w:w="120" w:type="dxa"/>
+            </w:tcMar>
+            <w:vAlign w:val="center"/>
+            <w:hideMark/>
+          </w:tcPr>
+          <w:p>
+            <w:pPr>
+              <w:rPr>
+                <w:color w:val="4472C4" w:themeColor="accent1"/>
+                <w:sz w:val="18"/>
+                <w:szCs w:val="18"/>
+                <w:lang w:val="fr-SN"/>
+              </w:rPr>
+            </w:pPr>
+            <w:proofErr w:type="gramStart"/>
+            <w:r>
+              <w:rPr>
+                <w:color w:val="4472C4" w:themeColor="accent1"/>
+                <w:sz w:val="18"/>
+                <w:szCs w:val="18"/>
+                <w:lang w:val="fr-SN"/>
+              </w:rPr>
+              <w:t>conforme</w:t>
+            </w:r>
+            <w:proofErr w:type="gramEnd"/>
+          </w:p>
+        </w:tc>
+        <w:tc>
+          <w:tcPr>
+            <w:tcW w:w="0" w:type="auto"/>
+            <w:tcBorders>
+              <w:top w:val="single" w:sz="6" w:space="0" w:color="DDDDDD"/>
+              <w:left w:val="single" w:sz="6" w:space="0" w:color="DDDDDD"/>
+              <w:bottom w:val="single" w:sz="6" w:space="0" w:color="DDDDDD"/>
+              <w:right w:val="single" w:sz="6" w:space="0" w:color="DDDDDD"/>
+            </w:tcBorders>
+            <w:tcMar>
+              <w:top w:w="120" w:type="dxa"/>
+              <w:left w:w="120" w:type="dxa"/>
+              <w:bottom w:w="120" w:type="dxa"/>
+              <w:right w:w="120" w:type="dxa"/>
+            </w:tcMar>
+            <w:vAlign w:val="center"/>
+            <w:hideMark/>
+          </w:tcPr>
+          <w:p>
+            <w:pPr>
+              <w:rPr>
+                <w:color w:val="4472C4" w:themeColor="accent1"/>
+                <w:sz w:val="18"/>
+                <w:szCs w:val="18"/>
+                <w:lang w:val="fr-SN"/>
+              </w:rPr>
+            </w:pPr>
+            <w:r>
+              <w:rPr>
+                <w:color w:val="4472C4" w:themeColor="accent1"/>
+                <w:sz w:val="18"/>
+                <w:szCs w:val="18"/>
+                <w:lang w:val="fr-SN"/>
+              </w:rPr>
+              <w:t>Le tableau est bien présenté.</w:t>
+            </w:r>
+          </w:p>
+        </w:tc>
+        <w:tc>
+          <w:tcPr>
+            <w:tcW w:w="0" w:type="auto"/>
+            <w:tcBorders>
+              <w:top w:val="single" w:sz="6" w:space="0" w:color="DDDDDD"/>
+              <w:left w:val="single" w:sz="6" w:space="0" w:color="DDDDDD"/>
+              <w:bottom w:val="single" w:sz="6" w:space="0" w:color="DDDDDD"/>
+              <w:right w:val="single" w:sz="6" w:space="0" w:color="DDDDDD"/>
+            </w:tcBorders>
+            <w:tcMar>
+              <w:top w:w="120" w:type="dxa"/>
+              <w:left w:w="120" w:type="dxa"/>
+              <w:bottom w:w="120" w:type="dxa"/>
+              <w:right w:w="120" w:type="dxa"/>
+            </w:tcMar>
+            <w:vAlign w:val="center"/>
+            <w:hideMark/>
+          </w:tcPr>
+          <w:p>
+            <w:pPr>
+              <w:rPr>
+                <w:color w:val="4472C4" w:themeColor="accent1"/>
+                <w:sz w:val="18"/>
+                <w:szCs w:val="18"/>
+                <w:lang w:val="fr-SN"/>
+              </w:rPr>
+            </w:pPr>
+            <w:r>
+              <w:rPr>
+                <w:color w:val="4472C4" w:themeColor="accent1"/>
+                <w:sz w:val="18"/>
+                <w:szCs w:val="18"/>
+                <w:lang w:val="fr-SN"/>
+              </w:rPr>
+              <w:t>Aucune</w:t>
+            </w:r>
+          </w:p>
+        </w:tc>
+      </w:tr>
+      <w:tr>
+        <w:tc>
+          <w:tcPr>
+            <w:tcW w:w="0" w:type="auto"/>
+            <w:tcBorders>
+              <w:top w:val="single" w:sz="6" w:space="0" w:color="DDDDDD"/>
+              <w:left w:val="single" w:sz="6" w:space="0" w:color="DDDDDD"/>
+              <w:bottom w:val="single" w:sz="6" w:space="0" w:color="DDDDDD"/>
+              <w:right w:val="single" w:sz="6" w:space="0" w:color="DDDDDD"/>
+            </w:tcBorders>
+            <w:tcMar>
+              <w:top w:w="120" w:type="dxa"/>
+              <w:left w:w="120" w:type="dxa"/>
+              <w:bottom w:w="120" w:type="dxa"/>
+              <w:right w:w="120" w:type="dxa"/>
+            </w:tcMar>
+            <w:vAlign w:val="center"/>
+            <w:hideMark/>
+          </w:tcPr>
+          <w:p>
+            <w:pPr>
+              <w:rPr>
+                <w:color w:val="4472C4" w:themeColor="accent1"/>
+                <w:sz w:val="18"/>
+                <w:szCs w:val="18"/>
+                <w:lang w:val="fr-SN"/>
+              </w:rPr>
+            </w:pPr>
+            <w:r>
+              <w:rPr>
+                <w:color w:val="4472C4" w:themeColor="accent1"/>
+                <w:sz w:val="18"/>
+                <w:szCs w:val="18"/>
+                <w:lang w:val="fr-SN"/>
+              </w:rPr>
+              <w:t>Hallucinations (causes, statistiques, explications non présentes)</w:t>
+            </w:r>
+          </w:p>
+        </w:tc>
+        <w:tc>
+          <w:tcPr>
+            <w:tcW w:w="0" w:type="auto"/>
+            <w:tcBorders>
+              <w:top w:val="single" w:sz="6" w:space="0" w:color="DDDDDD"/>
+              <w:left w:val="single" w:sz="6" w:space="0" w:color="DDDDDD"/>
+              <w:bottom w:val="single" w:sz="6" w:space="0" w:color="DDDDDD"/>
+              <w:right w:val="single" w:sz="6" w:space="0" w:color="DDDDDD"/>
+            </w:tcBorders>
+            <w:tcMar>
+              <w:top w:w="120" w:type="dxa"/>
+              <w:left w:w="120" w:type="dxa"/>
+              <w:bottom w:w="120" w:type="dxa"/>
+              <w:right w:w="120" w:type="dxa"/>
+            </w:tcMar>
+            <w:vAlign w:val="center"/>
+            <w:hideMark/>
+          </w:tcPr>
+          <w:p>
+            <w:pPr>
+              <w:rPr>
+                <w:color w:val="4472C4" w:themeColor="accent1"/>
+                <w:sz w:val="18"/>
+                <w:szCs w:val="18"/>
+                <w:lang w:val="fr-SN"/>
+              </w:rPr>
+            </w:pPr>
+            <w:proofErr w:type="gramStart"/>
+            <w:r>
+              <w:rPr>
+                <w:color w:val="4472C4" w:themeColor="accent1"/>
+                <w:sz w:val="18"/>
+                <w:szCs w:val="18"/>
+                <w:lang w:val="fr-SN"/>
+              </w:rPr>
+              <w:t>non</w:t>
+            </w:r>
+            <w:proofErr w:type="gramEnd"/>
+            <w:r>
+              <w:rPr>
+                <w:color w:val="4472C4" w:themeColor="accent1"/>
+                <w:sz w:val="18"/>
+                <w:szCs w:val="18"/>
+                <w:lang w:val="fr-SN"/>
+              </w:rPr>
+              <w:t xml:space="preserve"> conforme</w:t>
+            </w:r>
+          </w:p>
+        </w:tc>
+        <w:tc>
+          <w:tcPr>
+            <w:tcW w:w="0" w:type="auto"/>
+            <w:tcBorders>
+              <w:top w:val="single" w:sz="6" w:space="0" w:color="DDDDDD"/>
+              <w:left w:val="single" w:sz="6" w:space="0" w:color="DDDDDD"/>
+              <w:bottom w:val="single" w:sz="6" w:space="0" w:color="DDDDDD"/>
+              <w:right w:val="single" w:sz="6" w:space="0" w:color="DDDDDD"/>
+            </w:tcBorders>
+            <w:tcMar>
+              <w:top w:w="120" w:type="dxa"/>
+              <w:left w:w="120" w:type="dxa"/>
+              <w:bottom w:w="120" w:type="dxa"/>
+              <w:right w:w="120" w:type="dxa"/>
+            </w:tcMar>
+            <w:vAlign w:val="center"/>
+            <w:hideMark/>
+          </w:tcPr>
+          <w:p>
+            <w:pPr>
+              <w:rPr>
+                <w:color w:val="4472C4" w:themeColor="accent1"/>
+                <w:sz w:val="18"/>
+                <w:szCs w:val="18"/>
+                <w:lang w:val="fr-SN"/>
+              </w:rPr>
+            </w:pPr>
+            <w:r>
+              <w:rPr>
+                <w:color w:val="4472C4" w:themeColor="accent1"/>
+                <w:sz w:val="18"/>
+                <w:szCs w:val="18"/>
+                <w:lang w:val="fr-SN"/>
+              </w:rPr>
+              <w:t>Les recommandations introduisent des causes/solutions non écrites (logistique, automatisation, ergonomie, canaux).</w:t>
+            </w:r>
+          </w:p>
+        </w:tc>
+        <w:tc>
+          <w:tcPr>
+            <w:tcW w:w="0" w:type="auto"/>
+            <w:tcBorders>
+              <w:top w:val="single" w:sz="6" w:space="0" w:color="DDDDDD"/>
+              <w:left w:val="single" w:sz="6" w:space="0" w:color="DDDDDD"/>
+              <w:bottom w:val="single" w:sz="6" w:space="0" w:color="DDDDDD"/>
+              <w:right w:val="single" w:sz="6" w:space="0" w:color="DDDDDD"/>
+            </w:tcBorders>
+            <w:tcMar>
+              <w:top w:w="120" w:type="dxa"/>
+              <w:left w:w="120" w:type="dxa"/>
+              <w:bottom w:w="120" w:type="dxa"/>
+              <w:right w:w="120" w:type="dxa"/>
+            </w:tcMar>
+            <w:vAlign w:val="center"/>
+            <w:hideMark/>
+          </w:tcPr>
+          <w:p>
+            <w:pPr>
+              <w:rPr>
+                <w:color w:val="4472C4" w:themeColor="accent1"/>
+                <w:sz w:val="18"/>
+                <w:szCs w:val="18"/>
+                <w:lang w:val="fr-SN"/>
+              </w:rPr>
+            </w:pPr>
+            <w:r>
+              <w:rPr>
+                <w:color w:val="4472C4" w:themeColor="accent1"/>
+                <w:sz w:val="18"/>
+                <w:szCs w:val="18"/>
+                <w:lang w:val="fr-SN"/>
+              </w:rPr>
+              <w:t>Supprimer toute explication causale non présente ; garder uniquement des actions génériques liées au problème.</w:t>
+            </w:r>
+          </w:p>
+        </w:tc>
+      </w:tr>
+      <w:tr>
+        <w:tc>
+          <w:tcPr>
+            <w:tcW w:w="0" w:type="auto"/>
+            <w:tcBorders>
+              <w:top w:val="single" w:sz="6" w:space="0" w:color="DDDDDD"/>
+              <w:left w:val="single" w:sz="6" w:space="0" w:color="DDDDDD"/>
+              <w:bottom w:val="single" w:sz="6" w:space="0" w:color="DDDDDD"/>
+              <w:right w:val="single" w:sz="6" w:space="0" w:color="DDDDDD"/>
+            </w:tcBorders>
+            <w:tcMar>
+              <w:top w:w="120" w:type="dxa"/>
+              <w:left w:w="120" w:type="dxa"/>
+              <w:bottom w:w="120" w:type="dxa"/>
+              <w:right w:w="120" w:type="dxa"/>
+            </w:tcMar>
+            <w:vAlign w:val="center"/>
+            <w:hideMark/>
+          </w:tcPr>
+          <w:p>
+            <w:pPr>
+              <w:rPr>
+                <w:color w:val="4472C4" w:themeColor="accent1"/>
+                <w:sz w:val="18"/>
+                <w:szCs w:val="18"/>
+                <w:lang w:val="fr-SN"/>
+              </w:rPr>
+            </w:pPr>
+            <w:r>
+              <w:rPr>
+                <w:color w:val="4472C4" w:themeColor="accent1"/>
+                <w:sz w:val="18"/>
+                <w:szCs w:val="18"/>
+                <w:lang w:val="fr-SN"/>
+              </w:rPr>
+              <w:t>Informations absentes (éléments manquants)</w:t>
+            </w:r>
+          </w:p>
+        </w:tc>
+        <w:tc>
+          <w:tcPr>
+            <w:tcW w:w="0" w:type="auto"/>
+            <w:tcBorders>
+              <w:top w:val="single" w:sz="6" w:space="0" w:color="DDDDDD"/>
+              <w:left w:val="single" w:sz="6" w:space="0" w:color="DDDDDD"/>
+              <w:bottom w:val="single" w:sz="6" w:space="0" w:color="DDDDDD"/>
+              <w:right w:val="single" w:sz="6" w:space="0" w:color="DDDDDD"/>
+            </w:tcBorders>
+            <w:tcMar>
+              <w:top w:w="120" w:type="dxa"/>
+              <w:left w:w="120" w:type="dxa"/>
+              <w:bottom w:w="120" w:type="dxa"/>
+              <w:right w:w="120" w:type="dxa"/>
+            </w:tcMar>
+            <w:vAlign w:val="center"/>
+            <w:hideMark/>
+          </w:tcPr>
+          <w:p>
+            <w:pPr>
+              <w:rPr>
+                <w:color w:val="4472C4" w:themeColor="accent1"/>
+                <w:sz w:val="18"/>
+                <w:szCs w:val="18"/>
+                <w:lang w:val="fr-SN"/>
+              </w:rPr>
+            </w:pPr>
+            <w:proofErr w:type="gramStart"/>
+            <w:r>
+              <w:rPr>
+                <w:color w:val="4472C4" w:themeColor="accent1"/>
+                <w:sz w:val="18"/>
+                <w:szCs w:val="18"/>
+                <w:lang w:val="fr-SN"/>
+              </w:rPr>
+              <w:t>conforme</w:t>
+            </w:r>
+            <w:proofErr w:type="gramEnd"/>
+          </w:p>
+        </w:tc>
+        <w:tc>
+          <w:tcPr>
+            <w:tcW w:w="0" w:type="auto"/>
+            <w:tcBorders>
+              <w:top w:val="single" w:sz="6" w:space="0" w:color="DDDDDD"/>
+              <w:left w:val="single" w:sz="6" w:space="0" w:color="DDDDDD"/>
+              <w:bottom w:val="single" w:sz="6" w:space="0" w:color="DDDDDD"/>
+              <w:right w:val="single" w:sz="6" w:space="0" w:color="DDDDDD"/>
+            </w:tcBorders>
+            <w:tcMar>
+              <w:top w:w="120" w:type="dxa"/>
+              <w:left w:w="120" w:type="dxa"/>
+              <w:bottom w:w="120" w:type="dxa"/>
+              <w:right w:w="120" w:type="dxa"/>
+            </w:tcMar>
+            <w:vAlign w:val="center"/>
+            <w:hideMark/>
+          </w:tcPr>
+          <w:p>
+            <w:pPr>
+              <w:rPr>
+                <w:color w:val="4472C4" w:themeColor="accent1"/>
+                <w:sz w:val="18"/>
+                <w:szCs w:val="18"/>
+                <w:lang w:val="fr-SN"/>
+              </w:rPr>
+            </w:pPr>
+            <w:r>
+              <w:rPr>
+                <w:color w:val="4472C4" w:themeColor="accent1"/>
+                <w:sz w:val="18"/>
+                <w:szCs w:val="18"/>
+                <w:lang w:val="fr-SN"/>
+              </w:rPr>
+              <w:t>Tous les éléments demandés sont présents.</w:t>
+            </w:r>
+          </w:p>
+        </w:tc>
+        <w:tc>
+          <w:tcPr>
+            <w:tcW w:w="0" w:type="auto"/>
+            <w:tcBorders>
+              <w:top w:val="single" w:sz="6" w:space="0" w:color="DDDDDD"/>
+              <w:left w:val="single" w:sz="6" w:space="0" w:color="DDDDDD"/>
+              <w:bottom w:val="single" w:sz="6" w:space="0" w:color="DDDDDD"/>
+              <w:right w:val="single" w:sz="6" w:space="0" w:color="DDDDDD"/>
+            </w:tcBorders>
+            <w:tcMar>
+              <w:top w:w="120" w:type="dxa"/>
+              <w:left w:w="120" w:type="dxa"/>
+              <w:bottom w:w="120" w:type="dxa"/>
+              <w:right w:w="120" w:type="dxa"/>
+            </w:tcMar>
+            <w:vAlign w:val="center"/>
+            <w:hideMark/>
+          </w:tcPr>
+          <w:p>
+            <w:pPr>
+              <w:rPr>
+                <w:color w:val="4472C4" w:themeColor="accent1"/>
+                <w:sz w:val="18"/>
+                <w:szCs w:val="18"/>
+                <w:lang w:val="fr-SN"/>
+              </w:rPr>
+            </w:pPr>
+            <w:r>
+              <w:rPr>
+                <w:color w:val="4472C4" w:themeColor="accent1"/>
+                <w:sz w:val="18"/>
+                <w:szCs w:val="18"/>
+                <w:lang w:val="fr-SN"/>
+              </w:rPr>
+              <w:t>Aucune</w:t>
+            </w:r>
+          </w:p>
+        </w:tc>
+      </w:tr>
+      <w:tr>
+        <w:tc>
+          <w:tcPr>
+            <w:tcW w:w="0" w:type="auto"/>
+            <w:tcBorders>
+              <w:top w:val="single" w:sz="6" w:space="0" w:color="DDDDDD"/>
+              <w:left w:val="single" w:sz="6" w:space="0" w:color="DDDDDD"/>
+              <w:bottom w:val="single" w:sz="6" w:space="0" w:color="DDDDDD"/>
+              <w:right w:val="single" w:sz="6" w:space="0" w:color="DDDDDD"/>
+            </w:tcBorders>
+            <w:tcMar>
+              <w:top w:w="120" w:type="dxa"/>
+              <w:left w:w="120" w:type="dxa"/>
+              <w:bottom w:w="120" w:type="dxa"/>
+              <w:right w:w="120" w:type="dxa"/>
+            </w:tcMar>
+            <w:vAlign w:val="center"/>
+            <w:hideMark/>
+          </w:tcPr>
+          <w:p>
+            <w:pPr>
+              <w:rPr>
+                <w:color w:val="4472C4" w:themeColor="accent1"/>
+                <w:sz w:val="18"/>
+                <w:szCs w:val="18"/>
+                <w:lang w:val="fr-SN"/>
+              </w:rPr>
+            </w:pPr>
+            <w:r>
+              <w:rPr>
+                <w:color w:val="4472C4" w:themeColor="accent1"/>
+                <w:sz w:val="18"/>
+                <w:szCs w:val="18"/>
+                <w:lang w:val="fr-SN"/>
+              </w:rPr>
+              <w:t>Contradictions avec les avis</w:t>
+            </w:r>
+          </w:p>
+        </w:tc>
+        <w:tc>
+          <w:tcPr>
+            <w:tcW w:w="0" w:type="auto"/>
+            <w:tcBorders>
+              <w:top w:val="single" w:sz="6" w:space="0" w:color="DDDDDD"/>
+              <w:left w:val="single" w:sz="6" w:space="0" w:color="DDDDDD"/>
+              <w:bottom w:val="single" w:sz="6" w:space="0" w:color="DDDDDD"/>
+              <w:right w:val="single" w:sz="6" w:space="0" w:color="DDDDDD"/>
+            </w:tcBorders>
+            <w:tcMar>
+              <w:top w:w="120" w:type="dxa"/>
+              <w:left w:w="120" w:type="dxa"/>
+              <w:bottom w:w="120" w:type="dxa"/>
+              <w:right w:w="120" w:type="dxa"/>
+            </w:tcMar>
+            <w:vAlign w:val="center"/>
+            <w:hideMark/>
+          </w:tcPr>
+          <w:p>
+            <w:pPr>
+              <w:rPr>
+                <w:color w:val="4472C4" w:themeColor="accent1"/>
+                <w:sz w:val="18"/>
+                <w:szCs w:val="18"/>
+                <w:lang w:val="fr-SN"/>
+              </w:rPr>
+            </w:pPr>
+            <w:proofErr w:type="gramStart"/>
+            <w:r>
+              <w:rPr>
+                <w:color w:val="4472C4" w:themeColor="accent1"/>
+                <w:sz w:val="18"/>
+                <w:szCs w:val="18"/>
+                <w:lang w:val="fr-SN"/>
+              </w:rPr>
+              <w:t>conforme</w:t>
+            </w:r>
+            <w:proofErr w:type="gramEnd"/>
+          </w:p>
+        </w:tc>
+        <w:tc>
+          <w:tcPr>
+            <w:tcW w:w="0" w:type="auto"/>
+            <w:tcBorders>
+              <w:top w:val="single" w:sz="6" w:space="0" w:color="DDDDDD"/>
+              <w:left w:val="single" w:sz="6" w:space="0" w:color="DDDDDD"/>
+              <w:bottom w:val="single" w:sz="6" w:space="0" w:color="DDDDDD"/>
+              <w:right w:val="single" w:sz="6" w:space="0" w:color="DDDDDD"/>
+            </w:tcBorders>
+            <w:tcMar>
+              <w:top w:w="120" w:type="dxa"/>
+              <w:left w:w="120" w:type="dxa"/>
+              <w:bottom w:w="120" w:type="dxa"/>
+              <w:right w:w="120" w:type="dxa"/>
+            </w:tcMar>
+            <w:vAlign w:val="center"/>
+            <w:hideMark/>
+          </w:tcPr>
+          <w:p>
+            <w:pPr>
+              <w:rPr>
+                <w:color w:val="4472C4" w:themeColor="accent1"/>
+                <w:sz w:val="18"/>
+                <w:szCs w:val="18"/>
+                <w:lang w:val="fr-SN"/>
+              </w:rPr>
+            </w:pPr>
+            <w:r>
+              <w:rPr>
+                <w:color w:val="4472C4" w:themeColor="accent1"/>
+                <w:sz w:val="18"/>
+                <w:szCs w:val="18"/>
+                <w:lang w:val="fr-SN"/>
+              </w:rPr>
+              <w:t>Aucune affirmation ne contredit un avis.</w:t>
+            </w:r>
+          </w:p>
+        </w:tc>
+        <w:tc>
+          <w:tcPr>
+            <w:tcW w:w="0" w:type="auto"/>
+            <w:tcBorders>
+              <w:top w:val="single" w:sz="6" w:space="0" w:color="DDDDDD"/>
+              <w:left w:val="single" w:sz="6" w:space="0" w:color="DDDDDD"/>
+              <w:bottom w:val="single" w:sz="6" w:space="0" w:color="DDDDDD"/>
+              <w:right w:val="single" w:sz="6" w:space="0" w:color="DDDDDD"/>
+            </w:tcBorders>
+            <w:tcMar>
+              <w:top w:w="120" w:type="dxa"/>
+              <w:left w:w="120" w:type="dxa"/>
+              <w:bottom w:w="120" w:type="dxa"/>
+              <w:right w:w="120" w:type="dxa"/>
+            </w:tcMar>
+            <w:vAlign w:val="center"/>
+            <w:hideMark/>
+          </w:tcPr>
+          <w:p>
+            <w:pPr>
+              <w:rPr>
+                <w:color w:val="4472C4" w:themeColor="accent1"/>
+                <w:sz w:val="18"/>
+                <w:szCs w:val="18"/>
+                <w:lang w:val="fr-SN"/>
+              </w:rPr>
+            </w:pPr>
+            <w:r>
+              <w:rPr>
+                <w:color w:val="4472C4" w:themeColor="accent1"/>
+                <w:sz w:val="18"/>
+                <w:szCs w:val="18"/>
+                <w:lang w:val="fr-SN"/>
+              </w:rPr>
+              <w:t>Aucune</w:t>
+            </w:r>
+          </w:p>
+        </w:tc>
+      </w:tr>
+      <w:tr>
+        <w:tc>
+          <w:tcPr>
+            <w:tcW w:w="0" w:type="auto"/>
+            <w:tcBorders>
+              <w:top w:val="single" w:sz="6" w:space="0" w:color="DDDDDD"/>
+              <w:left w:val="single" w:sz="6" w:space="0" w:color="DDDDDD"/>
+              <w:bottom w:val="single" w:sz="6" w:space="0" w:color="DDDDDD"/>
+              <w:right w:val="single" w:sz="6" w:space="0" w:color="DDDDDD"/>
+            </w:tcBorders>
+            <w:tcMar>
+              <w:top w:w="120" w:type="dxa"/>
+              <w:left w:w="120" w:type="dxa"/>
+              <w:bottom w:w="120" w:type="dxa"/>
+              <w:right w:w="120" w:type="dxa"/>
+            </w:tcMar>
+            <w:vAlign w:val="center"/>
+            <w:hideMark/>
+          </w:tcPr>
+          <w:p>
+            <w:pPr>
+              <w:rPr>
+                <w:color w:val="4472C4" w:themeColor="accent1"/>
+                <w:sz w:val="18"/>
+                <w:szCs w:val="18"/>
+                <w:lang w:val="fr-SN"/>
+              </w:rPr>
+            </w:pPr>
+            <w:r>
+              <w:rPr>
+                <w:color w:val="4472C4" w:themeColor="accent1"/>
+                <w:sz w:val="18"/>
+                <w:szCs w:val="18"/>
+                <w:lang w:val="fr-SN"/>
+              </w:rPr>
+              <w:t>Contradictions internes (affirmations incompatibles)</w:t>
+            </w:r>
+          </w:p>
+        </w:tc>
+        <w:tc>
+          <w:tcPr>
+            <w:tcW w:w="0" w:type="auto"/>
+            <w:tcBorders>
+              <w:top w:val="single" w:sz="6" w:space="0" w:color="DDDDDD"/>
+              <w:left w:val="single" w:sz="6" w:space="0" w:color="DDDDDD"/>
+              <w:bottom w:val="single" w:sz="6" w:space="0" w:color="DDDDDD"/>
+              <w:right w:val="single" w:sz="6" w:space="0" w:color="DDDDDD"/>
+            </w:tcBorders>
+            <w:tcMar>
+              <w:top w:w="120" w:type="dxa"/>
+              <w:left w:w="120" w:type="dxa"/>
+              <w:bottom w:w="120" w:type="dxa"/>
+              <w:right w:w="120" w:type="dxa"/>
+            </w:tcMar>
+            <w:vAlign w:val="center"/>
+            <w:hideMark/>
+          </w:tcPr>
+          <w:p>
+            <w:pPr>
+              <w:rPr>
+                <w:color w:val="4472C4" w:themeColor="accent1"/>
+                <w:sz w:val="18"/>
+                <w:szCs w:val="18"/>
+                <w:lang w:val="fr-SN"/>
+              </w:rPr>
+            </w:pPr>
+            <w:proofErr w:type="gramStart"/>
+            <w:r>
+              <w:rPr>
+                <w:color w:val="4472C4" w:themeColor="accent1"/>
+                <w:sz w:val="18"/>
+                <w:szCs w:val="18"/>
+                <w:lang w:val="fr-SN"/>
+              </w:rPr>
+              <w:t>conforme</w:t>
+            </w:r>
+            <w:proofErr w:type="gramEnd"/>
+          </w:p>
+        </w:tc>
+        <w:tc>
+          <w:tcPr>
+            <w:tcW w:w="0" w:type="auto"/>
+            <w:tcBorders>
+              <w:top w:val="single" w:sz="6" w:space="0" w:color="DDDDDD"/>
+              <w:left w:val="single" w:sz="6" w:space="0" w:color="DDDDDD"/>
+              <w:bottom w:val="single" w:sz="6" w:space="0" w:color="DDDDDD"/>
+              <w:right w:val="single" w:sz="6" w:space="0" w:color="DDDDDD"/>
+            </w:tcBorders>
+            <w:tcMar>
+              <w:top w:w="120" w:type="dxa"/>
+              <w:left w:w="120" w:type="dxa"/>
+              <w:bottom w:w="120" w:type="dxa"/>
+              <w:right w:w="120" w:type="dxa"/>
+            </w:tcMar>
+            <w:vAlign w:val="center"/>
+            <w:hideMark/>
+          </w:tcPr>
+          <w:p>
+            <w:pPr>
+              <w:rPr>
+                <w:color w:val="4472C4" w:themeColor="accent1"/>
+                <w:sz w:val="18"/>
+                <w:szCs w:val="18"/>
+                <w:lang w:val="fr-SN"/>
+              </w:rPr>
+            </w:pPr>
+            <w:r>
+              <w:rPr>
+                <w:color w:val="4472C4" w:themeColor="accent1"/>
+                <w:sz w:val="18"/>
+                <w:szCs w:val="18"/>
+                <w:lang w:val="fr-SN"/>
+              </w:rPr>
+              <w:t>Aucune incompatibilité interne détectée.</w:t>
+            </w:r>
+          </w:p>
+        </w:tc>
+        <w:tc>
+          <w:tcPr>
+            <w:tcW w:w="0" w:type="auto"/>
+            <w:tcBorders>
+              <w:top w:val="single" w:sz="6" w:space="0" w:color="DDDDDD"/>
+              <w:left w:val="single" w:sz="6" w:space="0" w:color="DDDDDD"/>
+              <w:bottom w:val="single" w:sz="6" w:space="0" w:color="DDDDDD"/>
+              <w:right w:val="single" w:sz="6" w:space="0" w:color="DDDDDD"/>
+            </w:tcBorders>
+            <w:tcMar>
+              <w:top w:w="120" w:type="dxa"/>
+              <w:left w:w="120" w:type="dxa"/>
+              <w:bottom w:w="120" w:type="dxa"/>
+              <w:right w:w="120" w:type="dxa"/>
+            </w:tcMar>
+            <w:vAlign w:val="center"/>
+            <w:hideMark/>
+          </w:tcPr>
+          <w:p>
+            <w:pPr>
+              <w:rPr>
+                <w:color w:val="4472C4" w:themeColor="accent1"/>
+                <w:sz w:val="18"/>
+                <w:szCs w:val="18"/>
+                <w:lang w:val="fr-SN"/>
+              </w:rPr>
+            </w:pPr>
+            <w:r>
+              <w:rPr>
+                <w:color w:val="4472C4" w:themeColor="accent1"/>
+                <w:sz w:val="18"/>
+                <w:szCs w:val="18"/>
+                <w:lang w:val="fr-SN"/>
+              </w:rPr>
+              <w:t>Aucune</w:t>
+            </w:r>
+          </w:p>
+        </w:tc>
+      </w:tr>
+    </w:tbl>
+    <w:p>
+      <w:pPr>
+        <w:rPr>
+          <w:color w:val="4472C4" w:themeColor="accent1"/>
+          <w:sz w:val="18"/>
+          <w:szCs w:val="18"/>
+          <w:lang w:val="fr-SN"/>
+        </w:rPr>
+      </w:pPr>
+    </w:p>
+    <w:p>
+      <w:pPr>
+        <w:rPr>
+          <w:color w:val="806000" w:themeColor="accent4" w:themeShade="80"/>
+          <w:sz w:val="18"/>
+          <w:szCs w:val="18"/>
           <w:lang w:val="fr-SN"/>
         </w:rPr>
       </w:pPr>

</xml_diff>

<commit_message>
Partie 4 – Sorties structurées
</commit_message>
<xml_diff>
--- a/ai-business_assistant/ficher_assistant.docx
+++ b/ai-business_assistant/ficher_assistant.docx
@@ -7969,32 +7969,2121 @@
     <w:p>
       <w:pPr>
         <w:rPr>
-          <w:color w:val="806000" w:themeColor="accent4" w:themeShade="80"/>
-          <w:sz w:val="18"/>
-          <w:szCs w:val="18"/>
-          <w:lang w:val="fr-SN"/>
-        </w:rPr>
-      </w:pPr>
-    </w:p>
-    <w:p>
-      <w:pPr>
-        <w:rPr>
-          <w:color w:val="000000" w:themeColor="text1"/>
-          <w:sz w:val="28"/>
-          <w:szCs w:val="28"/>
-          <w:lang w:val="fr-SN"/>
-        </w:rPr>
-      </w:pPr>
-    </w:p>
-    <w:p>
-      <w:pPr>
-        <w:rPr>
-          <w:color w:val="000000" w:themeColor="text1"/>
-          <w:sz w:val="28"/>
-          <w:szCs w:val="28"/>
-          <w:lang w:val="fr-SN"/>
-        </w:rPr>
-      </w:pPr>
+          <w:b/>
+          <w:bCs/>
+          <w:color w:val="4472C4" w:themeColor="accent1"/>
+          <w:sz w:val="36"/>
+          <w:szCs w:val="36"/>
+          <w:lang w:val="fr-SN"/>
+        </w:rPr>
+      </w:pPr>
+      <w:r>
+        <w:rPr>
+          <w:b/>
+          <w:bCs/>
+          <w:color w:val="4472C4" w:themeColor="accent1"/>
+          <w:sz w:val="36"/>
+          <w:szCs w:val="36"/>
+          <w:lang w:val="fr-SN"/>
+        </w:rPr>
+        <w:t>Partie 4 – Sorties structurées</w:t>
+      </w:r>
+    </w:p>
+    <w:p>
+      <w:pPr>
+        <w:rPr>
+          <w:b/>
+          <w:bCs/>
+          <w:sz w:val="28"/>
+          <w:szCs w:val="28"/>
+          <w:lang w:val="fr-SN"/>
+        </w:rPr>
+      </w:pPr>
+      <w:r>
+        <w:rPr>
+          <w:b/>
+          <w:bCs/>
+          <w:sz w:val="28"/>
+          <w:szCs w:val="28"/>
+          <w:lang w:val="fr-SN"/>
+        </w:rPr>
+        <w:t xml:space="preserve">Prompt pour une sortie en </w:t>
+      </w:r>
+      <w:proofErr w:type="spellStart"/>
+      <w:r>
+        <w:rPr>
+          <w:b/>
+          <w:bCs/>
+          <w:sz w:val="28"/>
+          <w:szCs w:val="28"/>
+          <w:lang w:val="fr-SN"/>
+        </w:rPr>
+        <w:t>json</w:t>
+      </w:r>
+      <w:proofErr w:type="spellEnd"/>
+      <w:r>
+        <w:rPr>
+          <w:b/>
+          <w:bCs/>
+          <w:sz w:val="28"/>
+          <w:szCs w:val="28"/>
+          <w:lang w:val="fr-SN"/>
+        </w:rPr>
+        <w:t xml:space="preserve"> : </w:t>
+      </w:r>
+    </w:p>
+    <w:p>
+      <w:pPr>
+        <w:rPr>
+          <w:sz w:val="28"/>
+          <w:szCs w:val="28"/>
+          <w:lang w:val="fr-SN"/>
+        </w:rPr>
+      </w:pPr>
+      <w:r>
+        <w:rPr>
+          <w:sz w:val="28"/>
+          <w:szCs w:val="28"/>
+          <w:lang w:val="fr-SN"/>
+        </w:rPr>
+        <w:t>Tu es un système d’analyse de commentaires clients.</w:t>
+      </w:r>
+    </w:p>
+    <w:p>
+      <w:pPr>
+        <w:rPr>
+          <w:sz w:val="28"/>
+          <w:szCs w:val="28"/>
+          <w:lang w:val="fr-SN"/>
+        </w:rPr>
+      </w:pPr>
+      <w:r>
+        <w:rPr>
+          <w:sz w:val="28"/>
+          <w:szCs w:val="28"/>
+          <w:lang w:val="fr-SN"/>
+        </w:rPr>
+        <w:t>Analyse le commentaire suivant et réponds uniquement avec un objet JSON valide.</w:t>
+      </w:r>
+    </w:p>
+    <w:p>
+      <w:pPr>
+        <w:rPr>
+          <w:sz w:val="28"/>
+          <w:szCs w:val="28"/>
+          <w:lang w:val="fr-SN"/>
+        </w:rPr>
+      </w:pPr>
+      <w:r>
+        <w:rPr>
+          <w:sz w:val="28"/>
+          <w:szCs w:val="28"/>
+          <w:lang w:val="fr-SN"/>
+        </w:rPr>
+        <w:t>Commentaire :</w:t>
+      </w:r>
+    </w:p>
+    <w:p>
+      <w:pPr>
+        <w:rPr>
+          <w:sz w:val="28"/>
+          <w:szCs w:val="28"/>
+          <w:lang w:val="fr-SN"/>
+        </w:rPr>
+      </w:pPr>
+      <w:r>
+        <w:rPr>
+          <w:sz w:val="28"/>
+          <w:szCs w:val="28"/>
+          <w:lang w:val="fr-SN"/>
+        </w:rPr>
+        <w:t>« Le commentaire semble plutôt négatif. Le client est mécontent du délai de livraison... »</w:t>
+      </w:r>
+    </w:p>
+    <w:p>
+      <w:pPr>
+        <w:rPr>
+          <w:sz w:val="28"/>
+          <w:szCs w:val="28"/>
+          <w:lang w:val="fr-SN"/>
+        </w:rPr>
+      </w:pPr>
+      <w:r>
+        <w:rPr>
+          <w:sz w:val="28"/>
+          <w:szCs w:val="28"/>
+          <w:lang w:val="fr-SN"/>
+        </w:rPr>
+        <w:t>La réponse doit contenir exactement les cinq champs suivants :</w:t>
+      </w:r>
+    </w:p>
+    <w:p>
+      <w:pPr>
+        <w:rPr>
+          <w:sz w:val="28"/>
+          <w:szCs w:val="28"/>
+          <w:lang w:val="fr-SN"/>
+        </w:rPr>
+      </w:pPr>
+      <w:r>
+        <w:rPr>
+          <w:sz w:val="28"/>
+          <w:szCs w:val="28"/>
+          <w:lang w:val="fr-SN"/>
+        </w:rPr>
+        <w:t>- "sentiment" :</w:t>
+      </w:r>
+    </w:p>
+    <w:p>
+      <w:pPr>
+        <w:rPr>
+          <w:sz w:val="28"/>
+          <w:szCs w:val="28"/>
+          <w:lang w:val="fr-SN"/>
+        </w:rPr>
+      </w:pPr>
+      <w:r>
+        <w:rPr>
+          <w:sz w:val="28"/>
+          <w:szCs w:val="28"/>
+          <w:lang w:val="fr-SN"/>
+        </w:rPr>
+        <w:t xml:space="preserve">  </w:t>
+      </w:r>
+      <w:proofErr w:type="gramStart"/>
+      <w:r>
+        <w:rPr>
+          <w:sz w:val="28"/>
+          <w:szCs w:val="28"/>
+          <w:lang w:val="fr-SN"/>
+        </w:rPr>
+        <w:t>type</w:t>
+      </w:r>
+      <w:proofErr w:type="gramEnd"/>
+      <w:r>
+        <w:rPr>
+          <w:sz w:val="28"/>
+          <w:szCs w:val="28"/>
+          <w:lang w:val="fr-SN"/>
+        </w:rPr>
+        <w:t xml:space="preserve"> string ;</w:t>
+      </w:r>
+    </w:p>
+    <w:p>
+      <w:pPr>
+        <w:rPr>
+          <w:sz w:val="28"/>
+          <w:szCs w:val="28"/>
+          <w:lang w:val="fr-SN"/>
+        </w:rPr>
+      </w:pPr>
+      <w:r>
+        <w:rPr>
+          <w:sz w:val="28"/>
+          <w:szCs w:val="28"/>
+          <w:lang w:val="fr-SN"/>
+        </w:rPr>
+        <w:t xml:space="preserve">  </w:t>
+      </w:r>
+      <w:proofErr w:type="gramStart"/>
+      <w:r>
+        <w:rPr>
+          <w:sz w:val="28"/>
+          <w:szCs w:val="28"/>
+          <w:lang w:val="fr-SN"/>
+        </w:rPr>
+        <w:t>valeur</w:t>
+      </w:r>
+      <w:proofErr w:type="gramEnd"/>
+      <w:r>
+        <w:rPr>
+          <w:sz w:val="28"/>
+          <w:szCs w:val="28"/>
+          <w:lang w:val="fr-SN"/>
+        </w:rPr>
+        <w:t xml:space="preserve"> autorisée : "positif", "</w:t>
+      </w:r>
+      <w:r>
+        <w:rPr>
+          <w:sz w:val="28"/>
+          <w:szCs w:val="28"/>
+          <w:lang w:val="fr-SN"/>
+        </w:rPr>
+        <w:t>négatif</w:t>
+      </w:r>
+      <w:r>
+        <w:rPr>
+          <w:sz w:val="28"/>
+          <w:szCs w:val="28"/>
+          <w:lang w:val="fr-SN"/>
+        </w:rPr>
+        <w:t>" ou "neutre".</w:t>
+      </w:r>
+    </w:p>
+    <w:p>
+      <w:pPr>
+        <w:rPr>
+          <w:sz w:val="28"/>
+          <w:szCs w:val="28"/>
+          <w:lang w:val="fr-SN"/>
+        </w:rPr>
+      </w:pPr>
+      <w:r>
+        <w:rPr>
+          <w:sz w:val="28"/>
+          <w:szCs w:val="28"/>
+          <w:lang w:val="fr-SN"/>
+        </w:rPr>
+        <w:lastRenderedPageBreak/>
+        <w:t>- "</w:t>
+      </w:r>
+      <w:proofErr w:type="spellStart"/>
+      <w:r>
+        <w:rPr>
+          <w:sz w:val="28"/>
+          <w:szCs w:val="28"/>
+          <w:lang w:val="fr-SN"/>
+        </w:rPr>
+        <w:t>categorie</w:t>
+      </w:r>
+      <w:proofErr w:type="spellEnd"/>
+      <w:r>
+        <w:rPr>
+          <w:sz w:val="28"/>
+          <w:szCs w:val="28"/>
+          <w:lang w:val="fr-SN"/>
+        </w:rPr>
+        <w:t>" :</w:t>
+      </w:r>
+    </w:p>
+    <w:p>
+      <w:pPr>
+        <w:rPr>
+          <w:sz w:val="28"/>
+          <w:szCs w:val="28"/>
+          <w:lang w:val="fr-SN"/>
+        </w:rPr>
+      </w:pPr>
+      <w:r>
+        <w:rPr>
+          <w:sz w:val="28"/>
+          <w:szCs w:val="28"/>
+          <w:lang w:val="fr-SN"/>
+        </w:rPr>
+        <w:t xml:space="preserve">  </w:t>
+      </w:r>
+      <w:proofErr w:type="gramStart"/>
+      <w:r>
+        <w:rPr>
+          <w:sz w:val="28"/>
+          <w:szCs w:val="28"/>
+          <w:lang w:val="fr-SN"/>
+        </w:rPr>
+        <w:t>type</w:t>
+      </w:r>
+      <w:proofErr w:type="gramEnd"/>
+      <w:r>
+        <w:rPr>
+          <w:sz w:val="28"/>
+          <w:szCs w:val="28"/>
+          <w:lang w:val="fr-SN"/>
+        </w:rPr>
+        <w:t xml:space="preserve"> string ;</w:t>
+      </w:r>
+    </w:p>
+    <w:p>
+      <w:pPr>
+        <w:rPr>
+          <w:sz w:val="28"/>
+          <w:szCs w:val="28"/>
+          <w:lang w:val="fr-SN"/>
+        </w:rPr>
+      </w:pPr>
+      <w:r>
+        <w:rPr>
+          <w:sz w:val="28"/>
+          <w:szCs w:val="28"/>
+          <w:lang w:val="fr-SN"/>
+        </w:rPr>
+        <w:t xml:space="preserve">  </w:t>
+      </w:r>
+      <w:proofErr w:type="gramStart"/>
+      <w:r>
+        <w:rPr>
+          <w:sz w:val="28"/>
+          <w:szCs w:val="28"/>
+          <w:lang w:val="fr-SN"/>
+        </w:rPr>
+        <w:t>valeur</w:t>
+      </w:r>
+      <w:proofErr w:type="gramEnd"/>
+      <w:r>
+        <w:rPr>
+          <w:sz w:val="28"/>
+          <w:szCs w:val="28"/>
+          <w:lang w:val="fr-SN"/>
+        </w:rPr>
+        <w:t xml:space="preserve"> autorisée : "livraison", "produit", "application", "</w:t>
+      </w:r>
+      <w:proofErr w:type="spellStart"/>
+      <w:r>
+        <w:rPr>
+          <w:sz w:val="28"/>
+          <w:szCs w:val="28"/>
+          <w:lang w:val="fr-SN"/>
+        </w:rPr>
+        <w:t>service_client</w:t>
+      </w:r>
+      <w:proofErr w:type="spellEnd"/>
+      <w:r>
+        <w:rPr>
+          <w:sz w:val="28"/>
+          <w:szCs w:val="28"/>
+          <w:lang w:val="fr-SN"/>
+        </w:rPr>
+        <w:t>" ou "autre".</w:t>
+      </w:r>
+    </w:p>
+    <w:p>
+      <w:pPr>
+        <w:rPr>
+          <w:sz w:val="28"/>
+          <w:szCs w:val="28"/>
+          <w:lang w:val="fr-SN"/>
+        </w:rPr>
+      </w:pPr>
+    </w:p>
+    <w:p>
+      <w:pPr>
+        <w:rPr>
+          <w:sz w:val="28"/>
+          <w:szCs w:val="28"/>
+          <w:lang w:val="fr-SN"/>
+        </w:rPr>
+      </w:pPr>
+      <w:r>
+        <w:rPr>
+          <w:sz w:val="28"/>
+          <w:szCs w:val="28"/>
+          <w:lang w:val="fr-SN"/>
+        </w:rPr>
+        <w:t>- "urgence" :</w:t>
+      </w:r>
+    </w:p>
+    <w:p>
+      <w:pPr>
+        <w:rPr>
+          <w:sz w:val="28"/>
+          <w:szCs w:val="28"/>
+          <w:lang w:val="fr-SN"/>
+        </w:rPr>
+      </w:pPr>
+      <w:r>
+        <w:rPr>
+          <w:sz w:val="28"/>
+          <w:szCs w:val="28"/>
+          <w:lang w:val="fr-SN"/>
+        </w:rPr>
+        <w:t xml:space="preserve">  </w:t>
+      </w:r>
+      <w:proofErr w:type="gramStart"/>
+      <w:r>
+        <w:rPr>
+          <w:sz w:val="28"/>
+          <w:szCs w:val="28"/>
+          <w:lang w:val="fr-SN"/>
+        </w:rPr>
+        <w:t>type</w:t>
+      </w:r>
+      <w:proofErr w:type="gramEnd"/>
+      <w:r>
+        <w:rPr>
+          <w:sz w:val="28"/>
+          <w:szCs w:val="28"/>
+          <w:lang w:val="fr-SN"/>
+        </w:rPr>
+        <w:t xml:space="preserve"> string ;</w:t>
+      </w:r>
+    </w:p>
+    <w:p>
+      <w:pPr>
+        <w:rPr>
+          <w:sz w:val="28"/>
+          <w:szCs w:val="28"/>
+          <w:lang w:val="fr-SN"/>
+        </w:rPr>
+      </w:pPr>
+      <w:r>
+        <w:rPr>
+          <w:sz w:val="28"/>
+          <w:szCs w:val="28"/>
+          <w:lang w:val="fr-SN"/>
+        </w:rPr>
+        <w:t xml:space="preserve">  </w:t>
+      </w:r>
+      <w:proofErr w:type="gramStart"/>
+      <w:r>
+        <w:rPr>
+          <w:sz w:val="28"/>
+          <w:szCs w:val="28"/>
+          <w:lang w:val="fr-SN"/>
+        </w:rPr>
+        <w:t>valeur</w:t>
+      </w:r>
+      <w:proofErr w:type="gramEnd"/>
+      <w:r>
+        <w:rPr>
+          <w:sz w:val="28"/>
+          <w:szCs w:val="28"/>
+          <w:lang w:val="fr-SN"/>
+        </w:rPr>
+        <w:t xml:space="preserve"> autorisée : "faible", "moyenne" ou "élevée".</w:t>
+      </w:r>
+    </w:p>
+    <w:p>
+      <w:pPr>
+        <w:rPr>
+          <w:sz w:val="28"/>
+          <w:szCs w:val="28"/>
+          <w:lang w:val="fr-SN"/>
+        </w:rPr>
+      </w:pPr>
+    </w:p>
+    <w:p>
+      <w:pPr>
+        <w:rPr>
+          <w:sz w:val="28"/>
+          <w:szCs w:val="28"/>
+          <w:lang w:val="fr-SN"/>
+        </w:rPr>
+      </w:pPr>
+      <w:r>
+        <w:rPr>
+          <w:sz w:val="28"/>
+          <w:szCs w:val="28"/>
+          <w:lang w:val="fr-SN"/>
+        </w:rPr>
+        <w:t>- "</w:t>
+      </w:r>
+      <w:proofErr w:type="spellStart"/>
+      <w:r>
+        <w:rPr>
+          <w:sz w:val="28"/>
+          <w:szCs w:val="28"/>
+          <w:lang w:val="fr-SN"/>
+        </w:rPr>
+        <w:t>probleme</w:t>
+      </w:r>
+      <w:proofErr w:type="spellEnd"/>
+      <w:r>
+        <w:rPr>
+          <w:sz w:val="28"/>
+          <w:szCs w:val="28"/>
+          <w:lang w:val="fr-SN"/>
+        </w:rPr>
+        <w:t>" :</w:t>
+      </w:r>
+    </w:p>
+    <w:p>
+      <w:pPr>
+        <w:rPr>
+          <w:sz w:val="28"/>
+          <w:szCs w:val="28"/>
+          <w:lang w:val="fr-SN"/>
+        </w:rPr>
+      </w:pPr>
+      <w:r>
+        <w:rPr>
+          <w:sz w:val="28"/>
+          <w:szCs w:val="28"/>
+          <w:lang w:val="fr-SN"/>
+        </w:rPr>
+        <w:t xml:space="preserve">  </w:t>
+      </w:r>
+      <w:proofErr w:type="gramStart"/>
+      <w:r>
+        <w:rPr>
+          <w:sz w:val="28"/>
+          <w:szCs w:val="28"/>
+          <w:lang w:val="fr-SN"/>
+        </w:rPr>
+        <w:t>type</w:t>
+      </w:r>
+      <w:proofErr w:type="gramEnd"/>
+      <w:r>
+        <w:rPr>
+          <w:sz w:val="28"/>
+          <w:szCs w:val="28"/>
+          <w:lang w:val="fr-SN"/>
+        </w:rPr>
+        <w:t xml:space="preserve"> string ;</w:t>
+      </w:r>
+    </w:p>
+    <w:p>
+      <w:pPr>
+        <w:rPr>
+          <w:sz w:val="28"/>
+          <w:szCs w:val="28"/>
+          <w:lang w:val="fr-SN"/>
+        </w:rPr>
+      </w:pPr>
+      <w:r>
+        <w:rPr>
+          <w:sz w:val="28"/>
+          <w:szCs w:val="28"/>
+          <w:lang w:val="fr-SN"/>
+        </w:rPr>
+        <w:t xml:space="preserve">  </w:t>
+      </w:r>
+      <w:proofErr w:type="gramStart"/>
+      <w:r>
+        <w:rPr>
+          <w:sz w:val="28"/>
+          <w:szCs w:val="28"/>
+          <w:lang w:val="fr-SN"/>
+        </w:rPr>
+        <w:t>description</w:t>
+      </w:r>
+      <w:proofErr w:type="gramEnd"/>
+      <w:r>
+        <w:rPr>
+          <w:sz w:val="28"/>
+          <w:szCs w:val="28"/>
+          <w:lang w:val="fr-SN"/>
+        </w:rPr>
+        <w:t xml:space="preserve"> courte du problème identifié.</w:t>
+      </w:r>
+    </w:p>
+    <w:p>
+      <w:pPr>
+        <w:rPr>
+          <w:sz w:val="28"/>
+          <w:szCs w:val="28"/>
+          <w:lang w:val="fr-SN"/>
+        </w:rPr>
+      </w:pPr>
+      <w:r>
+        <w:rPr>
+          <w:sz w:val="28"/>
+          <w:szCs w:val="28"/>
+          <w:lang w:val="fr-SN"/>
+        </w:rPr>
+        <w:t xml:space="preserve">  Si aucun problème n’est mentionné, utiliser "Aucun problème identifié".</w:t>
+      </w:r>
+    </w:p>
+    <w:p>
+      <w:pPr>
+        <w:rPr>
+          <w:sz w:val="28"/>
+          <w:szCs w:val="28"/>
+          <w:lang w:val="fr-SN"/>
+        </w:rPr>
+      </w:pPr>
+    </w:p>
+    <w:p>
+      <w:pPr>
+        <w:rPr>
+          <w:sz w:val="28"/>
+          <w:szCs w:val="28"/>
+          <w:lang w:val="fr-SN"/>
+        </w:rPr>
+      </w:pPr>
+      <w:r>
+        <w:rPr>
+          <w:sz w:val="28"/>
+          <w:szCs w:val="28"/>
+          <w:lang w:val="fr-SN"/>
+        </w:rPr>
+        <w:t>- "confiance" :</w:t>
+      </w:r>
+    </w:p>
+    <w:p>
+      <w:pPr>
+        <w:rPr>
+          <w:sz w:val="28"/>
+          <w:szCs w:val="28"/>
+          <w:lang w:val="fr-SN"/>
+        </w:rPr>
+      </w:pPr>
+      <w:r>
+        <w:rPr>
+          <w:sz w:val="28"/>
+          <w:szCs w:val="28"/>
+          <w:lang w:val="fr-SN"/>
+        </w:rPr>
+        <w:t xml:space="preserve">  </w:t>
+      </w:r>
+      <w:proofErr w:type="gramStart"/>
+      <w:r>
+        <w:rPr>
+          <w:sz w:val="28"/>
+          <w:szCs w:val="28"/>
+          <w:lang w:val="fr-SN"/>
+        </w:rPr>
+        <w:t>type</w:t>
+      </w:r>
+      <w:proofErr w:type="gramEnd"/>
+      <w:r>
+        <w:rPr>
+          <w:sz w:val="28"/>
+          <w:szCs w:val="28"/>
+          <w:lang w:val="fr-SN"/>
+        </w:rPr>
+        <w:t xml:space="preserve"> number ;</w:t>
+      </w:r>
+    </w:p>
+    <w:p>
+      <w:pPr>
+        <w:rPr>
+          <w:sz w:val="28"/>
+          <w:szCs w:val="28"/>
+          <w:lang w:val="fr-SN"/>
+        </w:rPr>
+      </w:pPr>
+      <w:r>
+        <w:rPr>
+          <w:sz w:val="28"/>
+          <w:szCs w:val="28"/>
+          <w:lang w:val="fr-SN"/>
+        </w:rPr>
+        <w:t xml:space="preserve">  </w:t>
+      </w:r>
+      <w:proofErr w:type="gramStart"/>
+      <w:r>
+        <w:rPr>
+          <w:sz w:val="28"/>
+          <w:szCs w:val="28"/>
+          <w:lang w:val="fr-SN"/>
+        </w:rPr>
+        <w:t>valeur</w:t>
+      </w:r>
+      <w:proofErr w:type="gramEnd"/>
+      <w:r>
+        <w:rPr>
+          <w:sz w:val="28"/>
+          <w:szCs w:val="28"/>
+          <w:lang w:val="fr-SN"/>
+        </w:rPr>
+        <w:t xml:space="preserve"> comprise entre 0 et 1.</w:t>
+      </w:r>
+    </w:p>
+    <w:p>
+      <w:pPr>
+        <w:rPr>
+          <w:sz w:val="28"/>
+          <w:szCs w:val="28"/>
+          <w:lang w:val="fr-SN"/>
+        </w:rPr>
+      </w:pPr>
+      <w:r>
+        <w:rPr>
+          <w:sz w:val="28"/>
+          <w:szCs w:val="28"/>
+          <w:lang w:val="fr-SN"/>
+        </w:rPr>
+        <w:t xml:space="preserve">  Elle représente le niveau de confiance dans la classification.</w:t>
+      </w:r>
+    </w:p>
+    <w:p>
+      <w:pPr>
+        <w:rPr>
+          <w:sz w:val="28"/>
+          <w:szCs w:val="28"/>
+          <w:lang w:val="fr-SN"/>
+        </w:rPr>
+      </w:pPr>
+      <w:r>
+        <w:rPr>
+          <w:sz w:val="28"/>
+          <w:szCs w:val="28"/>
+          <w:lang w:val="fr-SN"/>
+        </w:rPr>
+        <w:t>Contraintes :</w:t>
+      </w:r>
+    </w:p>
+    <w:p>
+      <w:pPr>
+        <w:rPr>
+          <w:sz w:val="28"/>
+          <w:szCs w:val="28"/>
+          <w:lang w:val="fr-SN"/>
+        </w:rPr>
+      </w:pPr>
+      <w:r>
+        <w:rPr>
+          <w:sz w:val="28"/>
+          <w:szCs w:val="28"/>
+          <w:lang w:val="fr-SN"/>
+        </w:rPr>
+        <w:t>- N’ajoute aucun champ supplémentaire.</w:t>
+      </w:r>
+    </w:p>
+    <w:p>
+      <w:pPr>
+        <w:rPr>
+          <w:sz w:val="28"/>
+          <w:szCs w:val="28"/>
+          <w:lang w:val="fr-SN"/>
+        </w:rPr>
+      </w:pPr>
+      <w:r>
+        <w:rPr>
+          <w:sz w:val="28"/>
+          <w:szCs w:val="28"/>
+          <w:lang w:val="fr-SN"/>
+        </w:rPr>
+        <w:t>- N’ajoute aucun texte avant ou après le JSON.</w:t>
+      </w:r>
+    </w:p>
+    <w:p>
+      <w:pPr>
+        <w:rPr>
+          <w:sz w:val="28"/>
+          <w:szCs w:val="28"/>
+          <w:lang w:val="fr-SN"/>
+        </w:rPr>
+      </w:pPr>
+      <w:r>
+        <w:rPr>
+          <w:sz w:val="28"/>
+          <w:szCs w:val="28"/>
+          <w:lang w:val="fr-SN"/>
+        </w:rPr>
+        <w:t>- Utilise uniquement les informations présentes dans le commentaire.</w:t>
+      </w:r>
+    </w:p>
+    <w:p>
+      <w:pPr>
+        <w:rPr>
+          <w:sz w:val="28"/>
+          <w:szCs w:val="28"/>
+          <w:lang w:val="fr-SN"/>
+        </w:rPr>
+      </w:pPr>
+      <w:r>
+        <w:rPr>
+          <w:sz w:val="28"/>
+          <w:szCs w:val="28"/>
+          <w:lang w:val="fr-SN"/>
+        </w:rPr>
+        <w:t>- N’invente pas de détails absents du commentaire.</w:t>
+      </w:r>
+    </w:p>
+    <w:p>
+      <w:pPr>
+        <w:rPr>
+          <w:sz w:val="28"/>
+          <w:szCs w:val="28"/>
+          <w:lang w:val="fr-SN"/>
+        </w:rPr>
+      </w:pPr>
+      <w:r>
+        <w:rPr>
+          <w:sz w:val="28"/>
+          <w:szCs w:val="28"/>
+          <w:lang w:val="fr-SN"/>
+        </w:rPr>
+        <w:t>- Si une information est insuffisante, choisis la valeur "autre" ou indique l’incertitude dans le champ "confiance".</w:t>
+      </w:r>
+    </w:p>
+    <w:p>
+      <w:pPr>
+        <w:rPr>
+          <w:sz w:val="28"/>
+          <w:szCs w:val="28"/>
+          <w:lang w:val="fr-SN"/>
+        </w:rPr>
+      </w:pPr>
+      <w:r>
+        <w:rPr>
+          <w:sz w:val="28"/>
+          <w:szCs w:val="28"/>
+          <w:lang w:val="fr-SN"/>
+        </w:rPr>
+        <w:t>- Le JSON doit être syntaxiquement valide.</w:t>
+      </w:r>
+    </w:p>
+    <w:p>
+      <w:pPr>
+        <w:rPr>
+          <w:color w:val="4472C4" w:themeColor="accent1"/>
+          <w:sz w:val="28"/>
+          <w:szCs w:val="28"/>
+          <w:lang w:val="fr-SN"/>
+        </w:rPr>
+      </w:pPr>
+      <w:r>
+        <w:rPr>
+          <w:color w:val="4472C4" w:themeColor="accent1"/>
+          <w:sz w:val="28"/>
+          <w:szCs w:val="28"/>
+          <w:lang w:val="fr-SN"/>
+        </w:rPr>
+        <w:t xml:space="preserve">Réponse du LLM : </w:t>
+      </w:r>
+    </w:p>
+    <w:p>
+      <w:pPr>
+        <w:rPr>
+          <w:b/>
+          <w:bCs/>
+          <w:color w:val="000000" w:themeColor="text1"/>
+          <w:sz w:val="28"/>
+          <w:szCs w:val="28"/>
+          <w:lang w:val="fr-SN"/>
+        </w:rPr>
+      </w:pPr>
+      <w:r>
+        <w:rPr>
+          <w:b/>
+          <w:bCs/>
+          <w:color w:val="000000" w:themeColor="text1"/>
+          <w:sz w:val="28"/>
+          <w:szCs w:val="28"/>
+          <w:lang w:val="fr-SN"/>
+        </w:rPr>
+        <w:lastRenderedPageBreak/>
+        <w:t>{</w:t>
+      </w:r>
+    </w:p>
+    <w:p>
+      <w:pPr>
+        <w:rPr>
+          <w:b/>
+          <w:bCs/>
+          <w:color w:val="000000" w:themeColor="text1"/>
+          <w:sz w:val="28"/>
+          <w:szCs w:val="28"/>
+          <w:lang w:val="fr-SN"/>
+        </w:rPr>
+      </w:pPr>
+      <w:r>
+        <w:rPr>
+          <w:b/>
+          <w:bCs/>
+          <w:color w:val="000000" w:themeColor="text1"/>
+          <w:sz w:val="28"/>
+          <w:szCs w:val="28"/>
+          <w:lang w:val="fr-SN"/>
+        </w:rPr>
+        <w:t xml:space="preserve">  "sentiment</w:t>
+      </w:r>
+      <w:proofErr w:type="gramStart"/>
+      <w:r>
+        <w:rPr>
+          <w:b/>
+          <w:bCs/>
+          <w:color w:val="000000" w:themeColor="text1"/>
+          <w:sz w:val="28"/>
+          <w:szCs w:val="28"/>
+          <w:lang w:val="fr-SN"/>
+        </w:rPr>
+        <w:t>":</w:t>
+      </w:r>
+      <w:proofErr w:type="gramEnd"/>
+      <w:r>
+        <w:rPr>
+          <w:b/>
+          <w:bCs/>
+          <w:color w:val="000000" w:themeColor="text1"/>
+          <w:sz w:val="28"/>
+          <w:szCs w:val="28"/>
+          <w:lang w:val="fr-SN"/>
+        </w:rPr>
+        <w:t xml:space="preserve"> "négatif",</w:t>
+      </w:r>
+    </w:p>
+    <w:p>
+      <w:pPr>
+        <w:rPr>
+          <w:b/>
+          <w:bCs/>
+          <w:color w:val="000000" w:themeColor="text1"/>
+          <w:sz w:val="28"/>
+          <w:szCs w:val="28"/>
+          <w:lang w:val="fr-SN"/>
+        </w:rPr>
+      </w:pPr>
+      <w:r>
+        <w:rPr>
+          <w:b/>
+          <w:bCs/>
+          <w:color w:val="000000" w:themeColor="text1"/>
+          <w:sz w:val="28"/>
+          <w:szCs w:val="28"/>
+          <w:lang w:val="fr-SN"/>
+        </w:rPr>
+        <w:t xml:space="preserve">  "</w:t>
+      </w:r>
+      <w:r>
+        <w:rPr>
+          <w:b/>
+          <w:bCs/>
+          <w:color w:val="000000" w:themeColor="text1"/>
+          <w:sz w:val="28"/>
+          <w:szCs w:val="28"/>
+          <w:lang w:val="fr-SN"/>
+        </w:rPr>
+        <w:t>catégorie</w:t>
+      </w:r>
+      <w:proofErr w:type="gramStart"/>
+      <w:r>
+        <w:rPr>
+          <w:b/>
+          <w:bCs/>
+          <w:color w:val="000000" w:themeColor="text1"/>
+          <w:sz w:val="28"/>
+          <w:szCs w:val="28"/>
+          <w:lang w:val="fr-SN"/>
+        </w:rPr>
+        <w:t>":</w:t>
+      </w:r>
+      <w:proofErr w:type="gramEnd"/>
+      <w:r>
+        <w:rPr>
+          <w:b/>
+          <w:bCs/>
+          <w:color w:val="000000" w:themeColor="text1"/>
+          <w:sz w:val="28"/>
+          <w:szCs w:val="28"/>
+          <w:lang w:val="fr-SN"/>
+        </w:rPr>
+        <w:t xml:space="preserve"> "livraison",</w:t>
+      </w:r>
+    </w:p>
+    <w:p>
+      <w:pPr>
+        <w:rPr>
+          <w:b/>
+          <w:bCs/>
+          <w:color w:val="000000" w:themeColor="text1"/>
+          <w:sz w:val="28"/>
+          <w:szCs w:val="28"/>
+          <w:lang w:val="fr-SN"/>
+        </w:rPr>
+      </w:pPr>
+      <w:r>
+        <w:rPr>
+          <w:b/>
+          <w:bCs/>
+          <w:color w:val="000000" w:themeColor="text1"/>
+          <w:sz w:val="28"/>
+          <w:szCs w:val="28"/>
+          <w:lang w:val="fr-SN"/>
+        </w:rPr>
+        <w:t xml:space="preserve">  "urgence</w:t>
+      </w:r>
+      <w:proofErr w:type="gramStart"/>
+      <w:r>
+        <w:rPr>
+          <w:b/>
+          <w:bCs/>
+          <w:color w:val="000000" w:themeColor="text1"/>
+          <w:sz w:val="28"/>
+          <w:szCs w:val="28"/>
+          <w:lang w:val="fr-SN"/>
+        </w:rPr>
+        <w:t>":</w:t>
+      </w:r>
+      <w:proofErr w:type="gramEnd"/>
+      <w:r>
+        <w:rPr>
+          <w:b/>
+          <w:bCs/>
+          <w:color w:val="000000" w:themeColor="text1"/>
+          <w:sz w:val="28"/>
+          <w:szCs w:val="28"/>
+          <w:lang w:val="fr-SN"/>
+        </w:rPr>
+        <w:t xml:space="preserve"> "moyenne",</w:t>
+      </w:r>
+    </w:p>
+    <w:p>
+      <w:pPr>
+        <w:rPr>
+          <w:b/>
+          <w:bCs/>
+          <w:color w:val="000000" w:themeColor="text1"/>
+          <w:sz w:val="28"/>
+          <w:szCs w:val="28"/>
+          <w:lang w:val="fr-SN"/>
+        </w:rPr>
+      </w:pPr>
+      <w:r>
+        <w:rPr>
+          <w:b/>
+          <w:bCs/>
+          <w:color w:val="000000" w:themeColor="text1"/>
+          <w:sz w:val="28"/>
+          <w:szCs w:val="28"/>
+          <w:lang w:val="fr-SN"/>
+        </w:rPr>
+        <w:t xml:space="preserve">  "</w:t>
+      </w:r>
+      <w:r>
+        <w:rPr>
+          <w:b/>
+          <w:bCs/>
+          <w:color w:val="000000" w:themeColor="text1"/>
+          <w:sz w:val="28"/>
+          <w:szCs w:val="28"/>
+          <w:lang w:val="fr-SN"/>
+        </w:rPr>
+        <w:t>problème</w:t>
+      </w:r>
+      <w:proofErr w:type="gramStart"/>
+      <w:r>
+        <w:rPr>
+          <w:b/>
+          <w:bCs/>
+          <w:color w:val="000000" w:themeColor="text1"/>
+          <w:sz w:val="28"/>
+          <w:szCs w:val="28"/>
+          <w:lang w:val="fr-SN"/>
+        </w:rPr>
+        <w:t>":</w:t>
+      </w:r>
+      <w:proofErr w:type="gramEnd"/>
+      <w:r>
+        <w:rPr>
+          <w:b/>
+          <w:bCs/>
+          <w:color w:val="000000" w:themeColor="text1"/>
+          <w:sz w:val="28"/>
+          <w:szCs w:val="28"/>
+          <w:lang w:val="fr-SN"/>
+        </w:rPr>
+        <w:t xml:space="preserve"> "Mécontentement du client concernant le délai de livraison",</w:t>
+      </w:r>
+    </w:p>
+    <w:p>
+      <w:pPr>
+        <w:rPr>
+          <w:b/>
+          <w:bCs/>
+          <w:color w:val="000000" w:themeColor="text1"/>
+          <w:sz w:val="28"/>
+          <w:szCs w:val="28"/>
+          <w:lang w:val="fr-SN"/>
+        </w:rPr>
+      </w:pPr>
+      <w:r>
+        <w:rPr>
+          <w:b/>
+          <w:bCs/>
+          <w:color w:val="000000" w:themeColor="text1"/>
+          <w:sz w:val="28"/>
+          <w:szCs w:val="28"/>
+          <w:lang w:val="fr-SN"/>
+        </w:rPr>
+        <w:t xml:space="preserve">  "confiance</w:t>
+      </w:r>
+      <w:proofErr w:type="gramStart"/>
+      <w:r>
+        <w:rPr>
+          <w:b/>
+          <w:bCs/>
+          <w:color w:val="000000" w:themeColor="text1"/>
+          <w:sz w:val="28"/>
+          <w:szCs w:val="28"/>
+          <w:lang w:val="fr-SN"/>
+        </w:rPr>
+        <w:t>":</w:t>
+      </w:r>
+      <w:proofErr w:type="gramEnd"/>
+      <w:r>
+        <w:rPr>
+          <w:b/>
+          <w:bCs/>
+          <w:color w:val="000000" w:themeColor="text1"/>
+          <w:sz w:val="28"/>
+          <w:szCs w:val="28"/>
+          <w:lang w:val="fr-SN"/>
+        </w:rPr>
+        <w:t xml:space="preserve"> 0.7</w:t>
+      </w:r>
+    </w:p>
+    <w:p>
+      <w:pPr>
+        <w:rPr>
+          <w:b/>
+          <w:bCs/>
+          <w:color w:val="000000" w:themeColor="text1"/>
+          <w:sz w:val="28"/>
+          <w:szCs w:val="28"/>
+          <w:lang w:val="fr-SN"/>
+        </w:rPr>
+      </w:pPr>
+      <w:r>
+        <w:rPr>
+          <w:b/>
+          <w:bCs/>
+          <w:color w:val="000000" w:themeColor="text1"/>
+          <w:sz w:val="28"/>
+          <w:szCs w:val="28"/>
+          <w:lang w:val="fr-SN"/>
+        </w:rPr>
+        <w:t>}</w:t>
+      </w:r>
+    </w:p>
+    <w:p>
+      <w:pPr>
+        <w:rPr>
+          <w:color w:val="4472C4" w:themeColor="accent1"/>
+          <w:sz w:val="28"/>
+          <w:szCs w:val="28"/>
+          <w:lang w:val="fr-SN"/>
+        </w:rPr>
+      </w:pPr>
+      <w:r>
+        <w:rPr>
+          <w:color w:val="4472C4" w:themeColor="accent1"/>
+          <w:sz w:val="28"/>
+          <w:szCs w:val="28"/>
+          <w:lang w:val="fr-SN"/>
+        </w:rPr>
+        <w:t xml:space="preserve">2)Prompt de validation : </w:t>
+      </w:r>
+    </w:p>
+    <w:p>
+      <w:pPr>
+        <w:rPr>
+          <w:color w:val="44546A" w:themeColor="text2"/>
+          <w:sz w:val="28"/>
+          <w:szCs w:val="28"/>
+          <w:lang w:val="fr-SN"/>
+        </w:rPr>
+      </w:pPr>
+      <w:r>
+        <w:rPr>
+          <w:color w:val="44546A" w:themeColor="text2"/>
+          <w:sz w:val="28"/>
+          <w:szCs w:val="28"/>
+          <w:lang w:val="fr-SN"/>
+        </w:rPr>
+        <w:t>Tu dois maintenant valider la réponse JSON précédente.</w:t>
+      </w:r>
+    </w:p>
+    <w:p>
+      <w:pPr>
+        <w:rPr>
+          <w:color w:val="44546A" w:themeColor="text2"/>
+          <w:sz w:val="28"/>
+          <w:szCs w:val="28"/>
+          <w:lang w:val="fr-SN"/>
+        </w:rPr>
+      </w:pPr>
+      <w:r>
+        <w:rPr>
+          <w:color w:val="44546A" w:themeColor="text2"/>
+          <w:sz w:val="28"/>
+          <w:szCs w:val="28"/>
+          <w:lang w:val="fr-SN"/>
+        </w:rPr>
+        <w:t>Vérifie les règles suivantes :</w:t>
+      </w:r>
+    </w:p>
+    <w:p>
+      <w:pPr>
+        <w:rPr>
+          <w:color w:val="44546A" w:themeColor="text2"/>
+          <w:sz w:val="28"/>
+          <w:szCs w:val="28"/>
+          <w:lang w:val="fr-SN"/>
+        </w:rPr>
+      </w:pPr>
+      <w:r>
+        <w:rPr>
+          <w:color w:val="44546A" w:themeColor="text2"/>
+          <w:sz w:val="28"/>
+          <w:szCs w:val="28"/>
+          <w:lang w:val="fr-SN"/>
+        </w:rPr>
+        <w:t>1. Le contenu est-il un JSON syntaxiquement valide ?</w:t>
+      </w:r>
+    </w:p>
+    <w:p>
+      <w:pPr>
+        <w:rPr>
+          <w:color w:val="44546A" w:themeColor="text2"/>
+          <w:sz w:val="28"/>
+          <w:szCs w:val="28"/>
+          <w:lang w:val="fr-SN"/>
+        </w:rPr>
+      </w:pPr>
+      <w:r>
+        <w:rPr>
+          <w:color w:val="44546A" w:themeColor="text2"/>
+          <w:sz w:val="28"/>
+          <w:szCs w:val="28"/>
+          <w:lang w:val="fr-SN"/>
+        </w:rPr>
+        <w:t>2. Les cinq propriétés suivantes sont-elles présentes exactement une fois ?</w:t>
+      </w:r>
+    </w:p>
+    <w:p>
+      <w:pPr>
+        <w:rPr>
+          <w:color w:val="44546A" w:themeColor="text2"/>
+          <w:sz w:val="28"/>
+          <w:szCs w:val="28"/>
+          <w:lang w:val="fr-SN"/>
+        </w:rPr>
+      </w:pPr>
+      <w:r>
+        <w:rPr>
+          <w:color w:val="44546A" w:themeColor="text2"/>
+          <w:sz w:val="28"/>
+          <w:szCs w:val="28"/>
+          <w:lang w:val="fr-SN"/>
+        </w:rPr>
+        <w:t xml:space="preserve">   - sentiment</w:t>
+      </w:r>
+    </w:p>
+    <w:p>
+      <w:pPr>
+        <w:rPr>
+          <w:color w:val="44546A" w:themeColor="text2"/>
+          <w:sz w:val="28"/>
+          <w:szCs w:val="28"/>
+          <w:lang w:val="fr-SN"/>
+        </w:rPr>
+      </w:pPr>
+      <w:r>
+        <w:rPr>
+          <w:color w:val="44546A" w:themeColor="text2"/>
+          <w:sz w:val="28"/>
+          <w:szCs w:val="28"/>
+          <w:lang w:val="fr-SN"/>
+        </w:rPr>
+        <w:t xml:space="preserve">   - </w:t>
+      </w:r>
+      <w:r>
+        <w:rPr>
+          <w:color w:val="44546A" w:themeColor="text2"/>
+          <w:sz w:val="28"/>
+          <w:szCs w:val="28"/>
+          <w:lang w:val="fr-SN"/>
+        </w:rPr>
+        <w:t>catégorie</w:t>
+      </w:r>
+    </w:p>
+    <w:p>
+      <w:pPr>
+        <w:rPr>
+          <w:color w:val="44546A" w:themeColor="text2"/>
+          <w:sz w:val="28"/>
+          <w:szCs w:val="28"/>
+          <w:lang w:val="fr-SN"/>
+        </w:rPr>
+      </w:pPr>
+      <w:r>
+        <w:rPr>
+          <w:color w:val="44546A" w:themeColor="text2"/>
+          <w:sz w:val="28"/>
+          <w:szCs w:val="28"/>
+          <w:lang w:val="fr-SN"/>
+        </w:rPr>
+        <w:t xml:space="preserve">   - urgence</w:t>
+      </w:r>
+    </w:p>
+    <w:p>
+      <w:pPr>
+        <w:rPr>
+          <w:color w:val="44546A" w:themeColor="text2"/>
+          <w:sz w:val="28"/>
+          <w:szCs w:val="28"/>
+          <w:lang w:val="fr-SN"/>
+        </w:rPr>
+      </w:pPr>
+      <w:r>
+        <w:rPr>
+          <w:color w:val="44546A" w:themeColor="text2"/>
+          <w:sz w:val="28"/>
+          <w:szCs w:val="28"/>
+          <w:lang w:val="fr-SN"/>
+        </w:rPr>
+        <w:t xml:space="preserve">   - </w:t>
+      </w:r>
+      <w:r>
+        <w:rPr>
+          <w:color w:val="44546A" w:themeColor="text2"/>
+          <w:sz w:val="28"/>
+          <w:szCs w:val="28"/>
+          <w:lang w:val="fr-SN"/>
+        </w:rPr>
+        <w:t>problème</w:t>
+      </w:r>
+    </w:p>
+    <w:p>
+      <w:pPr>
+        <w:rPr>
+          <w:color w:val="44546A" w:themeColor="text2"/>
+          <w:sz w:val="28"/>
+          <w:szCs w:val="28"/>
+          <w:lang w:val="fr-SN"/>
+        </w:rPr>
+      </w:pPr>
+      <w:r>
+        <w:rPr>
+          <w:color w:val="44546A" w:themeColor="text2"/>
+          <w:sz w:val="28"/>
+          <w:szCs w:val="28"/>
+          <w:lang w:val="fr-SN"/>
+        </w:rPr>
+        <w:t xml:space="preserve">   - confiance</w:t>
+      </w:r>
+    </w:p>
+    <w:p>
+      <w:pPr>
+        <w:rPr>
+          <w:color w:val="44546A" w:themeColor="text2"/>
+          <w:sz w:val="28"/>
+          <w:szCs w:val="28"/>
+          <w:lang w:val="fr-SN"/>
+        </w:rPr>
+      </w:pPr>
+      <w:r>
+        <w:rPr>
+          <w:color w:val="44546A" w:themeColor="text2"/>
+          <w:sz w:val="28"/>
+          <w:szCs w:val="28"/>
+          <w:lang w:val="fr-SN"/>
+        </w:rPr>
+        <w:t>3. Existe-t-il une propriété supplémentaire ?</w:t>
+      </w:r>
+    </w:p>
+    <w:p>
+      <w:pPr>
+        <w:rPr>
+          <w:color w:val="44546A" w:themeColor="text2"/>
+          <w:sz w:val="28"/>
+          <w:szCs w:val="28"/>
+          <w:lang w:val="fr-SN"/>
+        </w:rPr>
+      </w:pPr>
+      <w:r>
+        <w:rPr>
+          <w:color w:val="44546A" w:themeColor="text2"/>
+          <w:sz w:val="28"/>
+          <w:szCs w:val="28"/>
+          <w:lang w:val="fr-SN"/>
+        </w:rPr>
+        <w:t>4. Le champ "sentiment" vaut-il "positif", "</w:t>
+      </w:r>
+      <w:r>
+        <w:rPr>
+          <w:color w:val="44546A" w:themeColor="text2"/>
+          <w:sz w:val="28"/>
+          <w:szCs w:val="28"/>
+          <w:lang w:val="fr-SN"/>
+        </w:rPr>
+        <w:t>négatif</w:t>
+      </w:r>
+      <w:r>
+        <w:rPr>
+          <w:color w:val="44546A" w:themeColor="text2"/>
+          <w:sz w:val="28"/>
+          <w:szCs w:val="28"/>
+          <w:lang w:val="fr-SN"/>
+        </w:rPr>
+        <w:t>" ou "neutre" ?</w:t>
+      </w:r>
+    </w:p>
+    <w:p>
+      <w:pPr>
+        <w:rPr>
+          <w:color w:val="44546A" w:themeColor="text2"/>
+          <w:sz w:val="28"/>
+          <w:szCs w:val="28"/>
+          <w:lang w:val="fr-SN"/>
+        </w:rPr>
+      </w:pPr>
+      <w:r>
+        <w:rPr>
+          <w:color w:val="44546A" w:themeColor="text2"/>
+          <w:sz w:val="28"/>
+          <w:szCs w:val="28"/>
+          <w:lang w:val="fr-SN"/>
+        </w:rPr>
+        <w:t>5. Le champ "urgence" vaut-il "faible", "moyenne" ou "élevée" ?</w:t>
+      </w:r>
+    </w:p>
+    <w:p>
+      <w:pPr>
+        <w:rPr>
+          <w:color w:val="44546A" w:themeColor="text2"/>
+          <w:sz w:val="28"/>
+          <w:szCs w:val="28"/>
+          <w:lang w:val="fr-SN"/>
+        </w:rPr>
+      </w:pPr>
+      <w:r>
+        <w:rPr>
+          <w:color w:val="44546A" w:themeColor="text2"/>
+          <w:sz w:val="28"/>
+          <w:szCs w:val="28"/>
+          <w:lang w:val="fr-SN"/>
+        </w:rPr>
+        <w:t>6. Le champ "confiance" est-il un nombre compris entre 0 et 1 ?</w:t>
+      </w:r>
+    </w:p>
+    <w:p>
+      <w:pPr>
+        <w:rPr>
+          <w:color w:val="44546A" w:themeColor="text2"/>
+          <w:sz w:val="28"/>
+          <w:szCs w:val="28"/>
+          <w:lang w:val="fr-SN"/>
+        </w:rPr>
+      </w:pPr>
+      <w:r>
+        <w:rPr>
+          <w:color w:val="44546A" w:themeColor="text2"/>
+          <w:sz w:val="28"/>
+          <w:szCs w:val="28"/>
+          <w:lang w:val="fr-SN"/>
+        </w:rPr>
+        <w:t>7. Les types des valeurs sont-ils corrects ?</w:t>
+      </w:r>
+    </w:p>
+    <w:p>
+      <w:pPr>
+        <w:rPr>
+          <w:color w:val="44546A" w:themeColor="text2"/>
+          <w:sz w:val="28"/>
+          <w:szCs w:val="28"/>
+          <w:lang w:val="fr-SN"/>
+        </w:rPr>
+      </w:pPr>
+      <w:r>
+        <w:rPr>
+          <w:color w:val="44546A" w:themeColor="text2"/>
+          <w:sz w:val="28"/>
+          <w:szCs w:val="28"/>
+          <w:lang w:val="fr-SN"/>
+        </w:rPr>
+        <w:t>8. Le contenu correspond-il réellement au commentaire analysé ?</w:t>
+      </w:r>
+    </w:p>
+    <w:p>
+      <w:pPr>
+        <w:rPr>
+          <w:color w:val="44546A" w:themeColor="text2"/>
+          <w:sz w:val="28"/>
+          <w:szCs w:val="28"/>
+          <w:lang w:val="fr-SN"/>
+        </w:rPr>
+      </w:pPr>
+      <w:r>
+        <w:rPr>
+          <w:color w:val="44546A" w:themeColor="text2"/>
+          <w:sz w:val="28"/>
+          <w:szCs w:val="28"/>
+          <w:lang w:val="fr-SN"/>
+        </w:rPr>
+        <w:t>Réponds uniquement avec le JSON suivant :</w:t>
+      </w:r>
+    </w:p>
+    <w:p>
+      <w:pPr>
+        <w:rPr>
+          <w:color w:val="44546A" w:themeColor="text2"/>
+          <w:sz w:val="28"/>
+          <w:szCs w:val="28"/>
+          <w:lang w:val="fr-SN"/>
+        </w:rPr>
+      </w:pPr>
+      <w:r>
+        <w:rPr>
+          <w:color w:val="44546A" w:themeColor="text2"/>
+          <w:sz w:val="28"/>
+          <w:szCs w:val="28"/>
+          <w:lang w:val="fr-SN"/>
+        </w:rPr>
+        <w:t>{</w:t>
+      </w:r>
+    </w:p>
+    <w:p>
+      <w:pPr>
+        <w:rPr>
+          <w:color w:val="44546A" w:themeColor="text2"/>
+          <w:sz w:val="28"/>
+          <w:szCs w:val="28"/>
+          <w:lang w:val="fr-SN"/>
+        </w:rPr>
+      </w:pPr>
+      <w:r>
+        <w:rPr>
+          <w:color w:val="44546A" w:themeColor="text2"/>
+          <w:sz w:val="28"/>
+          <w:szCs w:val="28"/>
+          <w:lang w:val="fr-SN"/>
+        </w:rPr>
+        <w:t xml:space="preserve">  "json_valide</w:t>
+      </w:r>
+      <w:proofErr w:type="gramStart"/>
+      <w:r>
+        <w:rPr>
+          <w:color w:val="44546A" w:themeColor="text2"/>
+          <w:sz w:val="28"/>
+          <w:szCs w:val="28"/>
+          <w:lang w:val="fr-SN"/>
+        </w:rPr>
+        <w:t>":</w:t>
+      </w:r>
+      <w:proofErr w:type="gramEnd"/>
+      <w:r>
+        <w:rPr>
+          <w:color w:val="44546A" w:themeColor="text2"/>
+          <w:sz w:val="28"/>
+          <w:szCs w:val="28"/>
+          <w:lang w:val="fr-SN"/>
+        </w:rPr>
+        <w:t xml:space="preserve"> true,</w:t>
+      </w:r>
+    </w:p>
+    <w:p>
+      <w:pPr>
+        <w:rPr>
+          <w:color w:val="44546A" w:themeColor="text2"/>
+          <w:sz w:val="28"/>
+          <w:szCs w:val="28"/>
+          <w:lang w:val="fr-SN"/>
+        </w:rPr>
+      </w:pPr>
+      <w:r>
+        <w:rPr>
+          <w:color w:val="44546A" w:themeColor="text2"/>
+          <w:sz w:val="28"/>
+          <w:szCs w:val="28"/>
+          <w:lang w:val="fr-SN"/>
+        </w:rPr>
+        <w:lastRenderedPageBreak/>
+        <w:t xml:space="preserve">  "structure_valide</w:t>
+      </w:r>
+      <w:proofErr w:type="gramStart"/>
+      <w:r>
+        <w:rPr>
+          <w:color w:val="44546A" w:themeColor="text2"/>
+          <w:sz w:val="28"/>
+          <w:szCs w:val="28"/>
+          <w:lang w:val="fr-SN"/>
+        </w:rPr>
+        <w:t>":</w:t>
+      </w:r>
+      <w:proofErr w:type="gramEnd"/>
+      <w:r>
+        <w:rPr>
+          <w:color w:val="44546A" w:themeColor="text2"/>
+          <w:sz w:val="28"/>
+          <w:szCs w:val="28"/>
+          <w:lang w:val="fr-SN"/>
+        </w:rPr>
+        <w:t xml:space="preserve"> true,</w:t>
+      </w:r>
+    </w:p>
+    <w:p>
+      <w:pPr>
+        <w:rPr>
+          <w:color w:val="44546A" w:themeColor="text2"/>
+          <w:sz w:val="28"/>
+          <w:szCs w:val="28"/>
+          <w:lang w:val="fr-SN"/>
+        </w:rPr>
+      </w:pPr>
+      <w:r>
+        <w:rPr>
+          <w:color w:val="44546A" w:themeColor="text2"/>
+          <w:sz w:val="28"/>
+          <w:szCs w:val="28"/>
+          <w:lang w:val="fr-SN"/>
+        </w:rPr>
+        <w:t xml:space="preserve">  "valeurs_valides</w:t>
+      </w:r>
+      <w:proofErr w:type="gramStart"/>
+      <w:r>
+        <w:rPr>
+          <w:color w:val="44546A" w:themeColor="text2"/>
+          <w:sz w:val="28"/>
+          <w:szCs w:val="28"/>
+          <w:lang w:val="fr-SN"/>
+        </w:rPr>
+        <w:t>":</w:t>
+      </w:r>
+      <w:proofErr w:type="gramEnd"/>
+      <w:r>
+        <w:rPr>
+          <w:color w:val="44546A" w:themeColor="text2"/>
+          <w:sz w:val="28"/>
+          <w:szCs w:val="28"/>
+          <w:lang w:val="fr-SN"/>
+        </w:rPr>
+        <w:t xml:space="preserve"> true,</w:t>
+      </w:r>
+    </w:p>
+    <w:p>
+      <w:pPr>
+        <w:rPr>
+          <w:color w:val="44546A" w:themeColor="text2"/>
+          <w:sz w:val="28"/>
+          <w:szCs w:val="28"/>
+          <w:lang w:val="fr-SN"/>
+        </w:rPr>
+      </w:pPr>
+      <w:r>
+        <w:rPr>
+          <w:color w:val="44546A" w:themeColor="text2"/>
+          <w:sz w:val="28"/>
+          <w:szCs w:val="28"/>
+          <w:lang w:val="fr-SN"/>
+        </w:rPr>
+        <w:t xml:space="preserve">  "contenu_coherent</w:t>
+      </w:r>
+      <w:proofErr w:type="gramStart"/>
+      <w:r>
+        <w:rPr>
+          <w:color w:val="44546A" w:themeColor="text2"/>
+          <w:sz w:val="28"/>
+          <w:szCs w:val="28"/>
+          <w:lang w:val="fr-SN"/>
+        </w:rPr>
+        <w:t>":</w:t>
+      </w:r>
+      <w:proofErr w:type="gramEnd"/>
+      <w:r>
+        <w:rPr>
+          <w:color w:val="44546A" w:themeColor="text2"/>
+          <w:sz w:val="28"/>
+          <w:szCs w:val="28"/>
+          <w:lang w:val="fr-SN"/>
+        </w:rPr>
+        <w:t xml:space="preserve"> true,</w:t>
+      </w:r>
+    </w:p>
+    <w:p>
+      <w:pPr>
+        <w:rPr>
+          <w:color w:val="44546A" w:themeColor="text2"/>
+          <w:sz w:val="28"/>
+          <w:szCs w:val="28"/>
+          <w:lang w:val="fr-SN"/>
+        </w:rPr>
+      </w:pPr>
+      <w:r>
+        <w:rPr>
+          <w:color w:val="44546A" w:themeColor="text2"/>
+          <w:sz w:val="28"/>
+          <w:szCs w:val="28"/>
+          <w:lang w:val="fr-SN"/>
+        </w:rPr>
+        <w:t xml:space="preserve">  "erreurs</w:t>
+      </w:r>
+      <w:proofErr w:type="gramStart"/>
+      <w:r>
+        <w:rPr>
+          <w:color w:val="44546A" w:themeColor="text2"/>
+          <w:sz w:val="28"/>
+          <w:szCs w:val="28"/>
+          <w:lang w:val="fr-SN"/>
+        </w:rPr>
+        <w:t>":</w:t>
+      </w:r>
+      <w:proofErr w:type="gramEnd"/>
+      <w:r>
+        <w:rPr>
+          <w:color w:val="44546A" w:themeColor="text2"/>
+          <w:sz w:val="28"/>
+          <w:szCs w:val="28"/>
+          <w:lang w:val="fr-SN"/>
+        </w:rPr>
+        <w:t xml:space="preserve"> []</w:t>
+      </w:r>
+    </w:p>
+    <w:p>
+      <w:pPr>
+        <w:rPr>
+          <w:color w:val="44546A" w:themeColor="text2"/>
+          <w:sz w:val="28"/>
+          <w:szCs w:val="28"/>
+          <w:lang w:val="fr-SN"/>
+        </w:rPr>
+      </w:pPr>
+      <w:r>
+        <w:rPr>
+          <w:color w:val="44546A" w:themeColor="text2"/>
+          <w:sz w:val="28"/>
+          <w:szCs w:val="28"/>
+          <w:lang w:val="fr-SN"/>
+        </w:rPr>
+        <w:t>}</w:t>
+      </w:r>
+    </w:p>
+    <w:p>
+      <w:pPr>
+        <w:rPr>
+          <w:color w:val="44546A" w:themeColor="text2"/>
+          <w:sz w:val="28"/>
+          <w:szCs w:val="28"/>
+          <w:lang w:val="fr-SN"/>
+        </w:rPr>
+      </w:pPr>
+      <w:r>
+        <w:rPr>
+          <w:color w:val="44546A" w:themeColor="text2"/>
+          <w:sz w:val="28"/>
+          <w:szCs w:val="28"/>
+          <w:lang w:val="fr-SN"/>
+        </w:rPr>
+        <w:t>Si une règle n’est pas respectée :</w:t>
+      </w:r>
+    </w:p>
+    <w:p>
+      <w:pPr>
+        <w:rPr>
+          <w:color w:val="44546A" w:themeColor="text2"/>
+          <w:sz w:val="28"/>
+          <w:szCs w:val="28"/>
+          <w:lang w:val="fr-SN"/>
+        </w:rPr>
+      </w:pPr>
+      <w:r>
+        <w:rPr>
+          <w:color w:val="44546A" w:themeColor="text2"/>
+          <w:sz w:val="28"/>
+          <w:szCs w:val="28"/>
+          <w:lang w:val="fr-SN"/>
+        </w:rPr>
+        <w:t>- remplace la valeur correspondante par false ;</w:t>
+      </w:r>
+    </w:p>
+    <w:p>
+      <w:pPr>
+        <w:rPr>
+          <w:color w:val="44546A" w:themeColor="text2"/>
+          <w:sz w:val="28"/>
+          <w:szCs w:val="28"/>
+          <w:lang w:val="fr-SN"/>
+        </w:rPr>
+      </w:pPr>
+      <w:r>
+        <w:rPr>
+          <w:color w:val="44546A" w:themeColor="text2"/>
+          <w:sz w:val="28"/>
+          <w:szCs w:val="28"/>
+          <w:lang w:val="fr-SN"/>
+        </w:rPr>
+        <w:t>- décris l’erreur dans le tableau "erreurs" ;</w:t>
+      </w:r>
+    </w:p>
+    <w:p>
+      <w:pPr>
+        <w:rPr>
+          <w:color w:val="44546A" w:themeColor="text2"/>
+          <w:sz w:val="28"/>
+          <w:szCs w:val="28"/>
+          <w:lang w:val="fr-SN"/>
+        </w:rPr>
+      </w:pPr>
+      <w:r>
+        <w:rPr>
+          <w:color w:val="44546A" w:themeColor="text2"/>
+          <w:sz w:val="28"/>
+          <w:szCs w:val="28"/>
+          <w:lang w:val="fr-SN"/>
+        </w:rPr>
+        <w:t>- propose une correction dans le même tableau.</w:t>
+      </w:r>
+    </w:p>
+    <w:p>
+      <w:pPr>
+        <w:rPr>
+          <w:color w:val="44546A" w:themeColor="text2"/>
+          <w:sz w:val="28"/>
+          <w:szCs w:val="28"/>
+          <w:lang w:val="fr-SN"/>
+        </w:rPr>
+      </w:pPr>
+    </w:p>
+    <w:p>
+      <w:pPr>
+        <w:rPr>
+          <w:b/>
+          <w:bCs/>
+          <w:color w:val="4472C4" w:themeColor="accent1"/>
+          <w:sz w:val="28"/>
+          <w:szCs w:val="28"/>
+          <w:lang w:val="fr-SN"/>
+        </w:rPr>
+      </w:pPr>
+      <w:r>
+        <w:rPr>
+          <w:b/>
+          <w:bCs/>
+          <w:color w:val="4472C4" w:themeColor="accent1"/>
+          <w:sz w:val="28"/>
+          <w:szCs w:val="28"/>
+          <w:lang w:val="fr-SN"/>
+        </w:rPr>
+        <w:t xml:space="preserve">Réponse du LLM : </w:t>
+      </w:r>
+    </w:p>
+    <w:p>
+      <w:pPr>
+        <w:rPr>
+          <w:b/>
+          <w:bCs/>
+          <w:sz w:val="28"/>
+          <w:szCs w:val="28"/>
+          <w:lang w:val="fr-SN"/>
+        </w:rPr>
+      </w:pPr>
+      <w:r>
+        <w:rPr>
+          <w:b/>
+          <w:bCs/>
+          <w:sz w:val="28"/>
+          <w:szCs w:val="28"/>
+          <w:lang w:val="fr-SN"/>
+        </w:rPr>
+        <w:t>{</w:t>
+      </w:r>
+    </w:p>
+    <w:p>
+      <w:pPr>
+        <w:rPr>
+          <w:b/>
+          <w:bCs/>
+          <w:sz w:val="28"/>
+          <w:szCs w:val="28"/>
+          <w:lang w:val="fr-SN"/>
+        </w:rPr>
+      </w:pPr>
+      <w:r>
+        <w:rPr>
+          <w:b/>
+          <w:bCs/>
+          <w:sz w:val="28"/>
+          <w:szCs w:val="28"/>
+          <w:lang w:val="fr-SN"/>
+        </w:rPr>
+        <w:t xml:space="preserve">  "json_valide</w:t>
+      </w:r>
+      <w:proofErr w:type="gramStart"/>
+      <w:r>
+        <w:rPr>
+          <w:b/>
+          <w:bCs/>
+          <w:sz w:val="28"/>
+          <w:szCs w:val="28"/>
+          <w:lang w:val="fr-SN"/>
+        </w:rPr>
+        <w:t>":</w:t>
+      </w:r>
+      <w:proofErr w:type="gramEnd"/>
+      <w:r>
+        <w:rPr>
+          <w:b/>
+          <w:bCs/>
+          <w:sz w:val="28"/>
+          <w:szCs w:val="28"/>
+          <w:lang w:val="fr-SN"/>
+        </w:rPr>
+        <w:t xml:space="preserve"> true,</w:t>
+      </w:r>
+    </w:p>
+    <w:p>
+      <w:pPr>
+        <w:rPr>
+          <w:b/>
+          <w:bCs/>
+          <w:sz w:val="28"/>
+          <w:szCs w:val="28"/>
+          <w:lang w:val="fr-SN"/>
+        </w:rPr>
+      </w:pPr>
+      <w:r>
+        <w:rPr>
+          <w:b/>
+          <w:bCs/>
+          <w:sz w:val="28"/>
+          <w:szCs w:val="28"/>
+          <w:lang w:val="fr-SN"/>
+        </w:rPr>
+        <w:t xml:space="preserve">  "structure_valide</w:t>
+      </w:r>
+      <w:proofErr w:type="gramStart"/>
+      <w:r>
+        <w:rPr>
+          <w:b/>
+          <w:bCs/>
+          <w:sz w:val="28"/>
+          <w:szCs w:val="28"/>
+          <w:lang w:val="fr-SN"/>
+        </w:rPr>
+        <w:t>":</w:t>
+      </w:r>
+      <w:proofErr w:type="gramEnd"/>
+      <w:r>
+        <w:rPr>
+          <w:b/>
+          <w:bCs/>
+          <w:sz w:val="28"/>
+          <w:szCs w:val="28"/>
+          <w:lang w:val="fr-SN"/>
+        </w:rPr>
+        <w:t xml:space="preserve"> true,</w:t>
+      </w:r>
+    </w:p>
+    <w:p>
+      <w:pPr>
+        <w:rPr>
+          <w:b/>
+          <w:bCs/>
+          <w:sz w:val="28"/>
+          <w:szCs w:val="28"/>
+          <w:lang w:val="fr-SN"/>
+        </w:rPr>
+      </w:pPr>
+      <w:r>
+        <w:rPr>
+          <w:b/>
+          <w:bCs/>
+          <w:sz w:val="28"/>
+          <w:szCs w:val="28"/>
+          <w:lang w:val="fr-SN"/>
+        </w:rPr>
+        <w:t xml:space="preserve">  "valeurs_valides</w:t>
+      </w:r>
+      <w:proofErr w:type="gramStart"/>
+      <w:r>
+        <w:rPr>
+          <w:b/>
+          <w:bCs/>
+          <w:sz w:val="28"/>
+          <w:szCs w:val="28"/>
+          <w:lang w:val="fr-SN"/>
+        </w:rPr>
+        <w:t>":</w:t>
+      </w:r>
+      <w:proofErr w:type="gramEnd"/>
+      <w:r>
+        <w:rPr>
+          <w:b/>
+          <w:bCs/>
+          <w:sz w:val="28"/>
+          <w:szCs w:val="28"/>
+          <w:lang w:val="fr-SN"/>
+        </w:rPr>
+        <w:t xml:space="preserve"> true,</w:t>
+      </w:r>
+    </w:p>
+    <w:p>
+      <w:pPr>
+        <w:rPr>
+          <w:b/>
+          <w:bCs/>
+          <w:sz w:val="28"/>
+          <w:szCs w:val="28"/>
+          <w:lang w:val="fr-SN"/>
+        </w:rPr>
+      </w:pPr>
+      <w:r>
+        <w:rPr>
+          <w:b/>
+          <w:bCs/>
+          <w:sz w:val="28"/>
+          <w:szCs w:val="28"/>
+          <w:lang w:val="fr-SN"/>
+        </w:rPr>
+        <w:t xml:space="preserve">  "contenu_coherent</w:t>
+      </w:r>
+      <w:proofErr w:type="gramStart"/>
+      <w:r>
+        <w:rPr>
+          <w:b/>
+          <w:bCs/>
+          <w:sz w:val="28"/>
+          <w:szCs w:val="28"/>
+          <w:lang w:val="fr-SN"/>
+        </w:rPr>
+        <w:t>":</w:t>
+      </w:r>
+      <w:proofErr w:type="gramEnd"/>
+      <w:r>
+        <w:rPr>
+          <w:b/>
+          <w:bCs/>
+          <w:sz w:val="28"/>
+          <w:szCs w:val="28"/>
+          <w:lang w:val="fr-SN"/>
+        </w:rPr>
+        <w:t xml:space="preserve"> true,</w:t>
+      </w:r>
+    </w:p>
+    <w:p>
+      <w:pPr>
+        <w:rPr>
+          <w:b/>
+          <w:bCs/>
+          <w:sz w:val="28"/>
+          <w:szCs w:val="28"/>
+          <w:lang w:val="fr-SN"/>
+        </w:rPr>
+      </w:pPr>
+      <w:r>
+        <w:rPr>
+          <w:b/>
+          <w:bCs/>
+          <w:sz w:val="28"/>
+          <w:szCs w:val="28"/>
+          <w:lang w:val="fr-SN"/>
+        </w:rPr>
+        <w:t xml:space="preserve">  "erreurs</w:t>
+      </w:r>
+      <w:proofErr w:type="gramStart"/>
+      <w:r>
+        <w:rPr>
+          <w:b/>
+          <w:bCs/>
+          <w:sz w:val="28"/>
+          <w:szCs w:val="28"/>
+          <w:lang w:val="fr-SN"/>
+        </w:rPr>
+        <w:t>":</w:t>
+      </w:r>
+      <w:proofErr w:type="gramEnd"/>
+      <w:r>
+        <w:rPr>
+          <w:b/>
+          <w:bCs/>
+          <w:sz w:val="28"/>
+          <w:szCs w:val="28"/>
+          <w:lang w:val="fr-SN"/>
+        </w:rPr>
+        <w:t xml:space="preserve"> []</w:t>
+      </w:r>
+    </w:p>
+    <w:p>
+      <w:pPr>
+        <w:rPr>
+          <w:b/>
+          <w:bCs/>
+          <w:sz w:val="28"/>
+          <w:szCs w:val="28"/>
+          <w:lang w:val="fr-SN"/>
+        </w:rPr>
+      </w:pPr>
+      <w:r>
+        <w:rPr>
+          <w:b/>
+          <w:bCs/>
+          <w:sz w:val="28"/>
+          <w:szCs w:val="28"/>
+          <w:lang w:val="fr-SN"/>
+        </w:rPr>
+        <w:t>}</w:t>
+      </w:r>
     </w:p>
     <w:sectPr>
       <w:pgSz w:w="11906" w:h="16838"/>

</xml_diff>

<commit_message>
Partie 8 – Évaluation et optimisation des prompts
</commit_message>
<xml_diff>
--- a/ai-business_assistant/ficher_assistant.docx
+++ b/ai-business_assistant/ficher_assistant.docx
@@ -307,26 +307,52 @@
           <w:u w:val="single"/>
           <w:lang w:val="fr-SN"/>
         </w:rPr>
-        <w:t>Technique zero-shot :</w:t>
-      </w:r>
-    </w:p>
-    <w:p>
-      <w:pPr>
-        <w:rPr>
-          <w:color w:val="000000" w:themeColor="text1"/>
-          <w:sz w:val="28"/>
-          <w:szCs w:val="28"/>
-          <w:lang w:val="fr-SN"/>
-        </w:rPr>
-      </w:pPr>
-      <w:r>
-        <w:rPr>
-          <w:color w:val="000000" w:themeColor="text1"/>
+        <w:t xml:space="preserve">Technique </w:t>
+      </w:r>
+      <w:proofErr w:type="spellStart"/>
+      <w:r>
+        <w:rPr>
+          <w:b/>
+          <w:bCs/>
+          <w:color w:val="4472C4" w:themeColor="accent1"/>
           <w:sz w:val="28"/>
           <w:szCs w:val="28"/>
           <w:u w:val="single"/>
           <w:lang w:val="fr-SN"/>
         </w:rPr>
+        <w:t>zero</w:t>
+      </w:r>
+      <w:proofErr w:type="spellEnd"/>
+      <w:r>
+        <w:rPr>
+          <w:b/>
+          <w:bCs/>
+          <w:color w:val="4472C4" w:themeColor="accent1"/>
+          <w:sz w:val="28"/>
+          <w:szCs w:val="28"/>
+          <w:u w:val="single"/>
+          <w:lang w:val="fr-SN"/>
+        </w:rPr>
+        <w:t>-shot :</w:t>
+      </w:r>
+    </w:p>
+    <w:p>
+      <w:pPr>
+        <w:rPr>
+          <w:color w:val="000000" w:themeColor="text1"/>
+          <w:sz w:val="28"/>
+          <w:szCs w:val="28"/>
+          <w:lang w:val="fr-SN"/>
+        </w:rPr>
+      </w:pPr>
+      <w:r>
+        <w:rPr>
+          <w:color w:val="000000" w:themeColor="text1"/>
+          <w:sz w:val="28"/>
+          <w:szCs w:val="28"/>
+          <w:u w:val="single"/>
+          <w:lang w:val="fr-SN"/>
+        </w:rPr>
         <w:t>Prompt </w:t>
       </w:r>
       <w:r>
@@ -363,7 +389,23 @@
           <w:color w:val="000000" w:themeColor="text1"/>
           <w:lang w:val="fr-SN"/>
         </w:rPr>
-        <w:t>dans une seule classe positif, negatif ou neutre :</w:t>
+        <w:t xml:space="preserve">dans une seule classe positif, </w:t>
+      </w:r>
+      <w:proofErr w:type="spellStart"/>
+      <w:r>
+        <w:rPr>
+          <w:color w:val="000000" w:themeColor="text1"/>
+          <w:lang w:val="fr-SN"/>
+        </w:rPr>
+        <w:t>negatif</w:t>
+      </w:r>
+      <w:proofErr w:type="spellEnd"/>
+      <w:r>
+        <w:rPr>
+          <w:color w:val="000000" w:themeColor="text1"/>
+          <w:lang w:val="fr-SN"/>
+        </w:rPr>
+        <w:t xml:space="preserve"> ou neutre :</w:t>
       </w:r>
       <w:r>
         <w:rPr>
@@ -5279,14 +5321,25 @@
           <w:lang w:val="fr-SN"/>
         </w:rPr>
       </w:pPr>
-      <w:r>
-        <w:rPr>
-          <w:color w:val="4472C4" w:themeColor="accent1"/>
-          <w:sz w:val="28"/>
-          <w:szCs w:val="28"/>
-          <w:lang w:val="fr-SN"/>
-        </w:rPr>
-        <w:t>Reponse du LLM :</w:t>
+      <w:proofErr w:type="spellStart"/>
+      <w:r>
+        <w:rPr>
+          <w:color w:val="4472C4" w:themeColor="accent1"/>
+          <w:sz w:val="28"/>
+          <w:szCs w:val="28"/>
+          <w:lang w:val="fr-SN"/>
+        </w:rPr>
+        <w:t>Reponse</w:t>
+      </w:r>
+      <w:proofErr w:type="spellEnd"/>
+      <w:r>
+        <w:rPr>
+          <w:color w:val="4472C4" w:themeColor="accent1"/>
+          <w:sz w:val="28"/>
+          <w:szCs w:val="28"/>
+          <w:lang w:val="fr-SN"/>
+        </w:rPr>
+        <w:t xml:space="preserve"> du LLM :</w:t>
       </w:r>
     </w:p>
     <w:tbl>
@@ -7270,7 +7323,29 @@
           <w:szCs w:val="28"/>
           <w:lang w:val="fr-SN"/>
         </w:rPr>
-        <w:t xml:space="preserve">Prompt pour une sortie en json : </w:t>
+        <w:t xml:space="preserve">Prompt pour une sortie en </w:t>
+      </w:r>
+      <w:proofErr w:type="spellStart"/>
+      <w:r>
+        <w:rPr>
+          <w:b/>
+          <w:bCs/>
+          <w:sz w:val="28"/>
+          <w:szCs w:val="28"/>
+          <w:lang w:val="fr-SN"/>
+        </w:rPr>
+        <w:t>json</w:t>
+      </w:r>
+      <w:proofErr w:type="spellEnd"/>
+      <w:r>
+        <w:rPr>
+          <w:b/>
+          <w:bCs/>
+          <w:sz w:val="28"/>
+          <w:szCs w:val="28"/>
+          <w:lang w:val="fr-SN"/>
+        </w:rPr>
+        <w:t xml:space="preserve"> : </w:t>
       </w:r>
     </w:p>
     <w:p>
@@ -7416,7 +7491,21 @@
           <w:lang w:val="fr-SN"/>
         </w:rPr>
         <w:lastRenderedPageBreak/>
-        <w:t>- "categorie" :</w:t>
+        <w:t>- "</w:t>
+      </w:r>
+      <w:proofErr w:type="spellStart"/>
+      <w:r>
+        <w:rPr>
+          <w:lang w:val="fr-SN"/>
+        </w:rPr>
+        <w:t>categorie</w:t>
+      </w:r>
+      <w:proofErr w:type="spellEnd"/>
+      <w:r>
+        <w:rPr>
+          <w:lang w:val="fr-SN"/>
+        </w:rPr>
+        <w:t>" :</w:t>
       </w:r>
     </w:p>
     <w:p>
@@ -7470,7 +7559,21 @@
         <w:rPr>
           <w:lang w:val="fr-SN"/>
         </w:rPr>
-        <w:t xml:space="preserve"> autorisée : "livraison", "produit", "application", "service_client" ou "autre".</w:t>
+        <w:t xml:space="preserve"> autorisée : "livraison", "produit", "application", "</w:t>
+      </w:r>
+      <w:proofErr w:type="spellStart"/>
+      <w:r>
+        <w:rPr>
+          <w:lang w:val="fr-SN"/>
+        </w:rPr>
+        <w:t>service_client</w:t>
+      </w:r>
+      <w:proofErr w:type="spellEnd"/>
+      <w:r>
+        <w:rPr>
+          <w:lang w:val="fr-SN"/>
+        </w:rPr>
+        <w:t>" ou "autre".</w:t>
       </w:r>
     </w:p>
     <w:p>
@@ -7564,7 +7667,21 @@
         <w:rPr>
           <w:lang w:val="fr-SN"/>
         </w:rPr>
-        <w:t>- "probleme" :</w:t>
+        <w:t>- "</w:t>
+      </w:r>
+      <w:proofErr w:type="spellStart"/>
+      <w:r>
+        <w:rPr>
+          <w:lang w:val="fr-SN"/>
+        </w:rPr>
+        <w:t>probleme</w:t>
+      </w:r>
+      <w:proofErr w:type="spellEnd"/>
+      <w:r>
+        <w:rPr>
+          <w:lang w:val="fr-SN"/>
+        </w:rPr>
+        <w:t>" :</w:t>
       </w:r>
     </w:p>
     <w:p>
@@ -12735,7 +12852,21 @@
         <w:rPr>
           <w:lang w:val="fr-SN"/>
         </w:rPr>
-        <w:t>3. Valeurs aberrantes (outliers)</w:t>
+        <w:t>3. Valeurs aberrantes (</w:t>
+      </w:r>
+      <w:proofErr w:type="spellStart"/>
+      <w:r>
+        <w:rPr>
+          <w:lang w:val="fr-SN"/>
+        </w:rPr>
+        <w:t>outliers</w:t>
+      </w:r>
+      <w:proofErr w:type="spellEnd"/>
+      <w:r>
+        <w:rPr>
+          <w:lang w:val="fr-SN"/>
+        </w:rPr>
+        <w:t>)</w:t>
       </w:r>
     </w:p>
     <w:p>
@@ -13613,17 +13744,61 @@
         </w:rPr>
         <w:t xml:space="preserve"> </w:t>
       </w:r>
+      <w:proofErr w:type="spellStart"/>
       <w:r>
         <w:rPr>
           <w:lang w:val="fr-SN"/>
         </w:rPr>
         <w:t>lineplot</w:t>
       </w:r>
-      <w:r>
-        <w:rPr>
-          <w:lang w:val="fr-SN"/>
-        </w:rPr>
-        <w:t>, histogramme, boxplot, heatmap, scatter plot, etc.)</w:t>
+      <w:proofErr w:type="spellEnd"/>
+      <w:r>
+        <w:rPr>
+          <w:lang w:val="fr-SN"/>
+        </w:rPr>
+        <w:t xml:space="preserve">, histogramme, </w:t>
+      </w:r>
+      <w:proofErr w:type="spellStart"/>
+      <w:r>
+        <w:rPr>
+          <w:lang w:val="fr-SN"/>
+        </w:rPr>
+        <w:t>boxplot</w:t>
+      </w:r>
+      <w:proofErr w:type="spellEnd"/>
+      <w:r>
+        <w:rPr>
+          <w:lang w:val="fr-SN"/>
+        </w:rPr>
+        <w:t xml:space="preserve">, </w:t>
+      </w:r>
+      <w:proofErr w:type="spellStart"/>
+      <w:r>
+        <w:rPr>
+          <w:lang w:val="fr-SN"/>
+        </w:rPr>
+        <w:t>heatmap</w:t>
+      </w:r>
+      <w:proofErr w:type="spellEnd"/>
+      <w:r>
+        <w:rPr>
+          <w:lang w:val="fr-SN"/>
+        </w:rPr>
+        <w:t xml:space="preserve">, </w:t>
+      </w:r>
+      <w:proofErr w:type="spellStart"/>
+      <w:r>
+        <w:rPr>
+          <w:lang w:val="fr-SN"/>
+        </w:rPr>
+        <w:t>scatter</w:t>
+      </w:r>
+      <w:proofErr w:type="spellEnd"/>
+      <w:r>
+        <w:rPr>
+          <w:lang w:val="fr-SN"/>
+        </w:rPr>
+        <w:t xml:space="preserve"> plot, etc.)</w:t>
       </w:r>
     </w:p>
     <w:p>
@@ -16295,7 +16470,21 @@
         <w:rPr>
           <w:lang w:val="fr-SN"/>
         </w:rPr>
-        <w:t xml:space="preserve">Le temps de télétravail est déclaré via l'outil interne "WorkTrack" avant le 25 de </w:t>
+        <w:t>Le temps de télétravail est déclaré via l'outil interne "</w:t>
+      </w:r>
+      <w:proofErr w:type="spellStart"/>
+      <w:r>
+        <w:rPr>
+          <w:lang w:val="fr-SN"/>
+        </w:rPr>
+        <w:t>WorkTrack</w:t>
+      </w:r>
+      <w:proofErr w:type="spellEnd"/>
+      <w:r>
+        <w:rPr>
+          <w:lang w:val="fr-SN"/>
+        </w:rPr>
+        <w:t xml:space="preserve">" avant le 25 de </w:t>
       </w:r>
     </w:p>
     <w:p>
@@ -17171,7 +17360,23 @@
           <w:color w:val="000000" w:themeColor="text1"/>
           <w:lang w:val="fr-SN"/>
         </w:rPr>
-        <w:t xml:space="preserve">Le temps de télétravail est déclaré via l'outil interne "WorkTrack" avant le 25 de </w:t>
+        <w:t>Le temps de télétravail est déclaré via l'outil interne "</w:t>
+      </w:r>
+      <w:proofErr w:type="spellStart"/>
+      <w:r>
+        <w:rPr>
+          <w:color w:val="000000" w:themeColor="text1"/>
+          <w:lang w:val="fr-SN"/>
+        </w:rPr>
+        <w:t>WorkTrack</w:t>
+      </w:r>
+      <w:proofErr w:type="spellEnd"/>
+      <w:r>
+        <w:rPr>
+          <w:color w:val="000000" w:themeColor="text1"/>
+          <w:lang w:val="fr-SN"/>
+        </w:rPr>
+        <w:t xml:space="preserve">" avant le 25 de </w:t>
       </w:r>
     </w:p>
     <w:p>
@@ -18270,7 +18475,21 @@
         <w:rPr>
           <w:lang w:val="fr-SN"/>
         </w:rPr>
-        <w:t xml:space="preserve"> montre que </w:t>
+        <w:t xml:space="preserve"> </w:t>
+      </w:r>
+      <w:proofErr w:type="spellStart"/>
+      <w:r>
+        <w:rPr>
+          <w:lang w:val="fr-SN"/>
+        </w:rPr>
+        <w:t>montre</w:t>
+      </w:r>
+      <w:proofErr w:type="spellEnd"/>
+      <w:r>
+        <w:rPr>
+          <w:lang w:val="fr-SN"/>
+        </w:rPr>
+        <w:t xml:space="preserve"> que </w:t>
       </w:r>
       <w:r>
         <w:rPr>
@@ -18424,11 +18643,1100 @@
       <w:pPr>
         <w:rPr>
           <w:color w:val="4472C4" w:themeColor="accent1"/>
-          <w:sz w:val="28"/>
-          <w:szCs w:val="28"/>
-          <w:lang w:val="fr-SN"/>
-        </w:rPr>
-      </w:pPr>
+          <w:sz w:val="36"/>
+          <w:szCs w:val="36"/>
+          <w:lang w:val="fr-SN"/>
+        </w:rPr>
+      </w:pPr>
+      <w:r>
+        <w:rPr>
+          <w:color w:val="4472C4" w:themeColor="accent1"/>
+          <w:sz w:val="36"/>
+          <w:szCs w:val="36"/>
+          <w:lang w:val="fr-SN"/>
+        </w:rPr>
+        <w:t>Partie 8 – Évaluation et optimisation des prompts</w:t>
+      </w:r>
+      <w:r>
+        <w:rPr>
+          <w:color w:val="4472C4" w:themeColor="accent1"/>
+          <w:sz w:val="36"/>
+          <w:szCs w:val="36"/>
+          <w:lang w:val="fr-SN"/>
+        </w:rPr>
+        <w:cr/>
+      </w:r>
+      <w:r>
+        <w:rPr>
+          <w:color w:val="4472C4" w:themeColor="accent1"/>
+          <w:sz w:val="36"/>
+          <w:szCs w:val="36"/>
+          <w:lang w:val="fr-SN"/>
+        </w:rPr>
+        <w:t xml:space="preserve">Exemple de texte : </w:t>
+      </w:r>
+    </w:p>
+    <w:p>
+      <w:pPr>
+        <w:rPr>
+          <w:sz w:val="28"/>
+          <w:szCs w:val="28"/>
+          <w:lang w:val="fr-SN"/>
+        </w:rPr>
+      </w:pPr>
+      <w:r>
+        <w:rPr>
+          <w:color w:val="4472C4" w:themeColor="accent1"/>
+          <w:sz w:val="36"/>
+          <w:szCs w:val="36"/>
+          <w:lang w:val="fr-SN"/>
+        </w:rPr>
+        <w:t>[</w:t>
+      </w:r>
+      <w:r>
+        <w:rPr>
+          <w:sz w:val="28"/>
+          <w:szCs w:val="28"/>
+          <w:lang w:val="fr-SN"/>
+        </w:rPr>
+        <w:t>Le télétravail s'est considérablement développé ces dernières années, transformant profondément l'organisation du travail dans de nombreuses entreprises. Cette évolution présente plusieurs avantages tant pour les salariés que pour les employeurs.</w:t>
+      </w:r>
+    </w:p>
+    <w:p>
+      <w:pPr>
+        <w:rPr>
+          <w:sz w:val="28"/>
+          <w:szCs w:val="28"/>
+          <w:lang w:val="fr-SN"/>
+        </w:rPr>
+      </w:pPr>
+      <w:r>
+        <w:rPr>
+          <w:sz w:val="28"/>
+          <w:szCs w:val="28"/>
+          <w:lang w:val="fr-SN"/>
+        </w:rPr>
+        <w:t>Pour les salariés, le télétravail offre d'abord une meilleure conciliation entre vie professionnelle et vie personnelle. En supprimant les temps de transport, souvent longs et stressants, les travailleurs gagnent en temps libre et en qualité de vie. Ils peuvent ainsi organiser leur journée de manière plus flexible et consacrer plus de temps à leur famille ou à leurs loisirs.</w:t>
+      </w:r>
+    </w:p>
+    <w:p>
+      <w:pPr>
+        <w:rPr>
+          <w:sz w:val="28"/>
+          <w:szCs w:val="28"/>
+          <w:lang w:val="fr-SN"/>
+        </w:rPr>
+      </w:pPr>
+      <w:r>
+        <w:rPr>
+          <w:sz w:val="28"/>
+          <w:szCs w:val="28"/>
+          <w:lang w:val="fr-SN"/>
+        </w:rPr>
+        <w:t xml:space="preserve">Le télétravail permet également une augmentation de la productivité. De nombreuses études montrent que les salariés travaillant à domicile sont souvent plus concentrés, moins sujets aux interruptions fréquentes du bureau </w:t>
+      </w:r>
+      <w:r>
+        <w:rPr>
+          <w:sz w:val="28"/>
+          <w:szCs w:val="28"/>
+          <w:lang w:val="fr-SN"/>
+        </w:rPr>
+        <w:lastRenderedPageBreak/>
+        <w:t>et donc plus efficaces. Certains rapportent même une hausse de 20 à 30% de leur productivité.</w:t>
+      </w:r>
+    </w:p>
+    <w:p>
+      <w:pPr>
+        <w:rPr>
+          <w:sz w:val="28"/>
+          <w:szCs w:val="28"/>
+          <w:lang w:val="fr-SN"/>
+        </w:rPr>
+      </w:pPr>
+      <w:r>
+        <w:rPr>
+          <w:sz w:val="28"/>
+          <w:szCs w:val="28"/>
+          <w:lang w:val="fr-SN"/>
+        </w:rPr>
+        <w:t>Du côté des employeurs, le télétravail réduit les coûts immobiliers. Moins de salariés présents simultanément signifie qu'il est possible de réduire la surface de bureaux, voire d'opter pour des espaces de coworking partagés. Cela représente des économies substantielles, surtout dans les grandes villes où les loyers sont élevés.</w:t>
+      </w:r>
+    </w:p>
+    <w:p>
+      <w:pPr>
+        <w:rPr>
+          <w:sz w:val="28"/>
+          <w:szCs w:val="28"/>
+          <w:lang w:val="fr-SN"/>
+        </w:rPr>
+      </w:pPr>
+      <w:r>
+        <w:rPr>
+          <w:sz w:val="28"/>
+          <w:szCs w:val="28"/>
+          <w:lang w:val="fr-SN"/>
+        </w:rPr>
+        <w:t>Enfin, le télétravail contribue à la réduction de l'empreinte carbone. Moins de déplacements domicile-travail signifie moins de voitures sur les routes et donc moins d'émissions de CO2. C'est un avantage environnemental non négligeable à l'heure de la transition écologique.</w:t>
+      </w:r>
+    </w:p>
+    <w:p>
+      <w:pPr>
+        <w:rPr>
+          <w:color w:val="4472C4" w:themeColor="accent1"/>
+          <w:sz w:val="36"/>
+          <w:szCs w:val="36"/>
+          <w:lang w:val="fr-SN"/>
+        </w:rPr>
+      </w:pPr>
+      <w:r>
+        <w:rPr>
+          <w:sz w:val="28"/>
+          <w:szCs w:val="28"/>
+          <w:lang w:val="fr-SN"/>
+        </w:rPr>
+        <w:t>Cependant, le télétravail présente aussi des défis, comme le risque d'isolement social ou la difficulté à séparer vie professionnelle et personnelle. Il nécessite donc une organisation réfléchie et des outils adaptés pour être pleinement bénéfique.</w:t>
+      </w:r>
+      <w:r>
+        <w:rPr>
+          <w:color w:val="4472C4" w:themeColor="accent1"/>
+          <w:sz w:val="36"/>
+          <w:szCs w:val="36"/>
+          <w:lang w:val="fr-SN"/>
+        </w:rPr>
+        <w:t>]</w:t>
+      </w:r>
+    </w:p>
+    <w:p>
+      <w:pPr>
+        <w:rPr>
+          <w:sz w:val="28"/>
+          <w:szCs w:val="28"/>
+          <w:lang w:val="fr-SN"/>
+        </w:rPr>
+      </w:pPr>
+      <w:r>
+        <w:rPr>
+          <w:color w:val="4472C4" w:themeColor="accent1"/>
+          <w:sz w:val="28"/>
+          <w:szCs w:val="28"/>
+          <w:lang w:val="fr-SN"/>
+        </w:rPr>
+        <w:t xml:space="preserve">Prompt A : </w:t>
+      </w:r>
+      <w:r>
+        <w:rPr>
+          <w:sz w:val="28"/>
+          <w:szCs w:val="28"/>
+          <w:lang w:val="fr-SN"/>
+        </w:rPr>
+        <w:t>« Résume ce texte. »</w:t>
+      </w:r>
+    </w:p>
+    <w:p>
+      <w:pPr>
+        <w:rPr>
+          <w:b/>
+          <w:bCs/>
+          <w:color w:val="4472C4" w:themeColor="accent1"/>
+          <w:sz w:val="28"/>
+          <w:szCs w:val="28"/>
+          <w:lang w:val="fr-SN"/>
+        </w:rPr>
+      </w:pPr>
+      <w:r>
+        <w:rPr>
+          <w:b/>
+          <w:bCs/>
+          <w:color w:val="4472C4" w:themeColor="accent1"/>
+          <w:sz w:val="28"/>
+          <w:szCs w:val="28"/>
+          <w:lang w:val="fr-SN"/>
+        </w:rPr>
+        <w:t>Réponse du LLM :</w:t>
+      </w:r>
+    </w:p>
+    <w:p>
+      <w:pPr>
+        <w:rPr>
+          <w:b/>
+          <w:bCs/>
+          <w:sz w:val="28"/>
+          <w:szCs w:val="28"/>
+          <w:lang w:val="fr-SN"/>
+        </w:rPr>
+      </w:pPr>
+      <w:r>
+        <w:rPr>
+          <w:b/>
+          <w:bCs/>
+          <w:sz w:val="28"/>
+          <w:szCs w:val="28"/>
+          <w:lang w:val="fr-SN"/>
+        </w:rPr>
+        <w:t xml:space="preserve">‘’ </w:t>
+      </w:r>
+      <w:r>
+        <w:rPr>
+          <w:b/>
+          <w:bCs/>
+          <w:sz w:val="28"/>
+          <w:szCs w:val="28"/>
+          <w:lang w:val="fr-SN"/>
+        </w:rPr>
+        <w:t>Le télétravail, en plein essor, transforme l'organisation du travail avec des bénéfices pour les deux parties. Pour les salariés : meilleur équilibre vie pro/vie perso grâce à la suppression des trajets, et productivité accrue (jusqu'à 20-30% selon certaines études) liée à une meilleure concentration. Pour les employeurs : réduction des coûts immobiliers grâce à des espaces de bureaux plus petits ou partagés. S'y ajoute un bénéfice environnemental, avec moins de trajets domicile-travail et donc moins d'émissions de CO2.</w:t>
+      </w:r>
+    </w:p>
+    <w:p>
+      <w:pPr>
+        <w:rPr>
+          <w:b/>
+          <w:bCs/>
+          <w:sz w:val="28"/>
+          <w:szCs w:val="28"/>
+          <w:lang w:val="fr-SN"/>
+        </w:rPr>
+      </w:pPr>
+      <w:r>
+        <w:rPr>
+          <w:b/>
+          <w:bCs/>
+          <w:sz w:val="28"/>
+          <w:szCs w:val="28"/>
+          <w:lang w:val="fr-SN"/>
+        </w:rPr>
+        <w:t>Le texte souligne toutefois des limites : risque d'isolement social et difficulté à séparer vie professionnelle et personnelle, d'où la nécessité d'une organisation rigoureuse et d'outils adaptés pour en tirer pleinement parti.</w:t>
+      </w:r>
+      <w:r>
+        <w:rPr>
+          <w:b/>
+          <w:bCs/>
+          <w:sz w:val="28"/>
+          <w:szCs w:val="28"/>
+          <w:lang w:val="fr-SN"/>
+        </w:rPr>
+        <w:t>’’</w:t>
+      </w:r>
+    </w:p>
+    <w:p>
+      <w:pPr>
+        <w:rPr>
+          <w:b/>
+          <w:bCs/>
+          <w:sz w:val="28"/>
+          <w:szCs w:val="28"/>
+          <w:lang w:val="fr-SN"/>
+        </w:rPr>
+      </w:pPr>
+    </w:p>
+    <w:p>
+      <w:pPr>
+        <w:rPr>
+          <w:b/>
+          <w:bCs/>
+          <w:sz w:val="28"/>
+          <w:szCs w:val="28"/>
+          <w:lang w:val="fr-SN"/>
+        </w:rPr>
+      </w:pPr>
+      <w:r>
+        <w:rPr>
+          <w:color w:val="4472C4" w:themeColor="accent1"/>
+          <w:sz w:val="28"/>
+          <w:szCs w:val="28"/>
+          <w:lang w:val="fr-SN"/>
+        </w:rPr>
+        <w:t>Prompt B :</w:t>
+      </w:r>
+      <w:r>
+        <w:rPr>
+          <w:b/>
+          <w:bCs/>
+          <w:color w:val="4472C4" w:themeColor="accent1"/>
+          <w:sz w:val="28"/>
+          <w:szCs w:val="28"/>
+          <w:lang w:val="fr-SN"/>
+        </w:rPr>
+        <w:t xml:space="preserve"> </w:t>
+      </w:r>
+      <w:r>
+        <w:rPr>
+          <w:sz w:val="28"/>
+          <w:szCs w:val="28"/>
+          <w:lang w:val="fr-SN"/>
+        </w:rPr>
+        <w:t>« Résume ce texte en 150 mots »</w:t>
+      </w:r>
+    </w:p>
+    <w:p>
+      <w:pPr>
+        <w:rPr>
+          <w:b/>
+          <w:bCs/>
+          <w:color w:val="4472C4" w:themeColor="accent1"/>
+          <w:sz w:val="28"/>
+          <w:szCs w:val="28"/>
+          <w:lang w:val="fr-SN"/>
+        </w:rPr>
+      </w:pPr>
+      <w:r>
+        <w:rPr>
+          <w:b/>
+          <w:bCs/>
+          <w:color w:val="4472C4" w:themeColor="accent1"/>
+          <w:sz w:val="28"/>
+          <w:szCs w:val="28"/>
+          <w:lang w:val="fr-SN"/>
+        </w:rPr>
+        <w:t xml:space="preserve">Réponse du LLM : </w:t>
+      </w:r>
+    </w:p>
+    <w:p>
+      <w:pPr>
+        <w:rPr>
+          <w:b/>
+          <w:bCs/>
+          <w:sz w:val="28"/>
+          <w:szCs w:val="28"/>
+          <w:lang w:val="fr-SN"/>
+        </w:rPr>
+      </w:pPr>
+      <w:r>
+        <w:rPr>
+          <w:b/>
+          <w:bCs/>
+          <w:sz w:val="28"/>
+          <w:szCs w:val="28"/>
+          <w:lang w:val="fr-SN"/>
+        </w:rPr>
+        <w:t>‘’</w:t>
+      </w:r>
+      <w:r>
+        <w:rPr>
+          <w:rFonts w:ascii="Times New Roman" w:eastAsia="Times New Roman" w:hAnsi="Times New Roman" w:cs="Times New Roman"/>
+          <w:kern w:val="0"/>
+          <w:sz w:val="24"/>
+          <w:szCs w:val="24"/>
+          <w:lang w:val="fr-SN" w:eastAsia="fr-SN"/>
+          <w14:ligatures w14:val="none"/>
+        </w:rPr>
+        <w:t xml:space="preserve"> </w:t>
+      </w:r>
+      <w:r>
+        <w:rPr>
+          <w:b/>
+          <w:bCs/>
+          <w:sz w:val="28"/>
+          <w:szCs w:val="28"/>
+          <w:lang w:val="fr-SN"/>
+        </w:rPr>
+        <w:t>Le télétravail s'est fortement développé et transforme l'organisation du travail, avec des avantages pour salariés et employeurs.</w:t>
+      </w:r>
+    </w:p>
+    <w:p>
+      <w:pPr>
+        <w:rPr>
+          <w:b/>
+          <w:bCs/>
+          <w:sz w:val="28"/>
+          <w:szCs w:val="28"/>
+          <w:lang w:val="fr-SN"/>
+        </w:rPr>
+      </w:pPr>
+      <w:r>
+        <w:rPr>
+          <w:b/>
+          <w:bCs/>
+          <w:sz w:val="28"/>
+          <w:szCs w:val="28"/>
+          <w:lang w:val="fr-SN"/>
+        </w:rPr>
+        <w:lastRenderedPageBreak/>
+        <w:t>Pour les salariés, il améliore l'équilibre vie professionnelle/vie personnelle en supprimant les trajets domicile-travail, source de temps libre et de moins de stress. Il favorise aussi une meilleure productivité : moins d'interruptions qu'au bureau, avec des gains estimés entre 20 et 30 % selon certaines études.</w:t>
+      </w:r>
+    </w:p>
+    <w:p>
+      <w:pPr>
+        <w:rPr>
+          <w:b/>
+          <w:bCs/>
+          <w:sz w:val="28"/>
+          <w:szCs w:val="28"/>
+          <w:lang w:val="fr-SN"/>
+        </w:rPr>
+      </w:pPr>
+      <w:r>
+        <w:rPr>
+          <w:b/>
+          <w:bCs/>
+          <w:sz w:val="28"/>
+          <w:szCs w:val="28"/>
+          <w:lang w:val="fr-SN"/>
+        </w:rPr>
+        <w:t>Pour les employeurs, le télétravail réduit les coûts immobiliers grâce à des bureaux plus petits ou des espaces partagés, un atout important dans les grandes villes où les loyers sont élevés.</w:t>
+      </w:r>
+    </w:p>
+    <w:p>
+      <w:pPr>
+        <w:rPr>
+          <w:b/>
+          <w:bCs/>
+          <w:sz w:val="28"/>
+          <w:szCs w:val="28"/>
+          <w:lang w:val="fr-SN"/>
+        </w:rPr>
+      </w:pPr>
+      <w:r>
+        <w:rPr>
+          <w:b/>
+          <w:bCs/>
+          <w:sz w:val="28"/>
+          <w:szCs w:val="28"/>
+          <w:lang w:val="fr-SN"/>
+        </w:rPr>
+        <w:t>Sur le plan environnemental, la diminution des déplacements réduit les émissions de CO2, un bénéfice notable dans le contexte de la transition écologique.</w:t>
+      </w:r>
+    </w:p>
+    <w:p>
+      <w:pPr>
+        <w:rPr>
+          <w:b/>
+          <w:bCs/>
+          <w:sz w:val="28"/>
+          <w:szCs w:val="28"/>
+          <w:lang w:val="fr-SN"/>
+        </w:rPr>
+      </w:pPr>
+      <w:r>
+        <w:rPr>
+          <w:b/>
+          <w:bCs/>
+          <w:sz w:val="28"/>
+          <w:szCs w:val="28"/>
+          <w:lang w:val="fr-SN"/>
+        </w:rPr>
+        <w:t>Toutefois, ce mode de travail comporte des limites : risque d'isolement social et difficulté à séparer sphères professionnelle et personnelle. Une organisation rigoureuse et des outils adaptés sont donc nécessaires pour en tirer pleinement parti.</w:t>
+      </w:r>
+      <w:r>
+        <w:rPr>
+          <w:b/>
+          <w:bCs/>
+          <w:sz w:val="28"/>
+          <w:szCs w:val="28"/>
+          <w:lang w:val="fr-SN"/>
+        </w:rPr>
+        <w:t>’’</w:t>
+      </w:r>
+    </w:p>
+    <w:p>
+      <w:pPr>
+        <w:rPr>
+          <w:b/>
+          <w:bCs/>
+          <w:sz w:val="28"/>
+          <w:szCs w:val="28"/>
+          <w:lang w:val="fr-SN"/>
+        </w:rPr>
+      </w:pPr>
+    </w:p>
+    <w:p>
+      <w:pPr>
+        <w:rPr>
+          <w:color w:val="4472C4" w:themeColor="accent1"/>
+          <w:sz w:val="28"/>
+          <w:szCs w:val="28"/>
+          <w:lang w:val="fr-SN"/>
+        </w:rPr>
+      </w:pPr>
+      <w:r>
+        <w:rPr>
+          <w:color w:val="4472C4" w:themeColor="accent1"/>
+          <w:sz w:val="28"/>
+          <w:szCs w:val="28"/>
+          <w:lang w:val="fr-SN"/>
+        </w:rPr>
+        <w:t>Prompt C : avec plus de composants de prompt</w:t>
+      </w:r>
+    </w:p>
+    <w:p>
+      <w:pPr>
+        <w:rPr>
+          <w:lang w:val="fr-SN"/>
+        </w:rPr>
+      </w:pPr>
+      <w:r>
+        <w:rPr>
+          <w:sz w:val="28"/>
+          <w:szCs w:val="28"/>
+          <w:lang w:val="fr-SN"/>
+        </w:rPr>
+        <w:t>```</w:t>
+      </w:r>
+      <w:r>
+        <w:rPr>
+          <w:sz w:val="28"/>
+          <w:szCs w:val="28"/>
+          <w:lang w:val="fr-SN"/>
+        </w:rPr>
+        <w:t xml:space="preserve"> </w:t>
+      </w:r>
+      <w:r>
+        <w:rPr>
+          <w:lang w:val="fr-SN"/>
+        </w:rPr>
+        <w:t xml:space="preserve">Rôle : </w:t>
+      </w:r>
+      <w:r>
+        <w:rPr>
+          <w:lang w:val="fr-SN"/>
+        </w:rPr>
+        <w:t>Tu es un assistant expert en synthèse de documents.</w:t>
+      </w:r>
+    </w:p>
+    <w:p>
+      <w:pPr>
+        <w:rPr>
+          <w:lang w:val="fr-SN"/>
+        </w:rPr>
+      </w:pPr>
+      <w:r>
+        <w:rPr>
+          <w:lang w:val="fr-SN"/>
+        </w:rPr>
+        <w:t xml:space="preserve">   </w:t>
+      </w:r>
+      <w:r>
+        <w:rPr>
+          <w:lang w:val="fr-SN"/>
+        </w:rPr>
+        <w:t>Tâche : Résume le texte ci-dessous de manière claire et structurée.</w:t>
+      </w:r>
+    </w:p>
+    <w:p>
+      <w:pPr>
+        <w:rPr>
+          <w:lang w:val="fr-SN"/>
+        </w:rPr>
+      </w:pPr>
+      <w:r>
+        <w:rPr>
+          <w:lang w:val="fr-SN"/>
+        </w:rPr>
+        <w:t>Contraintes :</w:t>
+      </w:r>
+    </w:p>
+    <w:p>
+      <w:pPr>
+        <w:rPr>
+          <w:lang w:val="fr-SN"/>
+        </w:rPr>
+      </w:pPr>
+      <w:r>
+        <w:rPr>
+          <w:lang w:val="fr-SN"/>
+        </w:rPr>
+        <w:t>1. Longueur : maximum 150 mots</w:t>
+      </w:r>
+    </w:p>
+    <w:p>
+      <w:pPr>
+        <w:rPr>
+          <w:lang w:val="fr-SN"/>
+        </w:rPr>
+      </w:pPr>
+      <w:r>
+        <w:rPr>
+          <w:lang w:val="fr-SN"/>
+        </w:rPr>
+        <w:t>2. Style : professionnel et neutre</w:t>
+      </w:r>
+    </w:p>
+    <w:p>
+      <w:pPr>
+        <w:rPr>
+          <w:lang w:val="fr-SN"/>
+        </w:rPr>
+      </w:pPr>
+      <w:r>
+        <w:rPr>
+          <w:lang w:val="fr-SN"/>
+        </w:rPr>
+        <w:t>3. Structure : utilise 3 à 5 phrases maximum</w:t>
+      </w:r>
+    </w:p>
+    <w:p>
+      <w:pPr>
+        <w:rPr>
+          <w:lang w:val="fr-SN"/>
+        </w:rPr>
+      </w:pPr>
+      <w:r>
+        <w:rPr>
+          <w:lang w:val="fr-SN"/>
+        </w:rPr>
+        <w:t>4. Contenu : inclue les 3 avantages principaux mentionnés dans le texte</w:t>
+      </w:r>
+    </w:p>
+    <w:p>
+      <w:pPr>
+        <w:rPr>
+          <w:lang w:val="fr-SN"/>
+        </w:rPr>
+      </w:pPr>
+      <w:r>
+        <w:rPr>
+          <w:lang w:val="fr-SN"/>
+        </w:rPr>
+        <w:t>5. Ne pas ajouter d'information absente du texte original</w:t>
+      </w:r>
+    </w:p>
+    <w:p>
+      <w:pPr>
+        <w:rPr>
+          <w:lang w:val="fr-SN"/>
+        </w:rPr>
+      </w:pPr>
+      <w:r>
+        <w:rPr>
+          <w:lang w:val="fr-SN"/>
+        </w:rPr>
+        <w:t>6. Langue : français</w:t>
+      </w:r>
+    </w:p>
+    <w:p>
+      <w:pPr>
+        <w:rPr>
+          <w:lang w:val="fr-SN"/>
+        </w:rPr>
+      </w:pPr>
+      <w:r>
+        <w:rPr>
+          <w:lang w:val="fr-SN"/>
+        </w:rPr>
+        <w:t>Texte à résumer :</w:t>
+      </w:r>
+    </w:p>
+    <w:p>
+      <w:pPr>
+        <w:rPr>
+          <w:lang w:val="fr-SN"/>
+        </w:rPr>
+      </w:pPr>
+      <w:r>
+        <w:rPr>
+          <w:color w:val="4472C4" w:themeColor="accent1"/>
+          <w:lang w:val="fr-SN"/>
+        </w:rPr>
+        <w:t>[</w:t>
+      </w:r>
+      <w:r>
+        <w:rPr>
+          <w:lang w:val="fr-SN"/>
+        </w:rPr>
+        <w:t>Le télétravail s'est considérablement développé ces dernières années, transformant profondément l'organisation du travail dans de nombreuses entreprises. Cette évolution présente plusieurs avantages tant pour les salariés que pour les employeurs.</w:t>
+      </w:r>
+    </w:p>
+    <w:p>
+      <w:pPr>
+        <w:rPr>
+          <w:lang w:val="fr-SN"/>
+        </w:rPr>
+      </w:pPr>
+      <w:r>
+        <w:rPr>
+          <w:lang w:val="fr-SN"/>
+        </w:rPr>
+        <w:t>Pour les salariés, le télétravail offre d'abord une meilleure conciliation entre vie professionnelle et vie personnelle. En supprimant les temps de transport, souvent longs et stressants, les travailleurs gagnent en temps libre et en qualité de vie. Ils peuvent ainsi organiser leur journée de manière plus flexible et consacrer plus de temps à leur famille ou à leurs loisirs.</w:t>
+      </w:r>
+    </w:p>
+    <w:p>
+      <w:pPr>
+        <w:rPr>
+          <w:lang w:val="fr-SN"/>
+        </w:rPr>
+      </w:pPr>
+      <w:r>
+        <w:rPr>
+          <w:lang w:val="fr-SN"/>
+        </w:rPr>
+        <w:lastRenderedPageBreak/>
+        <w:t>Le télétravail permet également une augmentation de la productivité. De nombreuses études montrent que les salariés travaillant à domicile sont souvent plus concentrés, moins sujets aux interruptions fréquentes du bureau et donc plus efficaces. Certains rapportent même une hausse de 20 à 30% de leur productivité.</w:t>
+      </w:r>
+    </w:p>
+    <w:p>
+      <w:pPr>
+        <w:rPr>
+          <w:lang w:val="fr-SN"/>
+        </w:rPr>
+      </w:pPr>
+      <w:r>
+        <w:rPr>
+          <w:lang w:val="fr-SN"/>
+        </w:rPr>
+        <w:t>Du côté des employeurs, le télétravail réduit les coûts immobiliers. Moins de salariés présents simultanément signifie qu'il est possible de réduire la surface de bureaux, voire d'opter pour des espaces de coworking partagés. Cela représente des économies substantielles, surtout dans les grandes villes où les loyers sont élevés.</w:t>
+      </w:r>
+    </w:p>
+    <w:p>
+      <w:pPr>
+        <w:rPr>
+          <w:lang w:val="fr-SN"/>
+        </w:rPr>
+      </w:pPr>
+      <w:r>
+        <w:rPr>
+          <w:lang w:val="fr-SN"/>
+        </w:rPr>
+        <w:t>Enfin, le télétravail contribue à la réduction de l'empreinte carbone. Moins de déplacements domicile-travail signifie moins de voitures sur les routes et donc moins d'émissions de CO2. C'est un avantage environnemental non négligeable à l'heure de la transition écologique.</w:t>
+      </w:r>
+    </w:p>
+    <w:p>
+      <w:pPr>
+        <w:rPr>
+          <w:color w:val="4472C4" w:themeColor="accent1"/>
+          <w:sz w:val="36"/>
+          <w:szCs w:val="36"/>
+          <w:lang w:val="fr-SN"/>
+        </w:rPr>
+      </w:pPr>
+      <w:r>
+        <w:rPr>
+          <w:lang w:val="fr-SN"/>
+        </w:rPr>
+        <w:t>Cependant, le télétravail présente aussi des défis, comme le risque d'isolement social ou la difficulté à séparer vie professionnelle et personnelle. Il nécessite donc une organisation réfléchie et des outils adaptés pour être pleinement bénéfique.</w:t>
+      </w:r>
+      <w:r>
+        <w:rPr>
+          <w:lang w:val="fr-SN"/>
+        </w:rPr>
+        <w:t xml:space="preserve"> </w:t>
+      </w:r>
+      <w:r>
+        <w:rPr>
+          <w:color w:val="4472C4" w:themeColor="accent1"/>
+          <w:lang w:val="fr-SN"/>
+        </w:rPr>
+        <w:t>]</w:t>
+      </w:r>
+      <w:r>
+        <w:rPr>
+          <w:color w:val="4472C4" w:themeColor="accent1"/>
+          <w:sz w:val="36"/>
+          <w:szCs w:val="36"/>
+          <w:lang w:val="fr-SN"/>
+        </w:rPr>
+        <w:t>```</w:t>
+      </w:r>
+    </w:p>
+    <w:p>
+      <w:pPr>
+        <w:rPr>
+          <w:color w:val="4472C4" w:themeColor="accent1"/>
+          <w:sz w:val="28"/>
+          <w:szCs w:val="28"/>
+          <w:lang w:val="fr-SN"/>
+        </w:rPr>
+      </w:pPr>
+      <w:r>
+        <w:rPr>
+          <w:color w:val="4472C4" w:themeColor="accent1"/>
+          <w:sz w:val="28"/>
+          <w:szCs w:val="28"/>
+          <w:lang w:val="fr-SN"/>
+        </w:rPr>
+        <w:t xml:space="preserve">Réponse du LLM : </w:t>
+      </w:r>
+    </w:p>
+    <w:p>
+      <w:pPr>
+        <w:rPr>
+          <w:b/>
+          <w:bCs/>
+          <w:sz w:val="28"/>
+          <w:szCs w:val="28"/>
+          <w:lang w:val="fr-SN"/>
+        </w:rPr>
+      </w:pPr>
+      <w:r>
+        <w:rPr>
+          <w:b/>
+          <w:bCs/>
+          <w:sz w:val="28"/>
+          <w:szCs w:val="28"/>
+          <w:lang w:val="fr-SN"/>
+        </w:rPr>
+        <w:t>‘’</w:t>
+      </w:r>
+      <w:r>
+        <w:rPr>
+          <w:b/>
+          <w:bCs/>
+          <w:lang w:val="fr-SN"/>
+        </w:rPr>
+        <w:t xml:space="preserve"> </w:t>
+      </w:r>
+      <w:r>
+        <w:rPr>
+          <w:b/>
+          <w:bCs/>
+          <w:sz w:val="28"/>
+          <w:szCs w:val="28"/>
+          <w:lang w:val="fr-SN"/>
+        </w:rPr>
+        <w:t>Le télétravail a profondément transformé l'organisation du travail en entreprise ces dernières années. Il offre aux salariés une meilleure conciliation vie professionnelle-personnelle grâce à la suppression des temps de transport, ainsi qu'une productivité accrue, certains rapportant des gains de 20 à 30%. Pour les employeurs, il permet une réduction significative des coûts immobiliers via la diminution des surfaces de bureaux nécessaires. Enfin, cette pratique contribue à réduire l'empreinte carbone en limitant les déplacements domicile-travail. Ces bénéfices s'accompagnent toutefois de défis organisationnels à anticiper, comme l'isolement social.</w:t>
+      </w:r>
+      <w:r>
+        <w:rPr>
+          <w:b/>
+          <w:bCs/>
+          <w:sz w:val="28"/>
+          <w:szCs w:val="28"/>
+          <w:lang w:val="fr-SN"/>
+        </w:rPr>
+        <w:t>’’</w:t>
+      </w:r>
+    </w:p>
+    <w:p>
+      <w:pPr>
+        <w:rPr>
+          <w:color w:val="4472C4" w:themeColor="accent1"/>
+          <w:sz w:val="28"/>
+          <w:szCs w:val="28"/>
+          <w:lang w:val="fr-SN"/>
+        </w:rPr>
+      </w:pPr>
+    </w:p>
+    <w:p>
+      <w:pPr>
+        <w:rPr>
+          <w:color w:val="4472C4" w:themeColor="accent1"/>
+          <w:sz w:val="28"/>
+          <w:szCs w:val="28"/>
+          <w:lang w:val="fr-SN"/>
+        </w:rPr>
+      </w:pPr>
+      <w:r>
+        <w:rPr>
+          <w:color w:val="4472C4" w:themeColor="accent1"/>
+          <w:sz w:val="28"/>
+          <w:szCs w:val="28"/>
+          <w:lang w:val="fr-SN"/>
+        </w:rPr>
+        <w:t xml:space="preserve">Evaluation des réponses : </w:t>
+      </w:r>
+    </w:p>
+    <w:p>
+      <w:pPr>
+        <w:rPr>
+          <w:sz w:val="28"/>
+          <w:szCs w:val="28"/>
+          <w:lang w:val="fr-SN"/>
+        </w:rPr>
+      </w:pPr>
+      <w:r>
+        <w:rPr>
+          <w:color w:val="4472C4" w:themeColor="accent1"/>
+          <w:sz w:val="28"/>
+          <w:szCs w:val="28"/>
+          <w:lang w:val="fr-SN"/>
+        </w:rPr>
+        <w:t>Pour le prompt A </w:t>
+      </w:r>
+      <w:r>
+        <w:rPr>
+          <w:sz w:val="28"/>
+          <w:szCs w:val="28"/>
+          <w:lang w:val="fr-SN"/>
+        </w:rPr>
+        <w:t xml:space="preserve">: le modèle a résumé le texte en 115 mots, elle est complète </w:t>
+      </w:r>
+      <w:r>
+        <w:rPr>
+          <w:sz w:val="28"/>
+          <w:szCs w:val="28"/>
+          <w:lang w:val="fr-SN"/>
+        </w:rPr>
+        <w:t>et fidèle, mais sans contrainte de longueur. Parfait pour un résumé libre.</w:t>
+      </w:r>
+    </w:p>
+    <w:p>
+      <w:pPr>
+        <w:rPr>
+          <w:b/>
+          <w:bCs/>
+          <w:sz w:val="28"/>
+          <w:szCs w:val="28"/>
+          <w:lang w:val="fr-SN"/>
+        </w:rPr>
+      </w:pPr>
+      <w:r>
+        <w:rPr>
+          <w:color w:val="4472C4" w:themeColor="accent1"/>
+          <w:sz w:val="28"/>
+          <w:szCs w:val="28"/>
+          <w:lang w:val="fr-SN"/>
+        </w:rPr>
+        <w:t xml:space="preserve">Pour le prompt </w:t>
+      </w:r>
+      <w:r>
+        <w:rPr>
+          <w:color w:val="4472C4" w:themeColor="accent1"/>
+          <w:sz w:val="28"/>
+          <w:szCs w:val="28"/>
+          <w:lang w:val="fr-SN"/>
+        </w:rPr>
+        <w:t xml:space="preserve">B : </w:t>
+      </w:r>
+      <w:r>
+        <w:rPr>
+          <w:sz w:val="28"/>
+          <w:szCs w:val="28"/>
+          <w:lang w:val="fr-SN"/>
+        </w:rPr>
+        <w:t>Le modèle n’a pas</w:t>
+      </w:r>
+      <w:r>
+        <w:rPr>
+          <w:sz w:val="28"/>
+          <w:szCs w:val="28"/>
+          <w:lang w:val="fr-SN"/>
+        </w:rPr>
+        <w:t xml:space="preserve"> </w:t>
+      </w:r>
+      <w:r>
+        <w:rPr>
+          <w:sz w:val="28"/>
+          <w:szCs w:val="28"/>
+          <w:lang w:val="fr-SN"/>
+        </w:rPr>
+        <w:t>respecté</w:t>
+      </w:r>
+      <w:r>
+        <w:rPr>
+          <w:sz w:val="28"/>
+          <w:szCs w:val="28"/>
+          <w:lang w:val="fr-SN"/>
+        </w:rPr>
+        <w:t xml:space="preserve"> la contrainte</w:t>
+      </w:r>
+      <w:r>
+        <w:rPr>
+          <w:sz w:val="28"/>
+          <w:szCs w:val="28"/>
+          <w:lang w:val="fr-SN"/>
+        </w:rPr>
+        <w:t xml:space="preserve"> exigée</w:t>
+      </w:r>
+      <w:r>
+        <w:rPr>
+          <w:sz w:val="28"/>
+          <w:szCs w:val="28"/>
+          <w:lang w:val="fr-SN"/>
+        </w:rPr>
+        <w:t>. Au lieu de résumer le texte en 15</w:t>
+      </w:r>
+      <w:r>
+        <w:rPr>
+          <w:sz w:val="28"/>
+          <w:szCs w:val="28"/>
+          <w:lang w:val="fr-SN"/>
+        </w:rPr>
+        <w:t xml:space="preserve">0 </w:t>
+      </w:r>
+      <w:r>
+        <w:rPr>
+          <w:sz w:val="28"/>
+          <w:szCs w:val="28"/>
+          <w:lang w:val="fr-SN"/>
+        </w:rPr>
+        <w:t>mots il l’a résumé en 165 mots.</w:t>
+      </w:r>
+      <w:r>
+        <w:rPr>
+          <w:b/>
+          <w:bCs/>
+          <w:sz w:val="28"/>
+          <w:szCs w:val="28"/>
+          <w:lang w:val="fr-SN"/>
+        </w:rPr>
+        <w:t xml:space="preserve"> </w:t>
+      </w:r>
+    </w:p>
+    <w:p>
+      <w:pPr>
+        <w:rPr>
+          <w:color w:val="4472C4" w:themeColor="accent1"/>
+          <w:sz w:val="28"/>
+          <w:szCs w:val="28"/>
+          <w:lang w:val="fr-SN"/>
+        </w:rPr>
+      </w:pPr>
+      <w:r>
+        <w:rPr>
+          <w:color w:val="4472C4" w:themeColor="accent1"/>
+          <w:sz w:val="28"/>
+          <w:szCs w:val="28"/>
+          <w:lang w:val="fr-SN"/>
+        </w:rPr>
+        <w:t xml:space="preserve">Pour le prompt </w:t>
+      </w:r>
+      <w:r>
+        <w:rPr>
+          <w:color w:val="4472C4" w:themeColor="accent1"/>
+          <w:sz w:val="28"/>
+          <w:szCs w:val="28"/>
+          <w:lang w:val="fr-SN"/>
+        </w:rPr>
+        <w:t>C</w:t>
+      </w:r>
+      <w:r>
+        <w:rPr>
+          <w:color w:val="4472C4" w:themeColor="accent1"/>
+          <w:sz w:val="28"/>
+          <w:szCs w:val="28"/>
+          <w:lang w:val="fr-SN"/>
+        </w:rPr>
+        <w:t> </w:t>
+      </w:r>
+      <w:r>
+        <w:rPr>
+          <w:sz w:val="28"/>
+          <w:szCs w:val="28"/>
+          <w:lang w:val="fr-SN"/>
+        </w:rPr>
+        <w:t>:</w:t>
+      </w:r>
+      <w:r>
+        <w:rPr>
+          <w:sz w:val="28"/>
+          <w:szCs w:val="28"/>
+          <w:lang w:val="fr-SN"/>
+        </w:rPr>
+        <w:t xml:space="preserve"> le modèle a respecté</w:t>
+      </w:r>
+      <w:r>
+        <w:rPr>
+          <w:sz w:val="28"/>
+          <w:szCs w:val="28"/>
+          <w:lang w:val="fr-SN"/>
+        </w:rPr>
+        <w:t xml:space="preserve"> toutes les contraintes, concis, clair, professionnel. Idéal pour un rapport ou une synthèse </w:t>
+      </w:r>
+      <w:r>
+        <w:rPr>
+          <w:sz w:val="28"/>
+          <w:szCs w:val="28"/>
+          <w:lang w:val="fr-SN"/>
+        </w:rPr>
+        <w:t>exécutive</w:t>
+      </w:r>
+      <w:r>
+        <w:rPr>
+          <w:color w:val="4472C4" w:themeColor="accent1"/>
+          <w:sz w:val="28"/>
+          <w:szCs w:val="28"/>
+          <w:lang w:val="fr-SN"/>
+        </w:rPr>
+        <w:t>.</w:t>
+      </w:r>
     </w:p>
     <w:sectPr>
       <w:pgSz w:w="11906" w:h="16838"/>

</xml_diff>